<commit_message>
Combined methods, results to draft
</commit_message>
<xml_diff>
--- a/thesis/v1_supplement.docx
+++ b/thesis/v1_supplement.docx
@@ -4492,7 +4492,1891 @@
           <w:lang w:val="en-GB"/>
         </w:rPr>
         <w:lastRenderedPageBreak/>
-        <w:t xml:space="preserve">Supplementary Table 3. Sporulation signature genes. </w:t>
+        <w:t xml:space="preserve">Supplement Table 3. Summed relative abundance shock + cultivation? </w:t>
+      </w:r>
+    </w:p>
+    <w:tbl>
+      <w:tblPr>
+        <w:tblW w:w="9600" w:type="dxa"/>
+        <w:tblCellMar>
+          <w:left w:w="70" w:type="dxa"/>
+          <w:right w:w="70" w:type="dxa"/>
+        </w:tblCellMar>
+        <w:tblLook w:val="04A0" w:firstRow="1" w:lastRow="0" w:firstColumn="1" w:lastColumn="0" w:noHBand="0" w:noVBand="1"/>
+      </w:tblPr>
+      <w:tblGrid>
+        <w:gridCol w:w="1960"/>
+        <w:gridCol w:w="750"/>
+        <w:gridCol w:w="2094"/>
+        <w:gridCol w:w="2094"/>
+        <w:gridCol w:w="1416"/>
+        <w:gridCol w:w="1286"/>
+      </w:tblGrid>
+      <w:tr>
+        <w:trPr>
+          <w:trHeight w:val="300"/>
+        </w:trPr>
+        <w:tc>
+          <w:tcPr>
+            <w:tcW w:w="1960" w:type="dxa"/>
+            <w:tcBorders>
+              <w:top w:val="single" w:sz="4" w:space="0" w:color="auto"/>
+              <w:left w:val="nil"/>
+              <w:bottom w:val="nil"/>
+              <w:right w:val="nil"/>
+            </w:tcBorders>
+            <w:shd w:val="clear" w:color="auto" w:fill="auto"/>
+            <w:noWrap/>
+            <w:vAlign w:val="bottom"/>
+            <w:hideMark/>
+          </w:tcPr>
+          <w:p>
+            <w:pPr>
+              <w:spacing w:after="0" w:line="240" w:lineRule="auto"/>
+              <w:jc w:val="left"/>
+              <w:rPr>
+                <w:rFonts w:eastAsia="Times New Roman" w:cs="Times New Roman"/>
+                <w:b/>
+                <w:bCs/>
+                <w:lang w:val="sl-SI" w:eastAsia="sl-SI"/>
+              </w:rPr>
+            </w:pPr>
+            <w:r>
+              <w:rPr>
+                <w:rFonts w:eastAsia="Times New Roman" w:cs="Times New Roman"/>
+                <w:b/>
+                <w:bCs/>
+                <w:lang w:val="sl-SI" w:eastAsia="sl-SI"/>
+              </w:rPr>
+              <w:t> </w:t>
+            </w:r>
+          </w:p>
+        </w:tc>
+        <w:tc>
+          <w:tcPr>
+            <w:tcW w:w="7640" w:type="dxa"/>
+            <w:gridSpan w:val="5"/>
+            <w:tcBorders>
+              <w:top w:val="single" w:sz="4" w:space="0" w:color="auto"/>
+              <w:left w:val="nil"/>
+              <w:bottom w:val="single" w:sz="4" w:space="0" w:color="auto"/>
+              <w:right w:val="nil"/>
+            </w:tcBorders>
+            <w:shd w:val="clear" w:color="auto" w:fill="auto"/>
+            <w:noWrap/>
+            <w:vAlign w:val="bottom"/>
+            <w:hideMark/>
+          </w:tcPr>
+          <w:p>
+            <w:pPr>
+              <w:spacing w:after="0" w:line="240" w:lineRule="auto"/>
+              <w:jc w:val="center"/>
+              <w:rPr>
+                <w:rFonts w:eastAsia="Times New Roman" w:cs="Times New Roman"/>
+                <w:b/>
+                <w:bCs/>
+                <w:lang w:val="sl-SI" w:eastAsia="sl-SI"/>
+              </w:rPr>
+            </w:pPr>
+            <w:proofErr w:type="spellStart"/>
+            <w:r>
+              <w:rPr>
+                <w:rFonts w:eastAsia="Times New Roman" w:cs="Times New Roman"/>
+                <w:b/>
+                <w:bCs/>
+                <w:lang w:val="sl-SI" w:eastAsia="sl-SI"/>
+              </w:rPr>
+              <w:t>Relative</w:t>
+            </w:r>
+            <w:proofErr w:type="spellEnd"/>
+            <w:r>
+              <w:rPr>
+                <w:rFonts w:eastAsia="Times New Roman" w:cs="Times New Roman"/>
+                <w:b/>
+                <w:bCs/>
+                <w:lang w:val="sl-SI" w:eastAsia="sl-SI"/>
+              </w:rPr>
+              <w:t xml:space="preserve"> abundance </w:t>
+            </w:r>
+          </w:p>
+        </w:tc>
+      </w:tr>
+      <w:tr>
+        <w:trPr>
+          <w:trHeight w:val="300"/>
+        </w:trPr>
+        <w:tc>
+          <w:tcPr>
+            <w:tcW w:w="1960" w:type="dxa"/>
+            <w:tcBorders>
+              <w:top w:val="nil"/>
+              <w:left w:val="nil"/>
+              <w:bottom w:val="single" w:sz="4" w:space="0" w:color="auto"/>
+              <w:right w:val="nil"/>
+            </w:tcBorders>
+            <w:shd w:val="clear" w:color="auto" w:fill="auto"/>
+            <w:noWrap/>
+            <w:vAlign w:val="center"/>
+            <w:hideMark/>
+          </w:tcPr>
+          <w:p>
+            <w:pPr>
+              <w:spacing w:after="0" w:line="240" w:lineRule="auto"/>
+              <w:jc w:val="left"/>
+              <w:rPr>
+                <w:rFonts w:eastAsia="Times New Roman" w:cs="Times New Roman"/>
+                <w:b/>
+                <w:bCs/>
+                <w:lang w:val="sl-SI" w:eastAsia="sl-SI"/>
+              </w:rPr>
+            </w:pPr>
+            <w:r>
+              <w:rPr>
+                <w:rFonts w:eastAsia="Times New Roman" w:cs="Times New Roman"/>
+                <w:b/>
+                <w:bCs/>
+                <w:lang w:val="sl-SI" w:eastAsia="sl-SI"/>
+              </w:rPr>
+              <w:t xml:space="preserve">  </w:t>
+            </w:r>
+            <w:proofErr w:type="spellStart"/>
+            <w:r>
+              <w:rPr>
+                <w:rFonts w:eastAsia="Times New Roman" w:cs="Times New Roman"/>
+                <w:b/>
+                <w:bCs/>
+                <w:lang w:val="sl-SI" w:eastAsia="sl-SI"/>
+              </w:rPr>
+              <w:t>Phylum</w:t>
+            </w:r>
+            <w:proofErr w:type="spellEnd"/>
+            <w:r>
+              <w:rPr>
+                <w:rFonts w:eastAsia="Times New Roman" w:cs="Times New Roman"/>
+                <w:b/>
+                <w:bCs/>
+                <w:lang w:val="sl-SI" w:eastAsia="sl-SI"/>
+              </w:rPr>
+              <w:t xml:space="preserve">                </w:t>
+            </w:r>
+          </w:p>
+        </w:tc>
+        <w:tc>
+          <w:tcPr>
+            <w:tcW w:w="750" w:type="dxa"/>
+            <w:tcBorders>
+              <w:top w:val="nil"/>
+              <w:left w:val="nil"/>
+              <w:bottom w:val="single" w:sz="4" w:space="0" w:color="auto"/>
+              <w:right w:val="nil"/>
+            </w:tcBorders>
+            <w:shd w:val="clear" w:color="auto" w:fill="auto"/>
+            <w:noWrap/>
+            <w:vAlign w:val="bottom"/>
+            <w:hideMark/>
+          </w:tcPr>
+          <w:p>
+            <w:pPr>
+              <w:spacing w:after="0" w:line="240" w:lineRule="auto"/>
+              <w:jc w:val="left"/>
+              <w:rPr>
+                <w:rFonts w:eastAsia="Times New Roman" w:cs="Times New Roman"/>
+                <w:b/>
+                <w:bCs/>
+                <w:lang w:val="sl-SI" w:eastAsia="sl-SI"/>
+              </w:rPr>
+            </w:pPr>
+            <w:proofErr w:type="spellStart"/>
+            <w:r>
+              <w:rPr>
+                <w:rFonts w:eastAsia="Times New Roman" w:cs="Times New Roman"/>
+                <w:b/>
+                <w:bCs/>
+                <w:lang w:val="sl-SI" w:eastAsia="sl-SI"/>
+              </w:rPr>
+              <w:t>Stool</w:t>
+            </w:r>
+            <w:proofErr w:type="spellEnd"/>
+            <w:r>
+              <w:rPr>
+                <w:rFonts w:eastAsia="Times New Roman" w:cs="Times New Roman"/>
+                <w:b/>
+                <w:bCs/>
+                <w:lang w:val="sl-SI" w:eastAsia="sl-SI"/>
+              </w:rPr>
+              <w:t xml:space="preserve"> </w:t>
+            </w:r>
+          </w:p>
+        </w:tc>
+        <w:tc>
+          <w:tcPr>
+            <w:tcW w:w="2094" w:type="dxa"/>
+            <w:tcBorders>
+              <w:top w:val="nil"/>
+              <w:left w:val="nil"/>
+              <w:bottom w:val="single" w:sz="4" w:space="0" w:color="auto"/>
+              <w:right w:val="nil"/>
+            </w:tcBorders>
+            <w:shd w:val="clear" w:color="auto" w:fill="auto"/>
+            <w:noWrap/>
+            <w:vAlign w:val="bottom"/>
+            <w:hideMark/>
+          </w:tcPr>
+          <w:p>
+            <w:pPr>
+              <w:spacing w:after="0" w:line="240" w:lineRule="auto"/>
+              <w:jc w:val="left"/>
+              <w:rPr>
+                <w:rFonts w:eastAsia="Times New Roman" w:cs="Times New Roman"/>
+                <w:b/>
+                <w:bCs/>
+                <w:lang w:val="sl-SI" w:eastAsia="sl-SI"/>
+              </w:rPr>
+            </w:pPr>
+            <w:proofErr w:type="spellStart"/>
+            <w:r>
+              <w:rPr>
+                <w:rFonts w:eastAsia="Times New Roman" w:cs="Times New Roman"/>
+                <w:b/>
+                <w:bCs/>
+                <w:lang w:val="sl-SI" w:eastAsia="sl-SI"/>
+              </w:rPr>
+              <w:t>Heat</w:t>
+            </w:r>
+            <w:proofErr w:type="spellEnd"/>
+            <w:r>
+              <w:rPr>
+                <w:rFonts w:eastAsia="Times New Roman" w:cs="Times New Roman"/>
+                <w:b/>
+                <w:bCs/>
+                <w:lang w:val="sl-SI" w:eastAsia="sl-SI"/>
+              </w:rPr>
+              <w:t xml:space="preserve"> </w:t>
+            </w:r>
+            <w:proofErr w:type="spellStart"/>
+            <w:r>
+              <w:rPr>
+                <w:rFonts w:eastAsia="Times New Roman" w:cs="Times New Roman"/>
+                <w:b/>
+                <w:bCs/>
+                <w:lang w:val="sl-SI" w:eastAsia="sl-SI"/>
+              </w:rPr>
+              <w:t>shock</w:t>
+            </w:r>
+            <w:proofErr w:type="spellEnd"/>
+            <w:r>
+              <w:rPr>
+                <w:rFonts w:eastAsia="Times New Roman" w:cs="Times New Roman"/>
+                <w:b/>
+                <w:bCs/>
+                <w:lang w:val="sl-SI" w:eastAsia="sl-SI"/>
+              </w:rPr>
+              <w:t xml:space="preserve"> 30 min</w:t>
+            </w:r>
+          </w:p>
+        </w:tc>
+        <w:tc>
+          <w:tcPr>
+            <w:tcW w:w="2094" w:type="dxa"/>
+            <w:tcBorders>
+              <w:top w:val="nil"/>
+              <w:left w:val="nil"/>
+              <w:bottom w:val="single" w:sz="4" w:space="0" w:color="auto"/>
+              <w:right w:val="nil"/>
+            </w:tcBorders>
+            <w:shd w:val="clear" w:color="auto" w:fill="auto"/>
+            <w:noWrap/>
+            <w:vAlign w:val="bottom"/>
+            <w:hideMark/>
+          </w:tcPr>
+          <w:p>
+            <w:pPr>
+              <w:spacing w:after="0" w:line="240" w:lineRule="auto"/>
+              <w:jc w:val="left"/>
+              <w:rPr>
+                <w:rFonts w:eastAsia="Times New Roman" w:cs="Times New Roman"/>
+                <w:b/>
+                <w:bCs/>
+                <w:lang w:val="sl-SI" w:eastAsia="sl-SI"/>
+              </w:rPr>
+            </w:pPr>
+            <w:proofErr w:type="spellStart"/>
+            <w:r>
+              <w:rPr>
+                <w:rFonts w:eastAsia="Times New Roman" w:cs="Times New Roman"/>
+                <w:b/>
+                <w:bCs/>
+                <w:lang w:val="sl-SI" w:eastAsia="sl-SI"/>
+              </w:rPr>
+              <w:t>Heat</w:t>
+            </w:r>
+            <w:proofErr w:type="spellEnd"/>
+            <w:r>
+              <w:rPr>
+                <w:rFonts w:eastAsia="Times New Roman" w:cs="Times New Roman"/>
+                <w:b/>
+                <w:bCs/>
+                <w:lang w:val="sl-SI" w:eastAsia="sl-SI"/>
+              </w:rPr>
+              <w:t xml:space="preserve"> </w:t>
+            </w:r>
+            <w:proofErr w:type="spellStart"/>
+            <w:r>
+              <w:rPr>
+                <w:rFonts w:eastAsia="Times New Roman" w:cs="Times New Roman"/>
+                <w:b/>
+                <w:bCs/>
+                <w:lang w:val="sl-SI" w:eastAsia="sl-SI"/>
+              </w:rPr>
+              <w:t>shock</w:t>
+            </w:r>
+            <w:proofErr w:type="spellEnd"/>
+            <w:r>
+              <w:rPr>
+                <w:rFonts w:eastAsia="Times New Roman" w:cs="Times New Roman"/>
+                <w:b/>
+                <w:bCs/>
+                <w:lang w:val="sl-SI" w:eastAsia="sl-SI"/>
+              </w:rPr>
+              <w:t xml:space="preserve"> 60 min</w:t>
+            </w:r>
+          </w:p>
+        </w:tc>
+        <w:tc>
+          <w:tcPr>
+            <w:tcW w:w="1416" w:type="dxa"/>
+            <w:tcBorders>
+              <w:top w:val="nil"/>
+              <w:left w:val="nil"/>
+              <w:bottom w:val="single" w:sz="4" w:space="0" w:color="auto"/>
+              <w:right w:val="nil"/>
+            </w:tcBorders>
+            <w:shd w:val="clear" w:color="auto" w:fill="auto"/>
+            <w:noWrap/>
+            <w:vAlign w:val="bottom"/>
+            <w:hideMark/>
+          </w:tcPr>
+          <w:p>
+            <w:pPr>
+              <w:spacing w:after="0" w:line="240" w:lineRule="auto"/>
+              <w:jc w:val="left"/>
+              <w:rPr>
+                <w:rFonts w:eastAsia="Times New Roman" w:cs="Times New Roman"/>
+                <w:b/>
+                <w:bCs/>
+                <w:lang w:val="sl-SI" w:eastAsia="sl-SI"/>
+              </w:rPr>
+            </w:pPr>
+            <w:proofErr w:type="spellStart"/>
+            <w:r>
+              <w:rPr>
+                <w:rFonts w:eastAsia="Times New Roman" w:cs="Times New Roman"/>
+                <w:b/>
+                <w:bCs/>
+                <w:lang w:val="sl-SI" w:eastAsia="sl-SI"/>
+              </w:rPr>
+              <w:t>EtOH</w:t>
+            </w:r>
+            <w:proofErr w:type="spellEnd"/>
+            <w:r>
+              <w:rPr>
+                <w:rFonts w:eastAsia="Times New Roman" w:cs="Times New Roman"/>
+                <w:b/>
+                <w:bCs/>
+                <w:lang w:val="sl-SI" w:eastAsia="sl-SI"/>
+              </w:rPr>
+              <w:t xml:space="preserve"> 100%</w:t>
+            </w:r>
+          </w:p>
+        </w:tc>
+        <w:tc>
+          <w:tcPr>
+            <w:tcW w:w="1286" w:type="dxa"/>
+            <w:tcBorders>
+              <w:top w:val="nil"/>
+              <w:left w:val="nil"/>
+              <w:bottom w:val="single" w:sz="4" w:space="0" w:color="auto"/>
+              <w:right w:val="nil"/>
+            </w:tcBorders>
+            <w:shd w:val="clear" w:color="auto" w:fill="auto"/>
+            <w:noWrap/>
+            <w:vAlign w:val="bottom"/>
+            <w:hideMark/>
+          </w:tcPr>
+          <w:p>
+            <w:pPr>
+              <w:spacing w:after="0" w:line="240" w:lineRule="auto"/>
+              <w:jc w:val="left"/>
+              <w:rPr>
+                <w:rFonts w:eastAsia="Times New Roman" w:cs="Times New Roman"/>
+                <w:b/>
+                <w:bCs/>
+                <w:lang w:val="sl-SI" w:eastAsia="sl-SI"/>
+              </w:rPr>
+            </w:pPr>
+            <w:proofErr w:type="spellStart"/>
+            <w:r>
+              <w:rPr>
+                <w:rFonts w:eastAsia="Times New Roman" w:cs="Times New Roman"/>
+                <w:b/>
+                <w:bCs/>
+                <w:lang w:val="sl-SI" w:eastAsia="sl-SI"/>
+              </w:rPr>
+              <w:t>EtOH</w:t>
+            </w:r>
+            <w:proofErr w:type="spellEnd"/>
+            <w:r>
+              <w:rPr>
+                <w:rFonts w:eastAsia="Times New Roman" w:cs="Times New Roman"/>
+                <w:b/>
+                <w:bCs/>
+                <w:lang w:val="sl-SI" w:eastAsia="sl-SI"/>
+              </w:rPr>
+              <w:t xml:space="preserve"> 70%</w:t>
+            </w:r>
+          </w:p>
+        </w:tc>
+      </w:tr>
+      <w:tr>
+        <w:trPr>
+          <w:trHeight w:val="300"/>
+        </w:trPr>
+        <w:tc>
+          <w:tcPr>
+            <w:tcW w:w="1960" w:type="dxa"/>
+            <w:tcBorders>
+              <w:top w:val="nil"/>
+              <w:left w:val="nil"/>
+              <w:bottom w:val="nil"/>
+              <w:right w:val="nil"/>
+            </w:tcBorders>
+            <w:shd w:val="clear" w:color="auto" w:fill="auto"/>
+            <w:noWrap/>
+            <w:vAlign w:val="center"/>
+            <w:hideMark/>
+          </w:tcPr>
+          <w:p>
+            <w:pPr>
+              <w:spacing w:after="0" w:line="240" w:lineRule="auto"/>
+              <w:jc w:val="left"/>
+              <w:rPr>
+                <w:rFonts w:eastAsia="Times New Roman" w:cs="Times New Roman"/>
+                <w:lang w:val="sl-SI" w:eastAsia="sl-SI"/>
+              </w:rPr>
+            </w:pPr>
+            <w:r>
+              <w:rPr>
+                <w:rFonts w:eastAsia="Times New Roman" w:cs="Times New Roman"/>
+                <w:lang w:val="sl-SI" w:eastAsia="sl-SI"/>
+              </w:rPr>
+              <w:t>Bacillota</w:t>
+            </w:r>
+          </w:p>
+        </w:tc>
+        <w:tc>
+          <w:tcPr>
+            <w:tcW w:w="750" w:type="dxa"/>
+            <w:tcBorders>
+              <w:top w:val="nil"/>
+              <w:left w:val="nil"/>
+              <w:bottom w:val="nil"/>
+              <w:right w:val="nil"/>
+            </w:tcBorders>
+            <w:shd w:val="clear" w:color="auto" w:fill="auto"/>
+            <w:noWrap/>
+            <w:vAlign w:val="bottom"/>
+            <w:hideMark/>
+          </w:tcPr>
+          <w:p>
+            <w:pPr>
+              <w:spacing w:after="0" w:line="240" w:lineRule="auto"/>
+              <w:jc w:val="left"/>
+              <w:rPr>
+                <w:rFonts w:eastAsia="Times New Roman" w:cs="Times New Roman"/>
+                <w:lang w:val="sl-SI" w:eastAsia="sl-SI"/>
+              </w:rPr>
+            </w:pPr>
+            <w:r>
+              <w:rPr>
+                <w:rFonts w:eastAsia="Times New Roman" w:cs="Times New Roman"/>
+                <w:lang w:val="sl-SI" w:eastAsia="sl-SI"/>
+              </w:rPr>
+              <w:t>0.453</w:t>
+            </w:r>
+          </w:p>
+        </w:tc>
+        <w:tc>
+          <w:tcPr>
+            <w:tcW w:w="2094" w:type="dxa"/>
+            <w:tcBorders>
+              <w:top w:val="nil"/>
+              <w:left w:val="nil"/>
+              <w:bottom w:val="nil"/>
+              <w:right w:val="nil"/>
+            </w:tcBorders>
+            <w:shd w:val="clear" w:color="auto" w:fill="auto"/>
+            <w:noWrap/>
+            <w:vAlign w:val="bottom"/>
+            <w:hideMark/>
+          </w:tcPr>
+          <w:p>
+            <w:pPr>
+              <w:spacing w:after="0" w:line="240" w:lineRule="auto"/>
+              <w:jc w:val="left"/>
+              <w:rPr>
+                <w:rFonts w:eastAsia="Times New Roman" w:cs="Times New Roman"/>
+                <w:lang w:val="sl-SI" w:eastAsia="sl-SI"/>
+              </w:rPr>
+            </w:pPr>
+            <w:r>
+              <w:rPr>
+                <w:rFonts w:eastAsia="Times New Roman" w:cs="Times New Roman"/>
+                <w:lang w:val="sl-SI" w:eastAsia="sl-SI"/>
+              </w:rPr>
+              <w:t>0.935</w:t>
+            </w:r>
+          </w:p>
+        </w:tc>
+        <w:tc>
+          <w:tcPr>
+            <w:tcW w:w="2094" w:type="dxa"/>
+            <w:tcBorders>
+              <w:top w:val="nil"/>
+              <w:left w:val="nil"/>
+              <w:bottom w:val="nil"/>
+              <w:right w:val="nil"/>
+            </w:tcBorders>
+            <w:shd w:val="clear" w:color="auto" w:fill="auto"/>
+            <w:noWrap/>
+            <w:vAlign w:val="center"/>
+            <w:hideMark/>
+          </w:tcPr>
+          <w:p>
+            <w:pPr>
+              <w:spacing w:after="0" w:line="240" w:lineRule="auto"/>
+              <w:jc w:val="left"/>
+              <w:rPr>
+                <w:rFonts w:eastAsia="Times New Roman" w:cs="Times New Roman"/>
+                <w:lang w:val="sl-SI" w:eastAsia="sl-SI"/>
+              </w:rPr>
+            </w:pPr>
+            <w:r>
+              <w:rPr>
+                <w:rFonts w:eastAsia="Times New Roman" w:cs="Times New Roman"/>
+                <w:lang w:val="sl-SI" w:eastAsia="sl-SI"/>
+              </w:rPr>
+              <w:t xml:space="preserve">0.946    </w:t>
+            </w:r>
+          </w:p>
+        </w:tc>
+        <w:tc>
+          <w:tcPr>
+            <w:tcW w:w="1416" w:type="dxa"/>
+            <w:tcBorders>
+              <w:top w:val="nil"/>
+              <w:left w:val="nil"/>
+              <w:bottom w:val="nil"/>
+              <w:right w:val="nil"/>
+            </w:tcBorders>
+            <w:shd w:val="clear" w:color="auto" w:fill="auto"/>
+            <w:noWrap/>
+            <w:vAlign w:val="bottom"/>
+            <w:hideMark/>
+          </w:tcPr>
+          <w:p>
+            <w:pPr>
+              <w:spacing w:after="0" w:line="240" w:lineRule="auto"/>
+              <w:jc w:val="left"/>
+              <w:rPr>
+                <w:rFonts w:eastAsia="Times New Roman" w:cs="Times New Roman"/>
+                <w:lang w:val="sl-SI" w:eastAsia="sl-SI"/>
+              </w:rPr>
+            </w:pPr>
+            <w:r>
+              <w:rPr>
+                <w:rFonts w:eastAsia="Times New Roman" w:cs="Times New Roman"/>
+                <w:lang w:val="sl-SI" w:eastAsia="sl-SI"/>
+              </w:rPr>
+              <w:t xml:space="preserve"> 0.943</w:t>
+            </w:r>
+          </w:p>
+        </w:tc>
+        <w:tc>
+          <w:tcPr>
+            <w:tcW w:w="1286" w:type="dxa"/>
+            <w:tcBorders>
+              <w:top w:val="nil"/>
+              <w:left w:val="nil"/>
+              <w:bottom w:val="nil"/>
+              <w:right w:val="nil"/>
+            </w:tcBorders>
+            <w:shd w:val="clear" w:color="auto" w:fill="auto"/>
+            <w:noWrap/>
+            <w:vAlign w:val="bottom"/>
+            <w:hideMark/>
+          </w:tcPr>
+          <w:p>
+            <w:pPr>
+              <w:spacing w:after="0" w:line="240" w:lineRule="auto"/>
+              <w:jc w:val="left"/>
+              <w:rPr>
+                <w:rFonts w:eastAsia="Times New Roman" w:cs="Times New Roman"/>
+                <w:lang w:val="sl-SI" w:eastAsia="sl-SI"/>
+              </w:rPr>
+            </w:pPr>
+            <w:r>
+              <w:rPr>
+                <w:rFonts w:eastAsia="Times New Roman" w:cs="Times New Roman"/>
+                <w:lang w:val="sl-SI" w:eastAsia="sl-SI"/>
+              </w:rPr>
+              <w:t>0.902</w:t>
+            </w:r>
+          </w:p>
+        </w:tc>
+      </w:tr>
+      <w:tr>
+        <w:trPr>
+          <w:trHeight w:val="300"/>
+        </w:trPr>
+        <w:tc>
+          <w:tcPr>
+            <w:tcW w:w="1960" w:type="dxa"/>
+            <w:tcBorders>
+              <w:top w:val="nil"/>
+              <w:left w:val="nil"/>
+              <w:bottom w:val="nil"/>
+              <w:right w:val="nil"/>
+            </w:tcBorders>
+            <w:shd w:val="clear" w:color="auto" w:fill="auto"/>
+            <w:noWrap/>
+            <w:vAlign w:val="center"/>
+            <w:hideMark/>
+          </w:tcPr>
+          <w:p>
+            <w:pPr>
+              <w:spacing w:after="0" w:line="240" w:lineRule="auto"/>
+              <w:jc w:val="left"/>
+              <w:rPr>
+                <w:rFonts w:eastAsia="Times New Roman" w:cs="Times New Roman"/>
+                <w:lang w:val="sl-SI" w:eastAsia="sl-SI"/>
+              </w:rPr>
+            </w:pPr>
+            <w:proofErr w:type="spellStart"/>
+            <w:r>
+              <w:rPr>
+                <w:rFonts w:eastAsia="Times New Roman" w:cs="Times New Roman"/>
+                <w:lang w:val="sl-SI" w:eastAsia="sl-SI"/>
+              </w:rPr>
+              <w:t>Bacteroidota</w:t>
+            </w:r>
+            <w:proofErr w:type="spellEnd"/>
+          </w:p>
+        </w:tc>
+        <w:tc>
+          <w:tcPr>
+            <w:tcW w:w="750" w:type="dxa"/>
+            <w:tcBorders>
+              <w:top w:val="nil"/>
+              <w:left w:val="nil"/>
+              <w:bottom w:val="nil"/>
+              <w:right w:val="nil"/>
+            </w:tcBorders>
+            <w:shd w:val="clear" w:color="auto" w:fill="auto"/>
+            <w:noWrap/>
+            <w:vAlign w:val="bottom"/>
+            <w:hideMark/>
+          </w:tcPr>
+          <w:p>
+            <w:pPr>
+              <w:spacing w:after="0" w:line="240" w:lineRule="auto"/>
+              <w:jc w:val="left"/>
+              <w:rPr>
+                <w:rFonts w:eastAsia="Times New Roman" w:cs="Times New Roman"/>
+                <w:lang w:val="sl-SI" w:eastAsia="sl-SI"/>
+              </w:rPr>
+            </w:pPr>
+            <w:r>
+              <w:rPr>
+                <w:rFonts w:eastAsia="Times New Roman" w:cs="Times New Roman"/>
+                <w:lang w:val="sl-SI" w:eastAsia="sl-SI"/>
+              </w:rPr>
+              <w:t>0.341</w:t>
+            </w:r>
+          </w:p>
+        </w:tc>
+        <w:tc>
+          <w:tcPr>
+            <w:tcW w:w="2094" w:type="dxa"/>
+            <w:tcBorders>
+              <w:top w:val="nil"/>
+              <w:left w:val="nil"/>
+              <w:bottom w:val="nil"/>
+              <w:right w:val="nil"/>
+            </w:tcBorders>
+            <w:shd w:val="clear" w:color="auto" w:fill="auto"/>
+            <w:noWrap/>
+            <w:vAlign w:val="bottom"/>
+            <w:hideMark/>
+          </w:tcPr>
+          <w:p>
+            <w:pPr>
+              <w:spacing w:after="0" w:line="240" w:lineRule="auto"/>
+              <w:jc w:val="left"/>
+              <w:rPr>
+                <w:rFonts w:eastAsia="Times New Roman" w:cs="Times New Roman"/>
+                <w:lang w:val="sl-SI" w:eastAsia="sl-SI"/>
+              </w:rPr>
+            </w:pPr>
+            <w:r>
+              <w:rPr>
+                <w:rFonts w:eastAsia="Times New Roman" w:cs="Times New Roman"/>
+                <w:lang w:val="sl-SI" w:eastAsia="sl-SI"/>
+              </w:rPr>
+              <w:t>0.00335</w:t>
+            </w:r>
+          </w:p>
+        </w:tc>
+        <w:tc>
+          <w:tcPr>
+            <w:tcW w:w="2094" w:type="dxa"/>
+            <w:tcBorders>
+              <w:top w:val="nil"/>
+              <w:left w:val="nil"/>
+              <w:bottom w:val="nil"/>
+              <w:right w:val="nil"/>
+            </w:tcBorders>
+            <w:shd w:val="clear" w:color="auto" w:fill="auto"/>
+            <w:noWrap/>
+            <w:vAlign w:val="bottom"/>
+            <w:hideMark/>
+          </w:tcPr>
+          <w:p>
+            <w:pPr>
+              <w:spacing w:after="0" w:line="240" w:lineRule="auto"/>
+              <w:jc w:val="left"/>
+              <w:rPr>
+                <w:rFonts w:eastAsia="Times New Roman" w:cs="Times New Roman"/>
+                <w:lang w:val="sl-SI" w:eastAsia="sl-SI"/>
+              </w:rPr>
+            </w:pPr>
+            <w:r>
+              <w:rPr>
+                <w:rFonts w:eastAsia="Times New Roman" w:cs="Times New Roman"/>
+                <w:lang w:val="sl-SI" w:eastAsia="sl-SI"/>
+              </w:rPr>
+              <w:t>0.00269</w:t>
+            </w:r>
+          </w:p>
+        </w:tc>
+        <w:tc>
+          <w:tcPr>
+            <w:tcW w:w="1416" w:type="dxa"/>
+            <w:tcBorders>
+              <w:top w:val="nil"/>
+              <w:left w:val="nil"/>
+              <w:bottom w:val="nil"/>
+              <w:right w:val="nil"/>
+            </w:tcBorders>
+            <w:shd w:val="clear" w:color="auto" w:fill="auto"/>
+            <w:noWrap/>
+            <w:vAlign w:val="bottom"/>
+            <w:hideMark/>
+          </w:tcPr>
+          <w:p>
+            <w:pPr>
+              <w:spacing w:after="0" w:line="240" w:lineRule="auto"/>
+              <w:jc w:val="left"/>
+              <w:rPr>
+                <w:rFonts w:eastAsia="Times New Roman" w:cs="Times New Roman"/>
+                <w:lang w:val="sl-SI" w:eastAsia="sl-SI"/>
+              </w:rPr>
+            </w:pPr>
+            <w:r>
+              <w:rPr>
+                <w:rFonts w:eastAsia="Times New Roman" w:cs="Times New Roman"/>
+                <w:lang w:val="sl-SI" w:eastAsia="sl-SI"/>
+              </w:rPr>
+              <w:t xml:space="preserve"> 0.0000536</w:t>
+            </w:r>
+          </w:p>
+        </w:tc>
+        <w:tc>
+          <w:tcPr>
+            <w:tcW w:w="1286" w:type="dxa"/>
+            <w:tcBorders>
+              <w:top w:val="nil"/>
+              <w:left w:val="nil"/>
+              <w:bottom w:val="nil"/>
+              <w:right w:val="nil"/>
+            </w:tcBorders>
+            <w:shd w:val="clear" w:color="auto" w:fill="auto"/>
+            <w:noWrap/>
+            <w:vAlign w:val="bottom"/>
+            <w:hideMark/>
+          </w:tcPr>
+          <w:p>
+            <w:pPr>
+              <w:spacing w:after="0" w:line="240" w:lineRule="auto"/>
+              <w:jc w:val="left"/>
+              <w:rPr>
+                <w:rFonts w:eastAsia="Times New Roman" w:cs="Times New Roman"/>
+                <w:lang w:val="sl-SI" w:eastAsia="sl-SI"/>
+              </w:rPr>
+            </w:pPr>
+            <w:r>
+              <w:rPr>
+                <w:rFonts w:eastAsia="Times New Roman" w:cs="Times New Roman"/>
+                <w:lang w:val="sl-SI" w:eastAsia="sl-SI"/>
+              </w:rPr>
+              <w:t>0.0000182</w:t>
+            </w:r>
+          </w:p>
+        </w:tc>
+      </w:tr>
+      <w:tr>
+        <w:trPr>
+          <w:trHeight w:val="300"/>
+        </w:trPr>
+        <w:tc>
+          <w:tcPr>
+            <w:tcW w:w="1960" w:type="dxa"/>
+            <w:tcBorders>
+              <w:top w:val="nil"/>
+              <w:left w:val="nil"/>
+              <w:bottom w:val="nil"/>
+              <w:right w:val="nil"/>
+            </w:tcBorders>
+            <w:shd w:val="clear" w:color="auto" w:fill="auto"/>
+            <w:noWrap/>
+            <w:vAlign w:val="center"/>
+            <w:hideMark/>
+          </w:tcPr>
+          <w:p>
+            <w:pPr>
+              <w:spacing w:after="0" w:line="240" w:lineRule="auto"/>
+              <w:jc w:val="left"/>
+              <w:rPr>
+                <w:rFonts w:eastAsia="Times New Roman" w:cs="Times New Roman"/>
+                <w:lang w:val="sl-SI" w:eastAsia="sl-SI"/>
+              </w:rPr>
+            </w:pPr>
+            <w:proofErr w:type="spellStart"/>
+            <w:r>
+              <w:rPr>
+                <w:rFonts w:eastAsia="Times New Roman" w:cs="Times New Roman"/>
+                <w:lang w:val="sl-SI" w:eastAsia="sl-SI"/>
+              </w:rPr>
+              <w:t>Actinomycetota</w:t>
+            </w:r>
+            <w:proofErr w:type="spellEnd"/>
+          </w:p>
+        </w:tc>
+        <w:tc>
+          <w:tcPr>
+            <w:tcW w:w="750" w:type="dxa"/>
+            <w:tcBorders>
+              <w:top w:val="nil"/>
+              <w:left w:val="nil"/>
+              <w:bottom w:val="nil"/>
+              <w:right w:val="nil"/>
+            </w:tcBorders>
+            <w:shd w:val="clear" w:color="auto" w:fill="auto"/>
+            <w:noWrap/>
+            <w:vAlign w:val="bottom"/>
+            <w:hideMark/>
+          </w:tcPr>
+          <w:p>
+            <w:pPr>
+              <w:spacing w:after="0" w:line="240" w:lineRule="auto"/>
+              <w:jc w:val="left"/>
+              <w:rPr>
+                <w:rFonts w:eastAsia="Times New Roman" w:cs="Times New Roman"/>
+                <w:lang w:val="sl-SI" w:eastAsia="sl-SI"/>
+              </w:rPr>
+            </w:pPr>
+            <w:r>
+              <w:rPr>
+                <w:rFonts w:eastAsia="Times New Roman" w:cs="Times New Roman"/>
+                <w:lang w:val="sl-SI" w:eastAsia="sl-SI"/>
+              </w:rPr>
+              <w:t>0.0362</w:t>
+            </w:r>
+          </w:p>
+        </w:tc>
+        <w:tc>
+          <w:tcPr>
+            <w:tcW w:w="2094" w:type="dxa"/>
+            <w:tcBorders>
+              <w:top w:val="nil"/>
+              <w:left w:val="nil"/>
+              <w:bottom w:val="nil"/>
+              <w:right w:val="nil"/>
+            </w:tcBorders>
+            <w:shd w:val="clear" w:color="auto" w:fill="auto"/>
+            <w:noWrap/>
+            <w:vAlign w:val="bottom"/>
+            <w:hideMark/>
+          </w:tcPr>
+          <w:p>
+            <w:pPr>
+              <w:spacing w:after="0" w:line="240" w:lineRule="auto"/>
+              <w:jc w:val="left"/>
+              <w:rPr>
+                <w:rFonts w:eastAsia="Times New Roman" w:cs="Times New Roman"/>
+                <w:lang w:val="sl-SI" w:eastAsia="sl-SI"/>
+              </w:rPr>
+            </w:pPr>
+            <w:r>
+              <w:rPr>
+                <w:rFonts w:eastAsia="Times New Roman" w:cs="Times New Roman"/>
+                <w:lang w:val="sl-SI" w:eastAsia="sl-SI"/>
+              </w:rPr>
+              <w:t>0.0436</w:t>
+            </w:r>
+          </w:p>
+        </w:tc>
+        <w:tc>
+          <w:tcPr>
+            <w:tcW w:w="2094" w:type="dxa"/>
+            <w:tcBorders>
+              <w:top w:val="nil"/>
+              <w:left w:val="nil"/>
+              <w:bottom w:val="nil"/>
+              <w:right w:val="nil"/>
+            </w:tcBorders>
+            <w:shd w:val="clear" w:color="auto" w:fill="auto"/>
+            <w:noWrap/>
+            <w:vAlign w:val="bottom"/>
+            <w:hideMark/>
+          </w:tcPr>
+          <w:p>
+            <w:pPr>
+              <w:spacing w:after="0" w:line="240" w:lineRule="auto"/>
+              <w:jc w:val="left"/>
+              <w:rPr>
+                <w:rFonts w:eastAsia="Times New Roman" w:cs="Times New Roman"/>
+                <w:lang w:val="sl-SI" w:eastAsia="sl-SI"/>
+              </w:rPr>
+            </w:pPr>
+            <w:r>
+              <w:rPr>
+                <w:rFonts w:eastAsia="Times New Roman" w:cs="Times New Roman"/>
+                <w:lang w:val="sl-SI" w:eastAsia="sl-SI"/>
+              </w:rPr>
+              <w:t>0.0307</w:t>
+            </w:r>
+          </w:p>
+        </w:tc>
+        <w:tc>
+          <w:tcPr>
+            <w:tcW w:w="1416" w:type="dxa"/>
+            <w:tcBorders>
+              <w:top w:val="nil"/>
+              <w:left w:val="nil"/>
+              <w:bottom w:val="nil"/>
+              <w:right w:val="nil"/>
+            </w:tcBorders>
+            <w:shd w:val="clear" w:color="auto" w:fill="auto"/>
+            <w:noWrap/>
+            <w:vAlign w:val="bottom"/>
+            <w:hideMark/>
+          </w:tcPr>
+          <w:p>
+            <w:pPr>
+              <w:spacing w:after="0" w:line="240" w:lineRule="auto"/>
+              <w:jc w:val="left"/>
+              <w:rPr>
+                <w:rFonts w:eastAsia="Times New Roman" w:cs="Times New Roman"/>
+                <w:lang w:val="sl-SI" w:eastAsia="sl-SI"/>
+              </w:rPr>
+            </w:pPr>
+            <w:r>
+              <w:rPr>
+                <w:rFonts w:eastAsia="Times New Roman" w:cs="Times New Roman"/>
+                <w:lang w:val="sl-SI" w:eastAsia="sl-SI"/>
+              </w:rPr>
+              <w:t>0.0439</w:t>
+            </w:r>
+          </w:p>
+        </w:tc>
+        <w:tc>
+          <w:tcPr>
+            <w:tcW w:w="1286" w:type="dxa"/>
+            <w:tcBorders>
+              <w:top w:val="nil"/>
+              <w:left w:val="nil"/>
+              <w:bottom w:val="nil"/>
+              <w:right w:val="nil"/>
+            </w:tcBorders>
+            <w:shd w:val="clear" w:color="auto" w:fill="auto"/>
+            <w:noWrap/>
+            <w:vAlign w:val="bottom"/>
+            <w:hideMark/>
+          </w:tcPr>
+          <w:p>
+            <w:pPr>
+              <w:spacing w:after="0" w:line="240" w:lineRule="auto"/>
+              <w:jc w:val="left"/>
+              <w:rPr>
+                <w:rFonts w:eastAsia="Times New Roman" w:cs="Times New Roman"/>
+                <w:lang w:val="sl-SI" w:eastAsia="sl-SI"/>
+              </w:rPr>
+            </w:pPr>
+            <w:r>
+              <w:rPr>
+                <w:rFonts w:eastAsia="Times New Roman" w:cs="Times New Roman"/>
+                <w:lang w:val="sl-SI" w:eastAsia="sl-SI"/>
+              </w:rPr>
+              <w:t>0.0731</w:t>
+            </w:r>
+          </w:p>
+        </w:tc>
+      </w:tr>
+      <w:tr>
+        <w:trPr>
+          <w:trHeight w:val="300"/>
+        </w:trPr>
+        <w:tc>
+          <w:tcPr>
+            <w:tcW w:w="1960" w:type="dxa"/>
+            <w:tcBorders>
+              <w:top w:val="nil"/>
+              <w:left w:val="nil"/>
+              <w:bottom w:val="nil"/>
+              <w:right w:val="nil"/>
+            </w:tcBorders>
+            <w:shd w:val="clear" w:color="auto" w:fill="auto"/>
+            <w:noWrap/>
+            <w:vAlign w:val="center"/>
+            <w:hideMark/>
+          </w:tcPr>
+          <w:p>
+            <w:pPr>
+              <w:spacing w:after="0" w:line="240" w:lineRule="auto"/>
+              <w:jc w:val="left"/>
+              <w:rPr>
+                <w:rFonts w:eastAsia="Times New Roman" w:cs="Times New Roman"/>
+                <w:lang w:val="sl-SI" w:eastAsia="sl-SI"/>
+              </w:rPr>
+            </w:pPr>
+            <w:proofErr w:type="spellStart"/>
+            <w:r>
+              <w:rPr>
+                <w:rFonts w:eastAsia="Times New Roman" w:cs="Times New Roman"/>
+                <w:lang w:val="sl-SI" w:eastAsia="sl-SI"/>
+              </w:rPr>
+              <w:t>Pseudomonadota</w:t>
+            </w:r>
+            <w:proofErr w:type="spellEnd"/>
+          </w:p>
+        </w:tc>
+        <w:tc>
+          <w:tcPr>
+            <w:tcW w:w="750" w:type="dxa"/>
+            <w:tcBorders>
+              <w:top w:val="nil"/>
+              <w:left w:val="nil"/>
+              <w:bottom w:val="nil"/>
+              <w:right w:val="nil"/>
+            </w:tcBorders>
+            <w:shd w:val="clear" w:color="auto" w:fill="auto"/>
+            <w:noWrap/>
+            <w:vAlign w:val="bottom"/>
+            <w:hideMark/>
+          </w:tcPr>
+          <w:p>
+            <w:pPr>
+              <w:spacing w:after="0" w:line="240" w:lineRule="auto"/>
+              <w:jc w:val="left"/>
+              <w:rPr>
+                <w:rFonts w:eastAsia="Times New Roman" w:cs="Times New Roman"/>
+                <w:lang w:val="sl-SI" w:eastAsia="sl-SI"/>
+              </w:rPr>
+            </w:pPr>
+            <w:r>
+              <w:rPr>
+                <w:rFonts w:eastAsia="Times New Roman" w:cs="Times New Roman"/>
+                <w:lang w:val="sl-SI" w:eastAsia="sl-SI"/>
+              </w:rPr>
+              <w:t>0.0822</w:t>
+            </w:r>
+          </w:p>
+        </w:tc>
+        <w:tc>
+          <w:tcPr>
+            <w:tcW w:w="2094" w:type="dxa"/>
+            <w:tcBorders>
+              <w:top w:val="nil"/>
+              <w:left w:val="nil"/>
+              <w:bottom w:val="nil"/>
+              <w:right w:val="nil"/>
+            </w:tcBorders>
+            <w:shd w:val="clear" w:color="auto" w:fill="auto"/>
+            <w:noWrap/>
+            <w:vAlign w:val="bottom"/>
+            <w:hideMark/>
+          </w:tcPr>
+          <w:p>
+            <w:pPr>
+              <w:spacing w:after="0" w:line="240" w:lineRule="auto"/>
+              <w:jc w:val="left"/>
+              <w:rPr>
+                <w:rFonts w:eastAsia="Times New Roman" w:cs="Times New Roman"/>
+                <w:lang w:val="sl-SI" w:eastAsia="sl-SI"/>
+              </w:rPr>
+            </w:pPr>
+            <w:r>
+              <w:rPr>
+                <w:rFonts w:eastAsia="Times New Roman" w:cs="Times New Roman"/>
+                <w:lang w:val="sl-SI" w:eastAsia="sl-SI"/>
+              </w:rPr>
+              <w:t>0.0089</w:t>
+            </w:r>
+          </w:p>
+        </w:tc>
+        <w:tc>
+          <w:tcPr>
+            <w:tcW w:w="2094" w:type="dxa"/>
+            <w:tcBorders>
+              <w:top w:val="nil"/>
+              <w:left w:val="nil"/>
+              <w:bottom w:val="nil"/>
+              <w:right w:val="nil"/>
+            </w:tcBorders>
+            <w:shd w:val="clear" w:color="auto" w:fill="auto"/>
+            <w:noWrap/>
+            <w:vAlign w:val="bottom"/>
+            <w:hideMark/>
+          </w:tcPr>
+          <w:p>
+            <w:pPr>
+              <w:spacing w:after="0" w:line="240" w:lineRule="auto"/>
+              <w:jc w:val="left"/>
+              <w:rPr>
+                <w:rFonts w:eastAsia="Times New Roman" w:cs="Times New Roman"/>
+                <w:lang w:val="sl-SI" w:eastAsia="sl-SI"/>
+              </w:rPr>
+            </w:pPr>
+            <w:r>
+              <w:rPr>
+                <w:rFonts w:eastAsia="Times New Roman" w:cs="Times New Roman"/>
+                <w:lang w:val="sl-SI" w:eastAsia="sl-SI"/>
+              </w:rPr>
+              <w:t>0.0122</w:t>
+            </w:r>
+          </w:p>
+        </w:tc>
+        <w:tc>
+          <w:tcPr>
+            <w:tcW w:w="1416" w:type="dxa"/>
+            <w:tcBorders>
+              <w:top w:val="nil"/>
+              <w:left w:val="nil"/>
+              <w:bottom w:val="nil"/>
+              <w:right w:val="nil"/>
+            </w:tcBorders>
+            <w:shd w:val="clear" w:color="auto" w:fill="auto"/>
+            <w:noWrap/>
+            <w:vAlign w:val="bottom"/>
+            <w:hideMark/>
+          </w:tcPr>
+          <w:p>
+            <w:pPr>
+              <w:spacing w:after="0" w:line="240" w:lineRule="auto"/>
+              <w:jc w:val="left"/>
+              <w:rPr>
+                <w:rFonts w:eastAsia="Times New Roman" w:cs="Times New Roman"/>
+                <w:lang w:val="sl-SI" w:eastAsia="sl-SI"/>
+              </w:rPr>
+            </w:pPr>
+            <w:r>
+              <w:rPr>
+                <w:rFonts w:eastAsia="Times New Roman" w:cs="Times New Roman"/>
+                <w:lang w:val="sl-SI" w:eastAsia="sl-SI"/>
+              </w:rPr>
+              <w:t>0.0109</w:t>
+            </w:r>
+          </w:p>
+        </w:tc>
+        <w:tc>
+          <w:tcPr>
+            <w:tcW w:w="1286" w:type="dxa"/>
+            <w:tcBorders>
+              <w:top w:val="nil"/>
+              <w:left w:val="nil"/>
+              <w:bottom w:val="nil"/>
+              <w:right w:val="nil"/>
+            </w:tcBorders>
+            <w:shd w:val="clear" w:color="auto" w:fill="auto"/>
+            <w:noWrap/>
+            <w:vAlign w:val="bottom"/>
+            <w:hideMark/>
+          </w:tcPr>
+          <w:p>
+            <w:pPr>
+              <w:spacing w:after="0" w:line="240" w:lineRule="auto"/>
+              <w:jc w:val="left"/>
+              <w:rPr>
+                <w:rFonts w:eastAsia="Times New Roman" w:cs="Times New Roman"/>
+                <w:lang w:val="sl-SI" w:eastAsia="sl-SI"/>
+              </w:rPr>
+            </w:pPr>
+            <w:r>
+              <w:rPr>
+                <w:rFonts w:eastAsia="Times New Roman" w:cs="Times New Roman"/>
+                <w:lang w:val="sl-SI" w:eastAsia="sl-SI"/>
+              </w:rPr>
+              <w:t>0.0048</w:t>
+            </w:r>
+          </w:p>
+        </w:tc>
+      </w:tr>
+      <w:tr>
+        <w:trPr>
+          <w:trHeight w:val="300"/>
+        </w:trPr>
+        <w:tc>
+          <w:tcPr>
+            <w:tcW w:w="1960" w:type="dxa"/>
+            <w:tcBorders>
+              <w:top w:val="nil"/>
+              <w:left w:val="nil"/>
+              <w:bottom w:val="nil"/>
+              <w:right w:val="nil"/>
+            </w:tcBorders>
+            <w:shd w:val="clear" w:color="auto" w:fill="auto"/>
+            <w:noWrap/>
+            <w:vAlign w:val="center"/>
+            <w:hideMark/>
+          </w:tcPr>
+          <w:p>
+            <w:pPr>
+              <w:spacing w:after="0" w:line="240" w:lineRule="auto"/>
+              <w:jc w:val="left"/>
+              <w:rPr>
+                <w:rFonts w:eastAsia="Times New Roman" w:cs="Times New Roman"/>
+                <w:lang w:val="sl-SI" w:eastAsia="sl-SI"/>
+              </w:rPr>
+            </w:pPr>
+            <w:proofErr w:type="spellStart"/>
+            <w:r>
+              <w:rPr>
+                <w:rFonts w:eastAsia="Times New Roman" w:cs="Times New Roman"/>
+                <w:lang w:val="sl-SI" w:eastAsia="sl-SI"/>
+              </w:rPr>
+              <w:t>Verrucomicrobiota</w:t>
+            </w:r>
+            <w:proofErr w:type="spellEnd"/>
+          </w:p>
+        </w:tc>
+        <w:tc>
+          <w:tcPr>
+            <w:tcW w:w="750" w:type="dxa"/>
+            <w:tcBorders>
+              <w:top w:val="nil"/>
+              <w:left w:val="nil"/>
+              <w:bottom w:val="nil"/>
+              <w:right w:val="nil"/>
+            </w:tcBorders>
+            <w:shd w:val="clear" w:color="auto" w:fill="auto"/>
+            <w:noWrap/>
+            <w:vAlign w:val="bottom"/>
+            <w:hideMark/>
+          </w:tcPr>
+          <w:p>
+            <w:pPr>
+              <w:spacing w:after="0" w:line="240" w:lineRule="auto"/>
+              <w:jc w:val="left"/>
+              <w:rPr>
+                <w:rFonts w:eastAsia="Times New Roman" w:cs="Times New Roman"/>
+                <w:lang w:val="sl-SI" w:eastAsia="sl-SI"/>
+              </w:rPr>
+            </w:pPr>
+            <w:r>
+              <w:rPr>
+                <w:rFonts w:eastAsia="Times New Roman" w:cs="Times New Roman"/>
+                <w:lang w:val="sl-SI" w:eastAsia="sl-SI"/>
+              </w:rPr>
+              <w:t>0.0456</w:t>
+            </w:r>
+          </w:p>
+        </w:tc>
+        <w:tc>
+          <w:tcPr>
+            <w:tcW w:w="2094" w:type="dxa"/>
+            <w:tcBorders>
+              <w:top w:val="nil"/>
+              <w:left w:val="nil"/>
+              <w:bottom w:val="nil"/>
+              <w:right w:val="nil"/>
+            </w:tcBorders>
+            <w:shd w:val="clear" w:color="auto" w:fill="auto"/>
+            <w:noWrap/>
+            <w:vAlign w:val="bottom"/>
+            <w:hideMark/>
+          </w:tcPr>
+          <w:p>
+            <w:pPr>
+              <w:spacing w:after="0" w:line="240" w:lineRule="auto"/>
+              <w:jc w:val="left"/>
+              <w:rPr>
+                <w:rFonts w:eastAsia="Times New Roman" w:cs="Times New Roman"/>
+                <w:lang w:val="sl-SI" w:eastAsia="sl-SI"/>
+              </w:rPr>
+            </w:pPr>
+            <w:r>
+              <w:rPr>
+                <w:rFonts w:eastAsia="Times New Roman" w:cs="Times New Roman"/>
+                <w:lang w:val="sl-SI" w:eastAsia="sl-SI"/>
+              </w:rPr>
+              <w:t>0.00476</w:t>
+            </w:r>
+          </w:p>
+        </w:tc>
+        <w:tc>
+          <w:tcPr>
+            <w:tcW w:w="2094" w:type="dxa"/>
+            <w:tcBorders>
+              <w:top w:val="nil"/>
+              <w:left w:val="nil"/>
+              <w:bottom w:val="nil"/>
+              <w:right w:val="nil"/>
+            </w:tcBorders>
+            <w:shd w:val="clear" w:color="auto" w:fill="auto"/>
+            <w:noWrap/>
+            <w:vAlign w:val="bottom"/>
+            <w:hideMark/>
+          </w:tcPr>
+          <w:p>
+            <w:pPr>
+              <w:spacing w:after="0" w:line="240" w:lineRule="auto"/>
+              <w:jc w:val="left"/>
+              <w:rPr>
+                <w:rFonts w:eastAsia="Times New Roman" w:cs="Times New Roman"/>
+                <w:lang w:val="sl-SI" w:eastAsia="sl-SI"/>
+              </w:rPr>
+            </w:pPr>
+            <w:r>
+              <w:rPr>
+                <w:rFonts w:eastAsia="Times New Roman" w:cs="Times New Roman"/>
+                <w:lang w:val="sl-SI" w:eastAsia="sl-SI"/>
+              </w:rPr>
+              <w:t>0.00446</w:t>
+            </w:r>
+          </w:p>
+        </w:tc>
+        <w:tc>
+          <w:tcPr>
+            <w:tcW w:w="1416" w:type="dxa"/>
+            <w:tcBorders>
+              <w:top w:val="nil"/>
+              <w:left w:val="nil"/>
+              <w:bottom w:val="nil"/>
+              <w:right w:val="nil"/>
+            </w:tcBorders>
+            <w:shd w:val="clear" w:color="auto" w:fill="auto"/>
+            <w:noWrap/>
+            <w:vAlign w:val="bottom"/>
+            <w:hideMark/>
+          </w:tcPr>
+          <w:p>
+            <w:pPr>
+              <w:spacing w:after="0" w:line="240" w:lineRule="auto"/>
+              <w:jc w:val="left"/>
+              <w:rPr>
+                <w:rFonts w:eastAsia="Times New Roman" w:cs="Times New Roman"/>
+                <w:lang w:val="sl-SI" w:eastAsia="sl-SI"/>
+              </w:rPr>
+            </w:pPr>
+            <w:r>
+              <w:rPr>
+                <w:rFonts w:eastAsia="Times New Roman" w:cs="Times New Roman"/>
+                <w:lang w:val="sl-SI" w:eastAsia="sl-SI"/>
+              </w:rPr>
+              <w:t>0.000404</w:t>
+            </w:r>
+          </w:p>
+        </w:tc>
+        <w:tc>
+          <w:tcPr>
+            <w:tcW w:w="1286" w:type="dxa"/>
+            <w:tcBorders>
+              <w:top w:val="nil"/>
+              <w:left w:val="nil"/>
+              <w:bottom w:val="nil"/>
+              <w:right w:val="nil"/>
+            </w:tcBorders>
+            <w:shd w:val="clear" w:color="auto" w:fill="auto"/>
+            <w:noWrap/>
+            <w:vAlign w:val="bottom"/>
+            <w:hideMark/>
+          </w:tcPr>
+          <w:p>
+            <w:pPr>
+              <w:spacing w:after="0" w:line="240" w:lineRule="auto"/>
+              <w:jc w:val="left"/>
+              <w:rPr>
+                <w:rFonts w:eastAsia="Times New Roman" w:cs="Times New Roman"/>
+                <w:lang w:val="sl-SI" w:eastAsia="sl-SI"/>
+              </w:rPr>
+            </w:pPr>
+            <w:r>
+              <w:rPr>
+                <w:rFonts w:eastAsia="Times New Roman" w:cs="Times New Roman"/>
+                <w:lang w:val="sl-SI" w:eastAsia="sl-SI"/>
+              </w:rPr>
+              <w:t>0.0000909</w:t>
+            </w:r>
+          </w:p>
+        </w:tc>
+      </w:tr>
+      <w:tr>
+        <w:trPr>
+          <w:trHeight w:val="300"/>
+        </w:trPr>
+        <w:tc>
+          <w:tcPr>
+            <w:tcW w:w="1960" w:type="dxa"/>
+            <w:tcBorders>
+              <w:top w:val="nil"/>
+              <w:left w:val="nil"/>
+              <w:bottom w:val="nil"/>
+              <w:right w:val="nil"/>
+            </w:tcBorders>
+            <w:shd w:val="clear" w:color="auto" w:fill="auto"/>
+            <w:noWrap/>
+            <w:vAlign w:val="center"/>
+            <w:hideMark/>
+          </w:tcPr>
+          <w:p>
+            <w:pPr>
+              <w:spacing w:after="0" w:line="240" w:lineRule="auto"/>
+              <w:jc w:val="left"/>
+              <w:rPr>
+                <w:rFonts w:eastAsia="Times New Roman" w:cs="Times New Roman"/>
+                <w:lang w:val="sl-SI" w:eastAsia="sl-SI"/>
+              </w:rPr>
+            </w:pPr>
+            <w:proofErr w:type="spellStart"/>
+            <w:r>
+              <w:rPr>
+                <w:rFonts w:eastAsia="Times New Roman" w:cs="Times New Roman"/>
+                <w:lang w:val="sl-SI" w:eastAsia="sl-SI"/>
+              </w:rPr>
+              <w:t>unclassified</w:t>
+            </w:r>
+            <w:proofErr w:type="spellEnd"/>
+            <w:r>
+              <w:rPr>
+                <w:rFonts w:eastAsia="Times New Roman" w:cs="Times New Roman"/>
+                <w:lang w:val="sl-SI" w:eastAsia="sl-SI"/>
+              </w:rPr>
+              <w:t xml:space="preserve"> </w:t>
+            </w:r>
+            <w:proofErr w:type="spellStart"/>
+            <w:r>
+              <w:rPr>
+                <w:rFonts w:eastAsia="Times New Roman" w:cs="Times New Roman"/>
+                <w:lang w:val="sl-SI" w:eastAsia="sl-SI"/>
+              </w:rPr>
+              <w:t>Bacteria</w:t>
+            </w:r>
+            <w:proofErr w:type="spellEnd"/>
+          </w:p>
+        </w:tc>
+        <w:tc>
+          <w:tcPr>
+            <w:tcW w:w="750" w:type="dxa"/>
+            <w:tcBorders>
+              <w:top w:val="nil"/>
+              <w:left w:val="nil"/>
+              <w:bottom w:val="nil"/>
+              <w:right w:val="nil"/>
+            </w:tcBorders>
+            <w:shd w:val="clear" w:color="auto" w:fill="auto"/>
+            <w:noWrap/>
+            <w:vAlign w:val="bottom"/>
+            <w:hideMark/>
+          </w:tcPr>
+          <w:p>
+            <w:pPr>
+              <w:spacing w:after="0" w:line="240" w:lineRule="auto"/>
+              <w:jc w:val="left"/>
+              <w:rPr>
+                <w:rFonts w:eastAsia="Times New Roman" w:cs="Times New Roman"/>
+                <w:lang w:val="sl-SI" w:eastAsia="sl-SI"/>
+              </w:rPr>
+            </w:pPr>
+            <w:r>
+              <w:rPr>
+                <w:rFonts w:eastAsia="Times New Roman" w:cs="Times New Roman"/>
+                <w:lang w:val="sl-SI" w:eastAsia="sl-SI"/>
+              </w:rPr>
+              <w:t>0.0284</w:t>
+            </w:r>
+          </w:p>
+        </w:tc>
+        <w:tc>
+          <w:tcPr>
+            <w:tcW w:w="2094" w:type="dxa"/>
+            <w:tcBorders>
+              <w:top w:val="nil"/>
+              <w:left w:val="nil"/>
+              <w:bottom w:val="nil"/>
+              <w:right w:val="nil"/>
+            </w:tcBorders>
+            <w:shd w:val="clear" w:color="auto" w:fill="auto"/>
+            <w:noWrap/>
+            <w:vAlign w:val="bottom"/>
+            <w:hideMark/>
+          </w:tcPr>
+          <w:p>
+            <w:pPr>
+              <w:spacing w:after="0" w:line="240" w:lineRule="auto"/>
+              <w:jc w:val="left"/>
+              <w:rPr>
+                <w:rFonts w:eastAsia="Times New Roman" w:cs="Times New Roman"/>
+                <w:lang w:val="sl-SI" w:eastAsia="sl-SI"/>
+              </w:rPr>
+            </w:pPr>
+            <w:r>
+              <w:rPr>
+                <w:rFonts w:eastAsia="Times New Roman" w:cs="Times New Roman"/>
+                <w:lang w:val="sl-SI" w:eastAsia="sl-SI"/>
+              </w:rPr>
+              <w:t>0.00443</w:t>
+            </w:r>
+          </w:p>
+        </w:tc>
+        <w:tc>
+          <w:tcPr>
+            <w:tcW w:w="2094" w:type="dxa"/>
+            <w:tcBorders>
+              <w:top w:val="nil"/>
+              <w:left w:val="nil"/>
+              <w:bottom w:val="nil"/>
+              <w:right w:val="nil"/>
+            </w:tcBorders>
+            <w:shd w:val="clear" w:color="auto" w:fill="auto"/>
+            <w:noWrap/>
+            <w:vAlign w:val="bottom"/>
+            <w:hideMark/>
+          </w:tcPr>
+          <w:p>
+            <w:pPr>
+              <w:spacing w:after="0" w:line="240" w:lineRule="auto"/>
+              <w:jc w:val="left"/>
+              <w:rPr>
+                <w:rFonts w:eastAsia="Times New Roman" w:cs="Times New Roman"/>
+                <w:lang w:val="sl-SI" w:eastAsia="sl-SI"/>
+              </w:rPr>
+            </w:pPr>
+            <w:r>
+              <w:rPr>
+                <w:rFonts w:eastAsia="Times New Roman" w:cs="Times New Roman"/>
+                <w:lang w:val="sl-SI" w:eastAsia="sl-SI"/>
+              </w:rPr>
+              <w:t>0.00357</w:t>
+            </w:r>
+          </w:p>
+        </w:tc>
+        <w:tc>
+          <w:tcPr>
+            <w:tcW w:w="1416" w:type="dxa"/>
+            <w:tcBorders>
+              <w:top w:val="nil"/>
+              <w:left w:val="nil"/>
+              <w:bottom w:val="nil"/>
+              <w:right w:val="nil"/>
+            </w:tcBorders>
+            <w:shd w:val="clear" w:color="auto" w:fill="auto"/>
+            <w:noWrap/>
+            <w:vAlign w:val="bottom"/>
+            <w:hideMark/>
+          </w:tcPr>
+          <w:p>
+            <w:pPr>
+              <w:spacing w:after="0" w:line="240" w:lineRule="auto"/>
+              <w:jc w:val="left"/>
+              <w:rPr>
+                <w:rFonts w:eastAsia="Times New Roman" w:cs="Times New Roman"/>
+                <w:lang w:val="sl-SI" w:eastAsia="sl-SI"/>
+              </w:rPr>
+            </w:pPr>
+            <w:r>
+              <w:rPr>
+                <w:rFonts w:eastAsia="Times New Roman" w:cs="Times New Roman"/>
+                <w:lang w:val="sl-SI" w:eastAsia="sl-SI"/>
+              </w:rPr>
+              <w:t>0.00219</w:t>
+            </w:r>
+          </w:p>
+        </w:tc>
+        <w:tc>
+          <w:tcPr>
+            <w:tcW w:w="1286" w:type="dxa"/>
+            <w:tcBorders>
+              <w:top w:val="nil"/>
+              <w:left w:val="nil"/>
+              <w:bottom w:val="nil"/>
+              <w:right w:val="nil"/>
+            </w:tcBorders>
+            <w:shd w:val="clear" w:color="auto" w:fill="auto"/>
+            <w:noWrap/>
+            <w:vAlign w:val="bottom"/>
+            <w:hideMark/>
+          </w:tcPr>
+          <w:p>
+            <w:pPr>
+              <w:spacing w:after="0" w:line="240" w:lineRule="auto"/>
+              <w:jc w:val="left"/>
+              <w:rPr>
+                <w:rFonts w:eastAsia="Times New Roman" w:cs="Times New Roman"/>
+                <w:lang w:val="sl-SI" w:eastAsia="sl-SI"/>
+              </w:rPr>
+            </w:pPr>
+            <w:r>
+              <w:rPr>
+                <w:rFonts w:eastAsia="Times New Roman" w:cs="Times New Roman"/>
+                <w:lang w:val="sl-SI" w:eastAsia="sl-SI"/>
+              </w:rPr>
+              <w:t>0.0198</w:t>
+            </w:r>
+          </w:p>
+        </w:tc>
+      </w:tr>
+      <w:tr>
+        <w:trPr>
+          <w:trHeight w:val="300"/>
+        </w:trPr>
+        <w:tc>
+          <w:tcPr>
+            <w:tcW w:w="1960" w:type="dxa"/>
+            <w:tcBorders>
+              <w:top w:val="nil"/>
+              <w:left w:val="nil"/>
+              <w:bottom w:val="single" w:sz="4" w:space="0" w:color="auto"/>
+              <w:right w:val="nil"/>
+            </w:tcBorders>
+            <w:shd w:val="clear" w:color="auto" w:fill="auto"/>
+            <w:noWrap/>
+            <w:vAlign w:val="center"/>
+            <w:hideMark/>
+          </w:tcPr>
+          <w:p>
+            <w:pPr>
+              <w:spacing w:after="0" w:line="240" w:lineRule="auto"/>
+              <w:jc w:val="left"/>
+              <w:rPr>
+                <w:rFonts w:eastAsia="Times New Roman" w:cs="Times New Roman"/>
+                <w:lang w:val="sl-SI" w:eastAsia="sl-SI"/>
+              </w:rPr>
+            </w:pPr>
+            <w:proofErr w:type="spellStart"/>
+            <w:r>
+              <w:rPr>
+                <w:rFonts w:eastAsia="Times New Roman" w:cs="Times New Roman"/>
+                <w:lang w:val="sl-SI" w:eastAsia="sl-SI"/>
+              </w:rPr>
+              <w:t>Other</w:t>
+            </w:r>
+            <w:proofErr w:type="spellEnd"/>
+          </w:p>
+        </w:tc>
+        <w:tc>
+          <w:tcPr>
+            <w:tcW w:w="750" w:type="dxa"/>
+            <w:tcBorders>
+              <w:top w:val="nil"/>
+              <w:left w:val="nil"/>
+              <w:bottom w:val="single" w:sz="4" w:space="0" w:color="auto"/>
+              <w:right w:val="nil"/>
+            </w:tcBorders>
+            <w:shd w:val="clear" w:color="auto" w:fill="auto"/>
+            <w:noWrap/>
+            <w:vAlign w:val="bottom"/>
+            <w:hideMark/>
+          </w:tcPr>
+          <w:p>
+            <w:pPr>
+              <w:spacing w:after="0" w:line="240" w:lineRule="auto"/>
+              <w:jc w:val="left"/>
+              <w:rPr>
+                <w:rFonts w:eastAsia="Times New Roman" w:cs="Times New Roman"/>
+                <w:lang w:val="sl-SI" w:eastAsia="sl-SI"/>
+              </w:rPr>
+            </w:pPr>
+            <w:r>
+              <w:rPr>
+                <w:rFonts w:eastAsia="Times New Roman" w:cs="Times New Roman"/>
+                <w:lang w:val="sl-SI" w:eastAsia="sl-SI"/>
+              </w:rPr>
+              <w:t>0.0140</w:t>
+            </w:r>
+          </w:p>
+        </w:tc>
+        <w:tc>
+          <w:tcPr>
+            <w:tcW w:w="2094" w:type="dxa"/>
+            <w:tcBorders>
+              <w:top w:val="nil"/>
+              <w:left w:val="nil"/>
+              <w:bottom w:val="single" w:sz="4" w:space="0" w:color="auto"/>
+              <w:right w:val="nil"/>
+            </w:tcBorders>
+            <w:shd w:val="clear" w:color="auto" w:fill="auto"/>
+            <w:noWrap/>
+            <w:vAlign w:val="bottom"/>
+            <w:hideMark/>
+          </w:tcPr>
+          <w:p>
+            <w:pPr>
+              <w:spacing w:after="0" w:line="240" w:lineRule="auto"/>
+              <w:jc w:val="left"/>
+              <w:rPr>
+                <w:rFonts w:eastAsia="Times New Roman" w:cs="Times New Roman"/>
+                <w:lang w:val="sl-SI" w:eastAsia="sl-SI"/>
+              </w:rPr>
+            </w:pPr>
+            <w:r>
+              <w:rPr>
+                <w:rFonts w:eastAsia="Times New Roman" w:cs="Times New Roman"/>
+                <w:lang w:val="sl-SI" w:eastAsia="sl-SI"/>
+              </w:rPr>
+              <w:t>0.0004</w:t>
+            </w:r>
+          </w:p>
+        </w:tc>
+        <w:tc>
+          <w:tcPr>
+            <w:tcW w:w="2094" w:type="dxa"/>
+            <w:tcBorders>
+              <w:top w:val="nil"/>
+              <w:left w:val="nil"/>
+              <w:bottom w:val="single" w:sz="4" w:space="0" w:color="auto"/>
+              <w:right w:val="nil"/>
+            </w:tcBorders>
+            <w:shd w:val="clear" w:color="auto" w:fill="auto"/>
+            <w:noWrap/>
+            <w:vAlign w:val="bottom"/>
+            <w:hideMark/>
+          </w:tcPr>
+          <w:p>
+            <w:pPr>
+              <w:spacing w:after="0" w:line="240" w:lineRule="auto"/>
+              <w:jc w:val="left"/>
+              <w:rPr>
+                <w:rFonts w:eastAsia="Times New Roman" w:cs="Times New Roman"/>
+                <w:lang w:val="sl-SI" w:eastAsia="sl-SI"/>
+              </w:rPr>
+            </w:pPr>
+            <w:r>
+              <w:rPr>
+                <w:rFonts w:eastAsia="Times New Roman" w:cs="Times New Roman"/>
+                <w:lang w:val="sl-SI" w:eastAsia="sl-SI"/>
+              </w:rPr>
+              <w:t>0.0000593</w:t>
+            </w:r>
+          </w:p>
+        </w:tc>
+        <w:tc>
+          <w:tcPr>
+            <w:tcW w:w="1416" w:type="dxa"/>
+            <w:tcBorders>
+              <w:top w:val="nil"/>
+              <w:left w:val="nil"/>
+              <w:bottom w:val="single" w:sz="4" w:space="0" w:color="auto"/>
+              <w:right w:val="nil"/>
+            </w:tcBorders>
+            <w:shd w:val="clear" w:color="auto" w:fill="auto"/>
+            <w:noWrap/>
+            <w:vAlign w:val="bottom"/>
+            <w:hideMark/>
+          </w:tcPr>
+          <w:p>
+            <w:pPr>
+              <w:spacing w:after="0" w:line="240" w:lineRule="auto"/>
+              <w:jc w:val="left"/>
+              <w:rPr>
+                <w:rFonts w:eastAsia="Times New Roman" w:cs="Times New Roman"/>
+                <w:lang w:val="sl-SI" w:eastAsia="sl-SI"/>
+              </w:rPr>
+            </w:pPr>
+            <w:r>
+              <w:rPr>
+                <w:rFonts w:eastAsia="Times New Roman" w:cs="Times New Roman"/>
+                <w:lang w:val="sl-SI" w:eastAsia="sl-SI"/>
+              </w:rPr>
+              <w:t>0.0000107</w:t>
+            </w:r>
+          </w:p>
+        </w:tc>
+        <w:tc>
+          <w:tcPr>
+            <w:tcW w:w="1286" w:type="dxa"/>
+            <w:tcBorders>
+              <w:top w:val="nil"/>
+              <w:left w:val="nil"/>
+              <w:bottom w:val="single" w:sz="4" w:space="0" w:color="auto"/>
+              <w:right w:val="nil"/>
+            </w:tcBorders>
+            <w:shd w:val="clear" w:color="auto" w:fill="auto"/>
+            <w:noWrap/>
+            <w:vAlign w:val="bottom"/>
+            <w:hideMark/>
+          </w:tcPr>
+          <w:p>
+            <w:pPr>
+              <w:spacing w:after="0" w:line="240" w:lineRule="auto"/>
+              <w:jc w:val="right"/>
+              <w:rPr>
+                <w:rFonts w:eastAsia="Times New Roman" w:cs="Times New Roman"/>
+                <w:lang w:val="sl-SI" w:eastAsia="sl-SI"/>
+              </w:rPr>
+            </w:pPr>
+            <w:r>
+              <w:rPr>
+                <w:rFonts w:eastAsia="Times New Roman" w:cs="Times New Roman"/>
+                <w:lang w:val="sl-SI" w:eastAsia="sl-SI"/>
+              </w:rPr>
+              <w:t>0</w:t>
+            </w:r>
+          </w:p>
+        </w:tc>
+      </w:tr>
+    </w:tbl>
+    <w:p>
+      <w:pPr>
+        <w:rPr>
+          <w:b/>
+          <w:bCs/>
+          <w:lang w:val="en-GB"/>
+        </w:rPr>
+      </w:pPr>
+    </w:p>
+    <w:p>
+      <w:pPr>
+        <w:rPr>
+          <w:lang w:val="en-GB"/>
+        </w:rPr>
+      </w:pPr>
+      <w:r>
+        <w:rPr>
+          <w:lang w:val="en-GB"/>
+        </w:rPr>
+        <w:t xml:space="preserve">Supplement Table </w:t>
+      </w:r>
+      <w:r>
+        <w:rPr>
+          <w:lang w:val="en-GB"/>
+        </w:rPr>
+        <w:t>4</w:t>
+      </w:r>
+      <w:r>
+        <w:rPr>
+          <w:lang w:val="en-GB"/>
+        </w:rPr>
+        <w:t xml:space="preserve">. Sporulation signature genes. </w:t>
       </w:r>
     </w:p>
     <w:tbl>
@@ -9739,6 +11623,7 @@
                 <w:szCs w:val="20"/>
                 <w:lang w:val="en-GB" w:eastAsia="en-GB"/>
               </w:rPr>
+              <w:lastRenderedPageBreak/>
               <w:t>Clostridioides</w:t>
             </w:r>
             <w:proofErr w:type="spellEnd"/>
@@ -12301,7 +14186,6 @@
                 <w:szCs w:val="20"/>
                 <w:lang w:val="en-GB" w:eastAsia="en-GB"/>
               </w:rPr>
-              <w:lastRenderedPageBreak/>
               <w:t>Clostridioides</w:t>
             </w:r>
             <w:proofErr w:type="spellEnd"/>
@@ -20243,23 +22127,7 @@
           <w:rFonts w:cs="Times New Roman"/>
           <w:lang w:val="en-GB"/>
         </w:rPr>
-        <w:t>(</w:t>
-      </w:r>
-      <w:proofErr w:type="spellStart"/>
-      <w:r>
-        <w:rPr>
-          <w:rFonts w:cs="Times New Roman"/>
-          <w:lang w:val="en-GB"/>
-        </w:rPr>
-        <w:t>Koransky</w:t>
-      </w:r>
-      <w:proofErr w:type="spellEnd"/>
-      <w:r>
-        <w:rPr>
-          <w:rFonts w:cs="Times New Roman"/>
-          <w:lang w:val="en-GB"/>
-        </w:rPr>
-        <w:t xml:space="preserve"> et al., 1978)</w:t>
+        <w:t>(Koransky et al., 1978)</w:t>
       </w:r>
       <w:r>
         <w:rPr>
@@ -20474,21 +22342,7 @@
         <w:rPr>
           <w:lang w:val="en-GB"/>
         </w:rPr>
-        <w:t xml:space="preserve"> Normalized abundance in ethanol resistant sample and normalized abundance in microbiota </w:t>
-      </w:r>
-      <w:proofErr w:type="gramStart"/>
-      <w:r>
-        <w:rPr>
-          <w:lang w:val="en-GB"/>
-        </w:rPr>
-        <w:t>sample</w:t>
-      </w:r>
-      <w:proofErr w:type="gramEnd"/>
-      <w:r>
-        <w:rPr>
-          <w:lang w:val="en-GB"/>
-        </w:rPr>
-        <w:t xml:space="preserve"> are positively correlated (p-value for each individual Pearson’s correlation is plotted in the bottom right corner of the plot).</w:t>
+        <w:t xml:space="preserve"> Normalized abundance in ethanol resistant sample and normalized abundance in microbiota sample are positively correlated (p-value for each individual Pearson’s correlation is plotted in the bottom right corner of the plot).</w:t>
       </w:r>
     </w:p>
     <w:p>

</xml_diff>

<commit_message>
4.11.2025 - additional tables, supplement
</commit_message>
<xml_diff>
--- a/thesis/v1_supplement.docx
+++ b/thesis/v1_supplement.docx
@@ -1271,69 +1271,6 @@
     </w:p>
     <w:p>
       <w:pPr>
-        <w:spacing w:line="259" w:lineRule="auto"/>
-        <w:jc w:val="left"/>
-        <w:rPr>
-          <w:lang w:val="en-GB"/>
-        </w:rPr>
-      </w:pPr>
-    </w:p>
-    <w:p>
-      <w:pPr>
-        <w:spacing w:line="259" w:lineRule="auto"/>
-        <w:jc w:val="left"/>
-        <w:rPr>
-          <w:lang w:val="en-GB"/>
-        </w:rPr>
-      </w:pPr>
-    </w:p>
-    <w:p>
-      <w:pPr>
-        <w:spacing w:line="259" w:lineRule="auto"/>
-        <w:jc w:val="left"/>
-        <w:rPr>
-          <w:lang w:val="en-GB"/>
-        </w:rPr>
-      </w:pPr>
-    </w:p>
-    <w:p>
-      <w:pPr>
-        <w:spacing w:line="259" w:lineRule="auto"/>
-        <w:jc w:val="left"/>
-        <w:rPr>
-          <w:lang w:val="en-GB"/>
-        </w:rPr>
-      </w:pPr>
-    </w:p>
-    <w:p>
-      <w:pPr>
-        <w:spacing w:line="259" w:lineRule="auto"/>
-        <w:jc w:val="left"/>
-        <w:rPr>
-          <w:lang w:val="en-GB"/>
-        </w:rPr>
-      </w:pPr>
-    </w:p>
-    <w:p>
-      <w:pPr>
-        <w:spacing w:line="259" w:lineRule="auto"/>
-        <w:jc w:val="left"/>
-        <w:rPr>
-          <w:lang w:val="en-GB"/>
-        </w:rPr>
-      </w:pPr>
-    </w:p>
-    <w:p>
-      <w:pPr>
-        <w:spacing w:line="259" w:lineRule="auto"/>
-        <w:jc w:val="left"/>
-        <w:rPr>
-          <w:lang w:val="en-GB"/>
-        </w:rPr>
-      </w:pPr>
-    </w:p>
-    <w:p>
-      <w:pPr>
         <w:rPr>
           <w:lang w:val="en-GB"/>
         </w:rPr>
@@ -1343,7 +1280,6 @@
         <w:rPr>
           <w:lang w:val="en-GB"/>
         </w:rPr>
-        <w:lastRenderedPageBreak/>
         <w:t xml:space="preserve">Supplementary Table </w:t>
       </w:r>
       <w:r>
@@ -1359,3114 +1295,7 @@
         <w:t xml:space="preserve">. Details on sequencing projects in this thesis.  </w:t>
       </w:r>
     </w:p>
-    <w:tbl>
-      <w:tblPr>
-        <w:tblW w:w="14140" w:type="dxa"/>
-        <w:tblCellMar>
-          <w:left w:w="70" w:type="dxa"/>
-          <w:right w:w="70" w:type="dxa"/>
-        </w:tblCellMar>
-        <w:tblLook w:val="04A0" w:firstRow="1" w:lastRow="0" w:firstColumn="1" w:lastColumn="0" w:noHBand="0" w:noVBand="1"/>
-      </w:tblPr>
-      <w:tblGrid>
-        <w:gridCol w:w="2040"/>
-        <w:gridCol w:w="2040"/>
-        <w:gridCol w:w="2040"/>
-        <w:gridCol w:w="2040"/>
-        <w:gridCol w:w="1900"/>
-        <w:gridCol w:w="2040"/>
-        <w:gridCol w:w="2040"/>
-      </w:tblGrid>
-      <w:tr>
-        <w:trPr>
-          <w:trHeight w:val="1035"/>
-        </w:trPr>
-        <w:tc>
-          <w:tcPr>
-            <w:tcW w:w="2040" w:type="dxa"/>
-            <w:tcBorders>
-              <w:top w:val="single" w:sz="4" w:space="0" w:color="auto"/>
-              <w:left w:val="single" w:sz="4" w:space="0" w:color="auto"/>
-              <w:bottom w:val="single" w:sz="4" w:space="0" w:color="auto"/>
-              <w:right w:val="single" w:sz="4" w:space="0" w:color="auto"/>
-            </w:tcBorders>
-            <w:noWrap/>
-            <w:vAlign w:val="bottom"/>
-            <w:hideMark/>
-          </w:tcPr>
-          <w:p>
-            <w:pPr>
-              <w:spacing w:after="0" w:line="240" w:lineRule="auto"/>
-              <w:jc w:val="left"/>
-              <w:rPr>
-                <w:rFonts w:eastAsia="Times New Roman" w:cs="Times New Roman"/>
-                <w:color w:val="000000"/>
-                <w:sz w:val="20"/>
-                <w:szCs w:val="20"/>
-                <w:lang w:val="en-GB" w:eastAsia="sl-SI"/>
-              </w:rPr>
-            </w:pPr>
-            <w:r>
-              <w:rPr>
-                <w:rFonts w:eastAsia="Times New Roman" w:cs="Times New Roman"/>
-                <w:color w:val="000000"/>
-                <w:sz w:val="20"/>
-                <w:szCs w:val="20"/>
-                <w:lang w:val="en-GB" w:eastAsia="sl-SI"/>
-              </w:rPr>
-              <w:t> </w:t>
-            </w:r>
-          </w:p>
-        </w:tc>
-        <w:tc>
-          <w:tcPr>
-            <w:tcW w:w="2040" w:type="dxa"/>
-            <w:tcBorders>
-              <w:top w:val="single" w:sz="4" w:space="0" w:color="auto"/>
-              <w:left w:val="nil"/>
-              <w:bottom w:val="single" w:sz="4" w:space="0" w:color="auto"/>
-              <w:right w:val="single" w:sz="4" w:space="0" w:color="auto"/>
-            </w:tcBorders>
-            <w:vAlign w:val="bottom"/>
-            <w:hideMark/>
-          </w:tcPr>
-          <w:p>
-            <w:pPr>
-              <w:spacing w:after="0" w:line="240" w:lineRule="auto"/>
-              <w:jc w:val="left"/>
-              <w:rPr>
-                <w:rFonts w:eastAsia="Times New Roman" w:cs="Times New Roman"/>
-                <w:color w:val="000000"/>
-                <w:sz w:val="20"/>
-                <w:szCs w:val="20"/>
-                <w:lang w:val="en-GB" w:eastAsia="sl-SI"/>
-              </w:rPr>
-            </w:pPr>
-            <w:r>
-              <w:rPr>
-                <w:rFonts w:eastAsia="Times New Roman" w:cs="Times New Roman"/>
-                <w:color w:val="000000"/>
-                <w:sz w:val="20"/>
-                <w:szCs w:val="20"/>
-                <w:lang w:val="en-GB" w:eastAsia="sl-SI"/>
-              </w:rPr>
-              <w:t>Comparison of isolation protocols</w:t>
-            </w:r>
-          </w:p>
-        </w:tc>
-        <w:tc>
-          <w:tcPr>
-            <w:tcW w:w="2040" w:type="dxa"/>
-            <w:tcBorders>
-              <w:top w:val="single" w:sz="4" w:space="0" w:color="auto"/>
-              <w:left w:val="nil"/>
-              <w:bottom w:val="single" w:sz="4" w:space="0" w:color="auto"/>
-              <w:right w:val="single" w:sz="4" w:space="0" w:color="auto"/>
-            </w:tcBorders>
-            <w:vAlign w:val="bottom"/>
-            <w:hideMark/>
-          </w:tcPr>
-          <w:p>
-            <w:pPr>
-              <w:spacing w:after="0" w:line="240" w:lineRule="auto"/>
-              <w:jc w:val="left"/>
-              <w:rPr>
-                <w:rFonts w:eastAsia="Times New Roman" w:cs="Times New Roman"/>
-                <w:color w:val="000000"/>
-                <w:sz w:val="20"/>
-                <w:szCs w:val="20"/>
-                <w:lang w:val="en-GB" w:eastAsia="sl-SI"/>
-              </w:rPr>
-            </w:pPr>
-            <w:r>
-              <w:rPr>
-                <w:rFonts w:eastAsia="Times New Roman" w:cs="Times New Roman"/>
-                <w:color w:val="000000"/>
-                <w:sz w:val="20"/>
-                <w:szCs w:val="20"/>
-                <w:lang w:val="en-GB" w:eastAsia="sl-SI"/>
-              </w:rPr>
-              <w:t>Optimization of protocol for spore DNA isolation from human stool samples</w:t>
-            </w:r>
-          </w:p>
-        </w:tc>
-        <w:tc>
-          <w:tcPr>
-            <w:tcW w:w="2040" w:type="dxa"/>
-            <w:tcBorders>
-              <w:top w:val="single" w:sz="4" w:space="0" w:color="auto"/>
-              <w:left w:val="nil"/>
-              <w:bottom w:val="single" w:sz="4" w:space="0" w:color="auto"/>
-              <w:right w:val="single" w:sz="4" w:space="0" w:color="auto"/>
-            </w:tcBorders>
-            <w:vAlign w:val="bottom"/>
-            <w:hideMark/>
-          </w:tcPr>
-          <w:p>
-            <w:pPr>
-              <w:spacing w:after="0" w:line="240" w:lineRule="auto"/>
-              <w:jc w:val="left"/>
-              <w:rPr>
-                <w:rFonts w:eastAsia="Times New Roman" w:cs="Times New Roman"/>
-                <w:color w:val="000000"/>
-                <w:sz w:val="20"/>
-                <w:szCs w:val="20"/>
-                <w:lang w:val="en-GB" w:eastAsia="sl-SI"/>
-              </w:rPr>
-            </w:pPr>
-            <w:r>
-              <w:rPr>
-                <w:rFonts w:eastAsia="Times New Roman" w:cs="Times New Roman"/>
-                <w:color w:val="000000"/>
-                <w:sz w:val="20"/>
-                <w:szCs w:val="20"/>
-                <w:lang w:val="en-GB" w:eastAsia="sl-SI"/>
-              </w:rPr>
-              <w:t xml:space="preserve">Longitudinal study </w:t>
-            </w:r>
-          </w:p>
-        </w:tc>
-        <w:tc>
-          <w:tcPr>
-            <w:tcW w:w="1900" w:type="dxa"/>
-            <w:tcBorders>
-              <w:top w:val="single" w:sz="4" w:space="0" w:color="auto"/>
-              <w:left w:val="nil"/>
-              <w:bottom w:val="single" w:sz="4" w:space="0" w:color="auto"/>
-              <w:right w:val="single" w:sz="4" w:space="0" w:color="auto"/>
-            </w:tcBorders>
-            <w:vAlign w:val="bottom"/>
-            <w:hideMark/>
-          </w:tcPr>
-          <w:p>
-            <w:pPr>
-              <w:spacing w:after="0" w:line="240" w:lineRule="auto"/>
-              <w:jc w:val="left"/>
-              <w:rPr>
-                <w:rFonts w:eastAsia="Times New Roman" w:cs="Times New Roman"/>
-                <w:color w:val="000000"/>
-                <w:sz w:val="20"/>
-                <w:szCs w:val="20"/>
-                <w:lang w:val="en-GB" w:eastAsia="sl-SI"/>
-              </w:rPr>
-            </w:pPr>
-            <w:r>
-              <w:rPr>
-                <w:rFonts w:eastAsia="Times New Roman" w:cs="Times New Roman"/>
-                <w:color w:val="000000"/>
-                <w:sz w:val="20"/>
-                <w:szCs w:val="20"/>
-                <w:lang w:val="en-GB" w:eastAsia="sl-SI"/>
-              </w:rPr>
-              <w:t> </w:t>
-            </w:r>
-          </w:p>
-        </w:tc>
-        <w:tc>
-          <w:tcPr>
-            <w:tcW w:w="4080" w:type="dxa"/>
-            <w:gridSpan w:val="2"/>
-            <w:tcBorders>
-              <w:top w:val="single" w:sz="4" w:space="0" w:color="auto"/>
-              <w:left w:val="nil"/>
-              <w:bottom w:val="single" w:sz="4" w:space="0" w:color="auto"/>
-              <w:right w:val="single" w:sz="4" w:space="0" w:color="000000"/>
-            </w:tcBorders>
-            <w:noWrap/>
-            <w:vAlign w:val="bottom"/>
-            <w:hideMark/>
-          </w:tcPr>
-          <w:p>
-            <w:pPr>
-              <w:spacing w:after="0" w:line="240" w:lineRule="auto"/>
-              <w:jc w:val="left"/>
-              <w:rPr>
-                <w:rFonts w:eastAsia="Times New Roman" w:cs="Times New Roman"/>
-                <w:color w:val="000000"/>
-                <w:sz w:val="20"/>
-                <w:szCs w:val="20"/>
-                <w:lang w:val="en-GB" w:eastAsia="sl-SI"/>
-              </w:rPr>
-            </w:pPr>
-            <w:r>
-              <w:rPr>
-                <w:rFonts w:eastAsia="Times New Roman" w:cs="Times New Roman"/>
-                <w:color w:val="000000"/>
-                <w:sz w:val="20"/>
-                <w:szCs w:val="20"/>
-                <w:lang w:val="en-GB" w:eastAsia="sl-SI"/>
-              </w:rPr>
-              <w:t>Longitudinal study</w:t>
-            </w:r>
-          </w:p>
-        </w:tc>
-      </w:tr>
-      <w:tr>
-        <w:trPr>
-          <w:trHeight w:val="300"/>
-        </w:trPr>
-        <w:tc>
-          <w:tcPr>
-            <w:tcW w:w="2040" w:type="dxa"/>
-            <w:tcBorders>
-              <w:top w:val="nil"/>
-              <w:left w:val="single" w:sz="4" w:space="0" w:color="auto"/>
-              <w:bottom w:val="single" w:sz="4" w:space="0" w:color="auto"/>
-              <w:right w:val="single" w:sz="4" w:space="0" w:color="auto"/>
-            </w:tcBorders>
-            <w:vAlign w:val="bottom"/>
-            <w:hideMark/>
-          </w:tcPr>
-          <w:p>
-            <w:pPr>
-              <w:spacing w:after="0" w:line="240" w:lineRule="auto"/>
-              <w:jc w:val="left"/>
-              <w:rPr>
-                <w:rFonts w:eastAsia="Times New Roman" w:cs="Times New Roman"/>
-                <w:color w:val="000000"/>
-                <w:sz w:val="20"/>
-                <w:szCs w:val="20"/>
-                <w:lang w:val="en-GB" w:eastAsia="sl-SI"/>
-              </w:rPr>
-            </w:pPr>
-            <w:r>
-              <w:rPr>
-                <w:rFonts w:eastAsia="Times New Roman" w:cs="Times New Roman"/>
-                <w:color w:val="000000"/>
-                <w:sz w:val="20"/>
-                <w:szCs w:val="20"/>
-                <w:lang w:val="en-GB" w:eastAsia="sl-SI"/>
-              </w:rPr>
-              <w:t xml:space="preserve">Sequencing platform </w:t>
-            </w:r>
-          </w:p>
-        </w:tc>
-        <w:tc>
-          <w:tcPr>
-            <w:tcW w:w="2040" w:type="dxa"/>
-            <w:tcBorders>
-              <w:top w:val="nil"/>
-              <w:left w:val="nil"/>
-              <w:bottom w:val="single" w:sz="4" w:space="0" w:color="auto"/>
-              <w:right w:val="single" w:sz="4" w:space="0" w:color="auto"/>
-            </w:tcBorders>
-            <w:vAlign w:val="bottom"/>
-            <w:hideMark/>
-          </w:tcPr>
-          <w:p>
-            <w:pPr>
-              <w:spacing w:after="0" w:line="240" w:lineRule="auto"/>
-              <w:jc w:val="left"/>
-              <w:rPr>
-                <w:rFonts w:eastAsia="Times New Roman" w:cs="Times New Roman"/>
-                <w:color w:val="000000"/>
-                <w:sz w:val="20"/>
-                <w:szCs w:val="20"/>
-                <w:lang w:val="en-GB" w:eastAsia="sl-SI"/>
-              </w:rPr>
-            </w:pPr>
-            <w:proofErr w:type="spellStart"/>
-            <w:r>
-              <w:rPr>
-                <w:rFonts w:eastAsia="Times New Roman" w:cs="Times New Roman"/>
-                <w:color w:val="000000"/>
-                <w:sz w:val="20"/>
-                <w:szCs w:val="20"/>
-                <w:lang w:val="en-GB" w:eastAsia="sl-SI"/>
-              </w:rPr>
-              <w:t>MiSeq</w:t>
-            </w:r>
-            <w:proofErr w:type="spellEnd"/>
-          </w:p>
-        </w:tc>
-        <w:tc>
-          <w:tcPr>
-            <w:tcW w:w="2040" w:type="dxa"/>
-            <w:tcBorders>
-              <w:top w:val="nil"/>
-              <w:left w:val="nil"/>
-              <w:bottom w:val="single" w:sz="4" w:space="0" w:color="auto"/>
-              <w:right w:val="single" w:sz="4" w:space="0" w:color="auto"/>
-            </w:tcBorders>
-            <w:vAlign w:val="bottom"/>
-            <w:hideMark/>
-          </w:tcPr>
-          <w:p>
-            <w:pPr>
-              <w:spacing w:after="0" w:line="240" w:lineRule="auto"/>
-              <w:jc w:val="left"/>
-              <w:rPr>
-                <w:rFonts w:eastAsia="Times New Roman" w:cs="Times New Roman"/>
-                <w:color w:val="000000"/>
-                <w:sz w:val="20"/>
-                <w:szCs w:val="20"/>
-                <w:lang w:val="en-GB" w:eastAsia="sl-SI"/>
-              </w:rPr>
-            </w:pPr>
-            <w:proofErr w:type="spellStart"/>
-            <w:r>
-              <w:rPr>
-                <w:rFonts w:eastAsia="Times New Roman" w:cs="Times New Roman"/>
-                <w:color w:val="000000"/>
-                <w:sz w:val="20"/>
-                <w:szCs w:val="20"/>
-                <w:lang w:val="en-GB" w:eastAsia="sl-SI"/>
-              </w:rPr>
-              <w:t>MiSeq</w:t>
-            </w:r>
-            <w:proofErr w:type="spellEnd"/>
-          </w:p>
-        </w:tc>
-        <w:tc>
-          <w:tcPr>
-            <w:tcW w:w="2040" w:type="dxa"/>
-            <w:tcBorders>
-              <w:top w:val="nil"/>
-              <w:left w:val="nil"/>
-              <w:bottom w:val="single" w:sz="4" w:space="0" w:color="auto"/>
-              <w:right w:val="single" w:sz="4" w:space="0" w:color="auto"/>
-            </w:tcBorders>
-            <w:vAlign w:val="bottom"/>
-            <w:hideMark/>
-          </w:tcPr>
-          <w:p>
-            <w:pPr>
-              <w:spacing w:after="0" w:line="240" w:lineRule="auto"/>
-              <w:jc w:val="left"/>
-              <w:rPr>
-                <w:rFonts w:eastAsia="Times New Roman" w:cs="Times New Roman"/>
-                <w:color w:val="000000"/>
-                <w:sz w:val="20"/>
-                <w:szCs w:val="20"/>
-                <w:lang w:val="en-GB" w:eastAsia="sl-SI"/>
-              </w:rPr>
-            </w:pPr>
-            <w:proofErr w:type="spellStart"/>
-            <w:r>
-              <w:rPr>
-                <w:rFonts w:eastAsia="Times New Roman" w:cs="Times New Roman"/>
-                <w:color w:val="000000"/>
-                <w:sz w:val="20"/>
-                <w:szCs w:val="20"/>
-                <w:lang w:val="en-GB" w:eastAsia="sl-SI"/>
-              </w:rPr>
-              <w:t>NextSeq</w:t>
-            </w:r>
-            <w:proofErr w:type="spellEnd"/>
-          </w:p>
-        </w:tc>
-        <w:tc>
-          <w:tcPr>
-            <w:tcW w:w="1900" w:type="dxa"/>
-            <w:tcBorders>
-              <w:top w:val="nil"/>
-              <w:left w:val="nil"/>
-              <w:bottom w:val="single" w:sz="4" w:space="0" w:color="auto"/>
-              <w:right w:val="single" w:sz="4" w:space="0" w:color="auto"/>
-            </w:tcBorders>
-            <w:vAlign w:val="bottom"/>
-            <w:hideMark/>
-          </w:tcPr>
-          <w:p>
-            <w:pPr>
-              <w:spacing w:after="0" w:line="240" w:lineRule="auto"/>
-              <w:jc w:val="left"/>
-              <w:rPr>
-                <w:rFonts w:eastAsia="Times New Roman" w:cs="Times New Roman"/>
-                <w:color w:val="000000"/>
-                <w:sz w:val="20"/>
-                <w:szCs w:val="20"/>
-                <w:lang w:val="en-GB" w:eastAsia="sl-SI"/>
-              </w:rPr>
-            </w:pPr>
-            <w:r>
-              <w:rPr>
-                <w:rFonts w:eastAsia="Times New Roman" w:cs="Times New Roman"/>
-                <w:color w:val="000000"/>
-                <w:sz w:val="20"/>
-                <w:szCs w:val="20"/>
-                <w:lang w:val="en-GB" w:eastAsia="sl-SI"/>
-              </w:rPr>
-              <w:t> </w:t>
-            </w:r>
-          </w:p>
-        </w:tc>
-        <w:tc>
-          <w:tcPr>
-            <w:tcW w:w="4080" w:type="dxa"/>
-            <w:gridSpan w:val="2"/>
-            <w:tcBorders>
-              <w:top w:val="single" w:sz="4" w:space="0" w:color="auto"/>
-              <w:left w:val="nil"/>
-              <w:bottom w:val="single" w:sz="4" w:space="0" w:color="auto"/>
-              <w:right w:val="single" w:sz="4" w:space="0" w:color="auto"/>
-            </w:tcBorders>
-            <w:vAlign w:val="bottom"/>
-            <w:hideMark/>
-          </w:tcPr>
-          <w:p>
-            <w:pPr>
-              <w:spacing w:after="0" w:line="240" w:lineRule="auto"/>
-              <w:jc w:val="left"/>
-              <w:rPr>
-                <w:rFonts w:eastAsia="Times New Roman" w:cs="Times New Roman"/>
-                <w:color w:val="000000"/>
-                <w:sz w:val="20"/>
-                <w:szCs w:val="20"/>
-                <w:lang w:val="en-GB" w:eastAsia="sl-SI"/>
-              </w:rPr>
-            </w:pPr>
-            <w:proofErr w:type="spellStart"/>
-            <w:r>
-              <w:rPr>
-                <w:rFonts w:eastAsia="Times New Roman" w:cs="Times New Roman"/>
-                <w:color w:val="000000"/>
-                <w:sz w:val="20"/>
-                <w:szCs w:val="20"/>
-                <w:lang w:val="en-GB" w:eastAsia="sl-SI"/>
-              </w:rPr>
-              <w:t>DNBSeq</w:t>
-            </w:r>
-            <w:proofErr w:type="spellEnd"/>
-          </w:p>
-        </w:tc>
-      </w:tr>
-      <w:tr>
-        <w:trPr>
-          <w:trHeight w:val="780"/>
-        </w:trPr>
-        <w:tc>
-          <w:tcPr>
-            <w:tcW w:w="2040" w:type="dxa"/>
-            <w:tcBorders>
-              <w:top w:val="nil"/>
-              <w:left w:val="single" w:sz="4" w:space="0" w:color="auto"/>
-              <w:bottom w:val="single" w:sz="4" w:space="0" w:color="auto"/>
-              <w:right w:val="single" w:sz="4" w:space="0" w:color="auto"/>
-            </w:tcBorders>
-            <w:vAlign w:val="bottom"/>
-            <w:hideMark/>
-          </w:tcPr>
-          <w:p>
-            <w:pPr>
-              <w:spacing w:after="0" w:line="240" w:lineRule="auto"/>
-              <w:jc w:val="left"/>
-              <w:rPr>
-                <w:rFonts w:eastAsia="Times New Roman" w:cs="Times New Roman"/>
-                <w:color w:val="000000"/>
-                <w:sz w:val="20"/>
-                <w:szCs w:val="20"/>
-                <w:lang w:val="en-GB" w:eastAsia="sl-SI"/>
-              </w:rPr>
-            </w:pPr>
-            <w:r>
-              <w:rPr>
-                <w:rFonts w:eastAsia="Times New Roman" w:cs="Times New Roman"/>
-                <w:color w:val="000000"/>
-                <w:sz w:val="20"/>
-                <w:szCs w:val="20"/>
-                <w:lang w:val="en-GB" w:eastAsia="sl-SI"/>
-              </w:rPr>
-              <w:t xml:space="preserve">Type of sequencing </w:t>
-            </w:r>
-          </w:p>
-        </w:tc>
-        <w:tc>
-          <w:tcPr>
-            <w:tcW w:w="6120" w:type="dxa"/>
-            <w:gridSpan w:val="3"/>
-            <w:tcBorders>
-              <w:top w:val="single" w:sz="4" w:space="0" w:color="auto"/>
-              <w:left w:val="nil"/>
-              <w:bottom w:val="single" w:sz="4" w:space="0" w:color="auto"/>
-              <w:right w:val="single" w:sz="4" w:space="0" w:color="auto"/>
-            </w:tcBorders>
-            <w:vAlign w:val="bottom"/>
-            <w:hideMark/>
-          </w:tcPr>
-          <w:p>
-            <w:pPr>
-              <w:spacing w:after="0" w:line="240" w:lineRule="auto"/>
-              <w:jc w:val="left"/>
-              <w:rPr>
-                <w:rFonts w:eastAsia="Times New Roman" w:cs="Times New Roman"/>
-                <w:color w:val="000000"/>
-                <w:sz w:val="20"/>
-                <w:szCs w:val="20"/>
-                <w:lang w:val="en-GB" w:eastAsia="sl-SI"/>
-              </w:rPr>
-            </w:pPr>
-            <w:r>
-              <w:rPr>
-                <w:rFonts w:eastAsia="Times New Roman" w:cs="Times New Roman"/>
-                <w:color w:val="000000"/>
-                <w:sz w:val="20"/>
-                <w:szCs w:val="20"/>
-                <w:lang w:val="en-GB" w:eastAsia="sl-SI"/>
-              </w:rPr>
-              <w:t>Amplicon (</w:t>
-            </w:r>
-            <w:proofErr w:type="spellStart"/>
-            <w:r>
-              <w:rPr>
-                <w:rFonts w:eastAsia="Times New Roman" w:cs="Times New Roman"/>
-                <w:color w:val="000000"/>
-                <w:sz w:val="20"/>
-                <w:szCs w:val="20"/>
-                <w:lang w:val="en-GB" w:eastAsia="sl-SI"/>
-              </w:rPr>
-              <w:t>V3-V4</w:t>
-            </w:r>
-            <w:proofErr w:type="spellEnd"/>
-            <w:r>
-              <w:rPr>
-                <w:rFonts w:eastAsia="Times New Roman" w:cs="Times New Roman"/>
-                <w:color w:val="000000"/>
-                <w:sz w:val="20"/>
-                <w:szCs w:val="20"/>
-                <w:lang w:val="en-GB" w:eastAsia="sl-SI"/>
-              </w:rPr>
-              <w:t xml:space="preserve"> region of the </w:t>
-            </w:r>
-            <w:proofErr w:type="spellStart"/>
-            <w:r>
-              <w:rPr>
-                <w:rFonts w:eastAsia="Times New Roman" w:cs="Times New Roman"/>
-                <w:color w:val="000000"/>
-                <w:sz w:val="20"/>
-                <w:szCs w:val="20"/>
-                <w:lang w:val="en-GB" w:eastAsia="sl-SI"/>
-              </w:rPr>
-              <w:t>16S</w:t>
-            </w:r>
-            <w:proofErr w:type="spellEnd"/>
-            <w:r>
-              <w:rPr>
-                <w:rFonts w:eastAsia="Times New Roman" w:cs="Times New Roman"/>
-                <w:color w:val="000000"/>
-                <w:sz w:val="20"/>
-                <w:szCs w:val="20"/>
-                <w:lang w:val="en-GB" w:eastAsia="sl-SI"/>
-              </w:rPr>
-              <w:t xml:space="preserve"> rRNA gene)</w:t>
-            </w:r>
-          </w:p>
-        </w:tc>
-        <w:tc>
-          <w:tcPr>
-            <w:tcW w:w="1900" w:type="dxa"/>
-            <w:tcBorders>
-              <w:top w:val="nil"/>
-              <w:left w:val="nil"/>
-              <w:bottom w:val="single" w:sz="4" w:space="0" w:color="auto"/>
-              <w:right w:val="single" w:sz="4" w:space="0" w:color="auto"/>
-            </w:tcBorders>
-            <w:vAlign w:val="bottom"/>
-            <w:hideMark/>
-          </w:tcPr>
-          <w:p>
-            <w:pPr>
-              <w:spacing w:after="0" w:line="240" w:lineRule="auto"/>
-              <w:jc w:val="left"/>
-              <w:rPr>
-                <w:rFonts w:eastAsia="Times New Roman" w:cs="Times New Roman"/>
-                <w:color w:val="000000"/>
-                <w:sz w:val="20"/>
-                <w:szCs w:val="20"/>
-                <w:lang w:val="en-GB" w:eastAsia="sl-SI"/>
-              </w:rPr>
-            </w:pPr>
-            <w:r>
-              <w:rPr>
-                <w:rFonts w:eastAsia="Times New Roman" w:cs="Times New Roman"/>
-                <w:color w:val="000000"/>
-                <w:sz w:val="20"/>
-                <w:szCs w:val="20"/>
-                <w:lang w:val="en-GB" w:eastAsia="sl-SI"/>
-              </w:rPr>
-              <w:t> </w:t>
-            </w:r>
-          </w:p>
-        </w:tc>
-        <w:tc>
-          <w:tcPr>
-            <w:tcW w:w="2040" w:type="dxa"/>
-            <w:tcBorders>
-              <w:top w:val="nil"/>
-              <w:left w:val="nil"/>
-              <w:bottom w:val="single" w:sz="4" w:space="0" w:color="auto"/>
-              <w:right w:val="single" w:sz="4" w:space="0" w:color="auto"/>
-            </w:tcBorders>
-            <w:vAlign w:val="bottom"/>
-            <w:hideMark/>
-          </w:tcPr>
-          <w:p>
-            <w:pPr>
-              <w:spacing w:after="0" w:line="240" w:lineRule="auto"/>
-              <w:jc w:val="left"/>
-              <w:rPr>
-                <w:rFonts w:eastAsia="Times New Roman" w:cs="Times New Roman"/>
-                <w:color w:val="000000"/>
-                <w:sz w:val="20"/>
-                <w:szCs w:val="20"/>
-                <w:lang w:val="en-GB" w:eastAsia="sl-SI"/>
-              </w:rPr>
-            </w:pPr>
-            <w:r>
-              <w:rPr>
-                <w:rFonts w:eastAsia="Times New Roman" w:cs="Times New Roman"/>
-                <w:color w:val="000000"/>
-                <w:sz w:val="20"/>
-                <w:szCs w:val="20"/>
-                <w:lang w:val="en-GB" w:eastAsia="sl-SI"/>
-              </w:rPr>
-              <w:t xml:space="preserve">Shotgun metagenomic sequencing bulk microbiota samples </w:t>
-            </w:r>
-          </w:p>
-        </w:tc>
-        <w:tc>
-          <w:tcPr>
-            <w:tcW w:w="2040" w:type="dxa"/>
-            <w:tcBorders>
-              <w:top w:val="nil"/>
-              <w:left w:val="nil"/>
-              <w:bottom w:val="single" w:sz="4" w:space="0" w:color="auto"/>
-              <w:right w:val="single" w:sz="4" w:space="0" w:color="auto"/>
-            </w:tcBorders>
-            <w:vAlign w:val="bottom"/>
-            <w:hideMark/>
-          </w:tcPr>
-          <w:p>
-            <w:pPr>
-              <w:spacing w:after="0" w:line="240" w:lineRule="auto"/>
-              <w:jc w:val="left"/>
-              <w:rPr>
-                <w:rFonts w:eastAsia="Times New Roman" w:cs="Times New Roman"/>
-                <w:color w:val="000000"/>
-                <w:sz w:val="20"/>
-                <w:szCs w:val="20"/>
-                <w:lang w:val="en-GB" w:eastAsia="sl-SI"/>
-              </w:rPr>
-            </w:pPr>
-            <w:r>
-              <w:rPr>
-                <w:rFonts w:eastAsia="Times New Roman" w:cs="Times New Roman"/>
-                <w:color w:val="000000"/>
-                <w:sz w:val="20"/>
-                <w:szCs w:val="20"/>
-                <w:lang w:val="en-GB" w:eastAsia="sl-SI"/>
-              </w:rPr>
-              <w:t xml:space="preserve">Shotgun metagenomic sequencing of ethanol treated samples </w:t>
-            </w:r>
-          </w:p>
-        </w:tc>
-      </w:tr>
-      <w:tr>
-        <w:trPr>
-          <w:trHeight w:val="300"/>
-        </w:trPr>
-        <w:tc>
-          <w:tcPr>
-            <w:tcW w:w="2040" w:type="dxa"/>
-            <w:tcBorders>
-              <w:top w:val="nil"/>
-              <w:left w:val="single" w:sz="4" w:space="0" w:color="auto"/>
-              <w:bottom w:val="single" w:sz="4" w:space="0" w:color="auto"/>
-              <w:right w:val="single" w:sz="4" w:space="0" w:color="auto"/>
-            </w:tcBorders>
-            <w:vAlign w:val="bottom"/>
-            <w:hideMark/>
-          </w:tcPr>
-          <w:p>
-            <w:pPr>
-              <w:spacing w:after="0" w:line="240" w:lineRule="auto"/>
-              <w:jc w:val="left"/>
-              <w:rPr>
-                <w:rFonts w:eastAsia="Times New Roman" w:cs="Times New Roman"/>
-                <w:color w:val="000000"/>
-                <w:sz w:val="20"/>
-                <w:szCs w:val="20"/>
-                <w:lang w:val="en-GB" w:eastAsia="sl-SI"/>
-              </w:rPr>
-            </w:pPr>
-            <w:r>
-              <w:rPr>
-                <w:rFonts w:eastAsia="Times New Roman" w:cs="Times New Roman"/>
-                <w:color w:val="000000"/>
-                <w:sz w:val="20"/>
-                <w:szCs w:val="20"/>
-                <w:lang w:val="en-GB" w:eastAsia="sl-SI"/>
-              </w:rPr>
-              <w:t xml:space="preserve">Polymerase </w:t>
-            </w:r>
-          </w:p>
-        </w:tc>
-        <w:tc>
-          <w:tcPr>
-            <w:tcW w:w="2040" w:type="dxa"/>
-            <w:tcBorders>
-              <w:top w:val="nil"/>
-              <w:left w:val="nil"/>
-              <w:bottom w:val="single" w:sz="4" w:space="0" w:color="auto"/>
-              <w:right w:val="single" w:sz="4" w:space="0" w:color="auto"/>
-            </w:tcBorders>
-            <w:vAlign w:val="bottom"/>
-            <w:hideMark/>
-          </w:tcPr>
-          <w:p>
-            <w:pPr>
-              <w:spacing w:after="0" w:line="240" w:lineRule="auto"/>
-              <w:jc w:val="left"/>
-              <w:rPr>
-                <w:rFonts w:eastAsia="Times New Roman" w:cs="Times New Roman"/>
-                <w:color w:val="000000"/>
-                <w:sz w:val="20"/>
-                <w:szCs w:val="20"/>
-                <w:lang w:val="en-GB" w:eastAsia="sl-SI"/>
-              </w:rPr>
-            </w:pPr>
-            <w:r>
-              <w:rPr>
-                <w:rFonts w:eastAsia="Times New Roman" w:cs="Times New Roman"/>
-                <w:color w:val="000000"/>
-                <w:sz w:val="20"/>
-                <w:szCs w:val="20"/>
-                <w:lang w:val="en-GB" w:eastAsia="sl-SI"/>
-              </w:rPr>
-              <w:t xml:space="preserve">KAPA </w:t>
-            </w:r>
-            <w:proofErr w:type="spellStart"/>
-            <w:r>
-              <w:rPr>
-                <w:rFonts w:eastAsia="Times New Roman" w:cs="Times New Roman"/>
-                <w:color w:val="000000"/>
-                <w:sz w:val="20"/>
-                <w:szCs w:val="20"/>
-                <w:lang w:val="en-GB" w:eastAsia="sl-SI"/>
-              </w:rPr>
-              <w:t>HiFI</w:t>
-            </w:r>
-            <w:proofErr w:type="spellEnd"/>
-          </w:p>
-        </w:tc>
-        <w:tc>
-          <w:tcPr>
-            <w:tcW w:w="2040" w:type="dxa"/>
-            <w:tcBorders>
-              <w:top w:val="nil"/>
-              <w:left w:val="nil"/>
-              <w:bottom w:val="single" w:sz="4" w:space="0" w:color="auto"/>
-              <w:right w:val="single" w:sz="4" w:space="0" w:color="auto"/>
-            </w:tcBorders>
-            <w:vAlign w:val="bottom"/>
-            <w:hideMark/>
-          </w:tcPr>
-          <w:p>
-            <w:pPr>
-              <w:spacing w:after="0" w:line="240" w:lineRule="auto"/>
-              <w:jc w:val="left"/>
-              <w:rPr>
-                <w:rFonts w:eastAsia="Times New Roman" w:cs="Times New Roman"/>
-                <w:color w:val="000000"/>
-                <w:sz w:val="20"/>
-                <w:szCs w:val="20"/>
-                <w:lang w:val="en-GB" w:eastAsia="sl-SI"/>
-              </w:rPr>
-            </w:pPr>
-            <w:proofErr w:type="spellStart"/>
-            <w:r>
-              <w:rPr>
-                <w:rFonts w:eastAsia="Times New Roman" w:cs="Times New Roman"/>
-                <w:color w:val="000000"/>
-                <w:sz w:val="20"/>
-                <w:szCs w:val="20"/>
-                <w:lang w:val="en-GB" w:eastAsia="sl-SI"/>
-              </w:rPr>
-              <w:t>Q5</w:t>
-            </w:r>
-            <w:proofErr w:type="spellEnd"/>
-            <w:r>
-              <w:rPr>
-                <w:rFonts w:eastAsia="Times New Roman" w:cs="Times New Roman"/>
-                <w:color w:val="000000"/>
-                <w:sz w:val="20"/>
-                <w:szCs w:val="20"/>
-                <w:lang w:val="en-GB" w:eastAsia="sl-SI"/>
-              </w:rPr>
-              <w:t xml:space="preserve"> </w:t>
-            </w:r>
-          </w:p>
-        </w:tc>
-        <w:tc>
-          <w:tcPr>
-            <w:tcW w:w="2040" w:type="dxa"/>
-            <w:tcBorders>
-              <w:top w:val="nil"/>
-              <w:left w:val="nil"/>
-              <w:bottom w:val="single" w:sz="4" w:space="0" w:color="auto"/>
-              <w:right w:val="single" w:sz="4" w:space="0" w:color="auto"/>
-            </w:tcBorders>
-            <w:vAlign w:val="bottom"/>
-            <w:hideMark/>
-          </w:tcPr>
-          <w:p>
-            <w:pPr>
-              <w:spacing w:after="0" w:line="240" w:lineRule="auto"/>
-              <w:jc w:val="left"/>
-              <w:rPr>
-                <w:rFonts w:eastAsia="Times New Roman" w:cs="Times New Roman"/>
-                <w:color w:val="000000"/>
-                <w:sz w:val="20"/>
-                <w:szCs w:val="20"/>
-                <w:lang w:val="en-GB" w:eastAsia="sl-SI"/>
-              </w:rPr>
-            </w:pPr>
-            <w:proofErr w:type="spellStart"/>
-            <w:r>
-              <w:rPr>
-                <w:rFonts w:eastAsia="Times New Roman" w:cs="Times New Roman"/>
-                <w:color w:val="000000"/>
-                <w:sz w:val="20"/>
-                <w:szCs w:val="20"/>
-                <w:lang w:val="en-GB" w:eastAsia="sl-SI"/>
-              </w:rPr>
-              <w:t>Q5</w:t>
-            </w:r>
-            <w:proofErr w:type="spellEnd"/>
-          </w:p>
-        </w:tc>
-        <w:tc>
-          <w:tcPr>
-            <w:tcW w:w="1900" w:type="dxa"/>
-            <w:tcBorders>
-              <w:top w:val="nil"/>
-              <w:left w:val="nil"/>
-              <w:bottom w:val="single" w:sz="4" w:space="0" w:color="auto"/>
-              <w:right w:val="single" w:sz="4" w:space="0" w:color="auto"/>
-            </w:tcBorders>
-            <w:vAlign w:val="bottom"/>
-            <w:hideMark/>
-          </w:tcPr>
-          <w:p>
-            <w:pPr>
-              <w:spacing w:after="0" w:line="240" w:lineRule="auto"/>
-              <w:jc w:val="left"/>
-              <w:rPr>
-                <w:rFonts w:eastAsia="Times New Roman" w:cs="Times New Roman"/>
-                <w:color w:val="000000"/>
-                <w:sz w:val="20"/>
-                <w:szCs w:val="20"/>
-                <w:lang w:val="en-GB" w:eastAsia="sl-SI"/>
-              </w:rPr>
-            </w:pPr>
-            <w:r>
-              <w:rPr>
-                <w:rFonts w:eastAsia="Times New Roman" w:cs="Times New Roman"/>
-                <w:color w:val="000000"/>
-                <w:sz w:val="20"/>
-                <w:szCs w:val="20"/>
-                <w:lang w:val="en-GB" w:eastAsia="sl-SI"/>
-              </w:rPr>
-              <w:t> </w:t>
-            </w:r>
-          </w:p>
-        </w:tc>
-        <w:tc>
-          <w:tcPr>
-            <w:tcW w:w="2040" w:type="dxa"/>
-            <w:tcBorders>
-              <w:top w:val="nil"/>
-              <w:left w:val="nil"/>
-              <w:bottom w:val="single" w:sz="4" w:space="0" w:color="auto"/>
-              <w:right w:val="single" w:sz="4" w:space="0" w:color="auto"/>
-            </w:tcBorders>
-            <w:vAlign w:val="bottom"/>
-            <w:hideMark/>
-          </w:tcPr>
-          <w:p>
-            <w:pPr>
-              <w:spacing w:after="0" w:line="240" w:lineRule="auto"/>
-              <w:jc w:val="left"/>
-              <w:rPr>
-                <w:rFonts w:eastAsia="Times New Roman" w:cs="Times New Roman"/>
-                <w:color w:val="000000"/>
-                <w:sz w:val="20"/>
-                <w:szCs w:val="20"/>
-                <w:lang w:val="en-GB" w:eastAsia="sl-SI"/>
-              </w:rPr>
-            </w:pPr>
-            <w:proofErr w:type="spellStart"/>
-            <w:r>
-              <w:rPr>
-                <w:rFonts w:eastAsia="Times New Roman" w:cs="Times New Roman"/>
-                <w:color w:val="000000"/>
-                <w:sz w:val="20"/>
-                <w:szCs w:val="20"/>
-                <w:lang w:val="en-GB" w:eastAsia="sl-SI"/>
-              </w:rPr>
-              <w:t>Phi29</w:t>
-            </w:r>
-            <w:proofErr w:type="spellEnd"/>
-          </w:p>
-        </w:tc>
-        <w:tc>
-          <w:tcPr>
-            <w:tcW w:w="2040" w:type="dxa"/>
-            <w:tcBorders>
-              <w:top w:val="nil"/>
-              <w:left w:val="nil"/>
-              <w:bottom w:val="single" w:sz="4" w:space="0" w:color="auto"/>
-              <w:right w:val="single" w:sz="4" w:space="0" w:color="auto"/>
-            </w:tcBorders>
-            <w:vAlign w:val="bottom"/>
-            <w:hideMark/>
-          </w:tcPr>
-          <w:p>
-            <w:pPr>
-              <w:spacing w:after="0" w:line="240" w:lineRule="auto"/>
-              <w:jc w:val="left"/>
-              <w:rPr>
-                <w:rFonts w:eastAsia="Times New Roman" w:cs="Times New Roman"/>
-                <w:color w:val="000000"/>
-                <w:sz w:val="20"/>
-                <w:szCs w:val="20"/>
-                <w:lang w:val="en-GB" w:eastAsia="sl-SI"/>
-              </w:rPr>
-            </w:pPr>
-            <w:r>
-              <w:rPr>
-                <w:rFonts w:eastAsia="Times New Roman" w:cs="Times New Roman"/>
-                <w:color w:val="000000"/>
-                <w:sz w:val="20"/>
-                <w:szCs w:val="20"/>
-                <w:lang w:val="en-GB" w:eastAsia="sl-SI"/>
-              </w:rPr>
-              <w:t> </w:t>
-            </w:r>
-          </w:p>
-        </w:tc>
-      </w:tr>
-      <w:tr>
-        <w:trPr>
-          <w:trHeight w:val="780"/>
-        </w:trPr>
-        <w:tc>
-          <w:tcPr>
-            <w:tcW w:w="2040" w:type="dxa"/>
-            <w:tcBorders>
-              <w:top w:val="nil"/>
-              <w:left w:val="single" w:sz="4" w:space="0" w:color="auto"/>
-              <w:bottom w:val="single" w:sz="4" w:space="0" w:color="auto"/>
-              <w:right w:val="single" w:sz="4" w:space="0" w:color="auto"/>
-            </w:tcBorders>
-            <w:vAlign w:val="bottom"/>
-            <w:hideMark/>
-          </w:tcPr>
-          <w:p>
-            <w:pPr>
-              <w:spacing w:after="0" w:line="240" w:lineRule="auto"/>
-              <w:jc w:val="left"/>
-              <w:rPr>
-                <w:rFonts w:eastAsia="Times New Roman" w:cs="Times New Roman"/>
-                <w:color w:val="000000"/>
-                <w:sz w:val="20"/>
-                <w:szCs w:val="20"/>
-                <w:lang w:val="en-GB" w:eastAsia="sl-SI"/>
-              </w:rPr>
-            </w:pPr>
-            <w:r>
-              <w:rPr>
-                <w:rFonts w:eastAsia="Times New Roman" w:cs="Times New Roman"/>
-                <w:color w:val="000000"/>
-                <w:sz w:val="20"/>
-                <w:szCs w:val="20"/>
-                <w:lang w:val="en-GB" w:eastAsia="sl-SI"/>
-              </w:rPr>
-              <w:t>Successfully sequenced</w:t>
-            </w:r>
-          </w:p>
-        </w:tc>
-        <w:tc>
-          <w:tcPr>
-            <w:tcW w:w="2040" w:type="dxa"/>
-            <w:tcBorders>
-              <w:top w:val="nil"/>
-              <w:left w:val="nil"/>
-              <w:bottom w:val="single" w:sz="4" w:space="0" w:color="auto"/>
-              <w:right w:val="single" w:sz="4" w:space="0" w:color="auto"/>
-            </w:tcBorders>
-            <w:vAlign w:val="bottom"/>
-            <w:hideMark/>
-          </w:tcPr>
-          <w:p>
-            <w:pPr>
-              <w:spacing w:after="0" w:line="240" w:lineRule="auto"/>
-              <w:jc w:val="left"/>
-              <w:rPr>
-                <w:rFonts w:eastAsia="Times New Roman" w:cs="Times New Roman"/>
-                <w:color w:val="000000"/>
-                <w:sz w:val="20"/>
-                <w:szCs w:val="20"/>
-                <w:lang w:val="en-GB" w:eastAsia="sl-SI"/>
-              </w:rPr>
-            </w:pPr>
-            <w:r>
-              <w:rPr>
-                <w:rFonts w:eastAsia="Times New Roman" w:cs="Times New Roman"/>
-                <w:color w:val="000000"/>
-                <w:sz w:val="20"/>
-                <w:szCs w:val="20"/>
-                <w:lang w:val="en-GB" w:eastAsia="sl-SI"/>
-              </w:rPr>
-              <w:t>all</w:t>
-            </w:r>
-          </w:p>
-        </w:tc>
-        <w:tc>
-          <w:tcPr>
-            <w:tcW w:w="2040" w:type="dxa"/>
-            <w:tcBorders>
-              <w:top w:val="nil"/>
-              <w:left w:val="nil"/>
-              <w:bottom w:val="single" w:sz="4" w:space="0" w:color="auto"/>
-              <w:right w:val="single" w:sz="4" w:space="0" w:color="auto"/>
-            </w:tcBorders>
-            <w:vAlign w:val="bottom"/>
-            <w:hideMark/>
-          </w:tcPr>
-          <w:p>
-            <w:pPr>
-              <w:spacing w:after="0" w:line="240" w:lineRule="auto"/>
-              <w:jc w:val="left"/>
-              <w:rPr>
-                <w:rFonts w:eastAsia="Times New Roman" w:cs="Times New Roman"/>
-                <w:color w:val="000000"/>
-                <w:sz w:val="20"/>
-                <w:szCs w:val="20"/>
-                <w:lang w:val="en-GB" w:eastAsia="sl-SI"/>
-              </w:rPr>
-            </w:pPr>
-            <w:r>
-              <w:rPr>
-                <w:rFonts w:eastAsia="Times New Roman" w:cs="Times New Roman"/>
-                <w:color w:val="000000"/>
-                <w:sz w:val="20"/>
-                <w:szCs w:val="20"/>
-                <w:lang w:val="en-GB" w:eastAsia="sl-SI"/>
-              </w:rPr>
-              <w:t>all</w:t>
-            </w:r>
-          </w:p>
-        </w:tc>
-        <w:tc>
-          <w:tcPr>
-            <w:tcW w:w="2040" w:type="dxa"/>
-            <w:tcBorders>
-              <w:top w:val="nil"/>
-              <w:left w:val="nil"/>
-              <w:bottom w:val="single" w:sz="4" w:space="0" w:color="auto"/>
-              <w:right w:val="single" w:sz="4" w:space="0" w:color="auto"/>
-            </w:tcBorders>
-            <w:vAlign w:val="bottom"/>
-            <w:hideMark/>
-          </w:tcPr>
-          <w:p>
-            <w:pPr>
-              <w:spacing w:after="0" w:line="240" w:lineRule="auto"/>
-              <w:jc w:val="left"/>
-              <w:rPr>
-                <w:rFonts w:eastAsia="Times New Roman" w:cs="Times New Roman"/>
-                <w:color w:val="000000"/>
-                <w:sz w:val="20"/>
-                <w:szCs w:val="20"/>
-                <w:lang w:val="en-GB" w:eastAsia="sl-SI"/>
-              </w:rPr>
-            </w:pPr>
-            <w:r>
-              <w:rPr>
-                <w:rFonts w:eastAsia="Times New Roman" w:cs="Times New Roman"/>
-                <w:color w:val="000000"/>
-                <w:sz w:val="20"/>
-                <w:szCs w:val="20"/>
-                <w:lang w:val="en-GB" w:eastAsia="sl-SI"/>
-              </w:rPr>
-              <w:t>234/6 removed including both negative controls</w:t>
-            </w:r>
-          </w:p>
-        </w:tc>
-        <w:tc>
-          <w:tcPr>
-            <w:tcW w:w="1900" w:type="dxa"/>
-            <w:tcBorders>
-              <w:top w:val="nil"/>
-              <w:left w:val="nil"/>
-              <w:bottom w:val="single" w:sz="4" w:space="0" w:color="auto"/>
-              <w:right w:val="single" w:sz="4" w:space="0" w:color="auto"/>
-            </w:tcBorders>
-            <w:vAlign w:val="bottom"/>
-            <w:hideMark/>
-          </w:tcPr>
-          <w:p>
-            <w:pPr>
-              <w:spacing w:after="0" w:line="240" w:lineRule="auto"/>
-              <w:jc w:val="left"/>
-              <w:rPr>
-                <w:rFonts w:eastAsia="Times New Roman" w:cs="Times New Roman"/>
-                <w:color w:val="000000"/>
-                <w:sz w:val="20"/>
-                <w:szCs w:val="20"/>
-                <w:lang w:val="en-GB" w:eastAsia="sl-SI"/>
-              </w:rPr>
-            </w:pPr>
-            <w:r>
-              <w:rPr>
-                <w:rFonts w:eastAsia="Times New Roman" w:cs="Times New Roman"/>
-                <w:color w:val="000000"/>
-                <w:sz w:val="20"/>
-                <w:szCs w:val="20"/>
-                <w:lang w:val="en-GB" w:eastAsia="sl-SI"/>
-              </w:rPr>
-              <w:t> </w:t>
-            </w:r>
-          </w:p>
-        </w:tc>
-        <w:tc>
-          <w:tcPr>
-            <w:tcW w:w="2040" w:type="dxa"/>
-            <w:tcBorders>
-              <w:top w:val="nil"/>
-              <w:left w:val="nil"/>
-              <w:bottom w:val="single" w:sz="4" w:space="0" w:color="auto"/>
-              <w:right w:val="single" w:sz="4" w:space="0" w:color="auto"/>
-            </w:tcBorders>
-            <w:vAlign w:val="bottom"/>
-            <w:hideMark/>
-          </w:tcPr>
-          <w:p>
-            <w:pPr>
-              <w:spacing w:after="0" w:line="240" w:lineRule="auto"/>
-              <w:jc w:val="left"/>
-              <w:rPr>
-                <w:rFonts w:eastAsia="Times New Roman" w:cs="Times New Roman"/>
-                <w:color w:val="000000"/>
-                <w:sz w:val="20"/>
-                <w:szCs w:val="20"/>
-                <w:lang w:val="en-GB" w:eastAsia="sl-SI"/>
-              </w:rPr>
-            </w:pPr>
-            <w:r>
-              <w:rPr>
-                <w:rFonts w:eastAsia="Times New Roman" w:cs="Times New Roman"/>
-                <w:color w:val="000000"/>
-                <w:sz w:val="20"/>
-                <w:szCs w:val="20"/>
-                <w:lang w:val="en-GB" w:eastAsia="sl-SI"/>
-              </w:rPr>
-              <w:t>116/116</w:t>
-            </w:r>
-          </w:p>
-        </w:tc>
-        <w:tc>
-          <w:tcPr>
-            <w:tcW w:w="2040" w:type="dxa"/>
-            <w:tcBorders>
-              <w:top w:val="nil"/>
-              <w:left w:val="nil"/>
-              <w:bottom w:val="single" w:sz="4" w:space="0" w:color="auto"/>
-              <w:right w:val="single" w:sz="4" w:space="0" w:color="auto"/>
-            </w:tcBorders>
-            <w:vAlign w:val="bottom"/>
-            <w:hideMark/>
-          </w:tcPr>
-          <w:p>
-            <w:pPr>
-              <w:spacing w:after="0" w:line="240" w:lineRule="auto"/>
-              <w:jc w:val="left"/>
-              <w:rPr>
-                <w:rFonts w:eastAsia="Times New Roman" w:cs="Times New Roman"/>
-                <w:color w:val="000000"/>
-                <w:sz w:val="20"/>
-                <w:szCs w:val="20"/>
-                <w:lang w:val="en-GB" w:eastAsia="sl-SI"/>
-              </w:rPr>
-            </w:pPr>
-            <w:r>
-              <w:rPr>
-                <w:rFonts w:eastAsia="Times New Roman" w:cs="Times New Roman"/>
-                <w:color w:val="000000"/>
-                <w:sz w:val="20"/>
-                <w:szCs w:val="20"/>
-                <w:lang w:val="en-GB" w:eastAsia="sl-SI"/>
-              </w:rPr>
-              <w:t>116/85</w:t>
-            </w:r>
-          </w:p>
-        </w:tc>
-      </w:tr>
-      <w:tr>
-        <w:trPr>
-          <w:trHeight w:val="300"/>
-        </w:trPr>
-        <w:tc>
-          <w:tcPr>
-            <w:tcW w:w="2040" w:type="dxa"/>
-            <w:tcBorders>
-              <w:top w:val="nil"/>
-              <w:left w:val="single" w:sz="4" w:space="0" w:color="auto"/>
-              <w:bottom w:val="single" w:sz="4" w:space="0" w:color="auto"/>
-              <w:right w:val="single" w:sz="4" w:space="0" w:color="auto"/>
-            </w:tcBorders>
-            <w:vAlign w:val="bottom"/>
-            <w:hideMark/>
-          </w:tcPr>
-          <w:p>
-            <w:pPr>
-              <w:spacing w:after="0" w:line="240" w:lineRule="auto"/>
-              <w:jc w:val="left"/>
-              <w:rPr>
-                <w:rFonts w:eastAsia="Times New Roman" w:cs="Times New Roman"/>
-                <w:color w:val="000000"/>
-                <w:sz w:val="20"/>
-                <w:szCs w:val="20"/>
-                <w:lang w:val="en-GB" w:eastAsia="sl-SI"/>
-              </w:rPr>
-            </w:pPr>
-            <w:r>
-              <w:rPr>
-                <w:rFonts w:eastAsia="Times New Roman" w:cs="Times New Roman"/>
-                <w:color w:val="000000"/>
-                <w:sz w:val="20"/>
-                <w:szCs w:val="20"/>
-                <w:lang w:val="en-GB" w:eastAsia="sl-SI"/>
-              </w:rPr>
-              <w:t xml:space="preserve">Total number of reads </w:t>
-            </w:r>
-          </w:p>
-        </w:tc>
-        <w:tc>
-          <w:tcPr>
-            <w:tcW w:w="2040" w:type="dxa"/>
-            <w:tcBorders>
-              <w:top w:val="nil"/>
-              <w:left w:val="nil"/>
-              <w:bottom w:val="single" w:sz="4" w:space="0" w:color="auto"/>
-              <w:right w:val="single" w:sz="4" w:space="0" w:color="auto"/>
-            </w:tcBorders>
-            <w:vAlign w:val="bottom"/>
-            <w:hideMark/>
-          </w:tcPr>
-          <w:p>
-            <w:pPr>
-              <w:spacing w:after="0" w:line="240" w:lineRule="auto"/>
-              <w:jc w:val="left"/>
-              <w:rPr>
-                <w:rFonts w:eastAsia="Times New Roman" w:cs="Times New Roman"/>
-                <w:color w:val="000000"/>
-                <w:sz w:val="20"/>
-                <w:szCs w:val="20"/>
-                <w:lang w:val="en-GB" w:eastAsia="sl-SI"/>
-              </w:rPr>
-            </w:pPr>
-            <w:r>
-              <w:rPr>
-                <w:rFonts w:eastAsia="Times New Roman" w:cs="Times New Roman"/>
-                <w:color w:val="000000"/>
-                <w:sz w:val="20"/>
-                <w:szCs w:val="20"/>
-                <w:lang w:val="en-GB" w:eastAsia="sl-SI"/>
-              </w:rPr>
-              <w:t> 3 258 569</w:t>
-            </w:r>
-          </w:p>
-        </w:tc>
-        <w:tc>
-          <w:tcPr>
-            <w:tcW w:w="2040" w:type="dxa"/>
-            <w:tcBorders>
-              <w:top w:val="nil"/>
-              <w:left w:val="nil"/>
-              <w:bottom w:val="single" w:sz="4" w:space="0" w:color="auto"/>
-              <w:right w:val="single" w:sz="4" w:space="0" w:color="auto"/>
-            </w:tcBorders>
-            <w:vAlign w:val="bottom"/>
-            <w:hideMark/>
-          </w:tcPr>
-          <w:p>
-            <w:pPr>
-              <w:spacing w:after="0" w:line="240" w:lineRule="auto"/>
-              <w:jc w:val="left"/>
-              <w:rPr>
-                <w:rFonts w:eastAsia="Times New Roman" w:cs="Times New Roman"/>
-                <w:color w:val="000000"/>
-                <w:sz w:val="20"/>
-                <w:szCs w:val="20"/>
-                <w:lang w:val="en-GB" w:eastAsia="sl-SI"/>
-              </w:rPr>
-            </w:pPr>
-            <w:r>
-              <w:rPr>
-                <w:rFonts w:eastAsia="Times New Roman" w:cs="Times New Roman"/>
-                <w:color w:val="000000"/>
-                <w:sz w:val="20"/>
-                <w:szCs w:val="20"/>
-                <w:lang w:val="en-GB" w:eastAsia="sl-SI"/>
-              </w:rPr>
-              <w:t> 4 000 965</w:t>
-            </w:r>
-          </w:p>
-        </w:tc>
-        <w:tc>
-          <w:tcPr>
-            <w:tcW w:w="2040" w:type="dxa"/>
-            <w:tcBorders>
-              <w:top w:val="nil"/>
-              <w:left w:val="nil"/>
-              <w:bottom w:val="single" w:sz="4" w:space="0" w:color="auto"/>
-              <w:right w:val="single" w:sz="4" w:space="0" w:color="auto"/>
-            </w:tcBorders>
-            <w:vAlign w:val="bottom"/>
-            <w:hideMark/>
-          </w:tcPr>
-          <w:p>
-            <w:pPr>
-              <w:spacing w:after="0" w:line="240" w:lineRule="auto"/>
-              <w:jc w:val="left"/>
-              <w:rPr>
-                <w:rFonts w:eastAsia="Times New Roman" w:cs="Times New Roman"/>
-                <w:color w:val="000000"/>
-                <w:sz w:val="20"/>
-                <w:szCs w:val="20"/>
-                <w:lang w:val="en-GB" w:eastAsia="sl-SI"/>
-              </w:rPr>
-            </w:pPr>
-            <w:r>
-              <w:rPr>
-                <w:rFonts w:eastAsia="Times New Roman" w:cs="Times New Roman"/>
-                <w:color w:val="000000"/>
-                <w:sz w:val="20"/>
-                <w:szCs w:val="20"/>
-                <w:lang w:val="en-GB" w:eastAsia="sl-SI"/>
-              </w:rPr>
-              <w:t>62 793 747</w:t>
-            </w:r>
-          </w:p>
-        </w:tc>
-        <w:tc>
-          <w:tcPr>
-            <w:tcW w:w="1900" w:type="dxa"/>
-            <w:tcBorders>
-              <w:top w:val="nil"/>
-              <w:left w:val="nil"/>
-              <w:bottom w:val="single" w:sz="4" w:space="0" w:color="auto"/>
-              <w:right w:val="single" w:sz="4" w:space="0" w:color="auto"/>
-            </w:tcBorders>
-            <w:vAlign w:val="bottom"/>
-            <w:hideMark/>
-          </w:tcPr>
-          <w:p>
-            <w:pPr>
-              <w:spacing w:after="0" w:line="240" w:lineRule="auto"/>
-              <w:jc w:val="left"/>
-              <w:rPr>
-                <w:rFonts w:eastAsia="Times New Roman" w:cs="Times New Roman"/>
-                <w:color w:val="000000"/>
-                <w:sz w:val="20"/>
-                <w:szCs w:val="20"/>
-                <w:lang w:val="en-GB" w:eastAsia="sl-SI"/>
-              </w:rPr>
-            </w:pPr>
-            <w:r>
-              <w:rPr>
-                <w:rFonts w:eastAsia="Times New Roman" w:cs="Times New Roman"/>
-                <w:color w:val="000000"/>
-                <w:sz w:val="20"/>
-                <w:szCs w:val="20"/>
-                <w:lang w:val="en-GB" w:eastAsia="sl-SI"/>
-              </w:rPr>
-              <w:t> </w:t>
-            </w:r>
-          </w:p>
-        </w:tc>
-        <w:tc>
-          <w:tcPr>
-            <w:tcW w:w="2040" w:type="dxa"/>
-            <w:tcBorders>
-              <w:top w:val="nil"/>
-              <w:left w:val="nil"/>
-              <w:bottom w:val="single" w:sz="4" w:space="0" w:color="auto"/>
-              <w:right w:val="single" w:sz="4" w:space="0" w:color="auto"/>
-            </w:tcBorders>
-            <w:vAlign w:val="bottom"/>
-            <w:hideMark/>
-          </w:tcPr>
-          <w:p>
-            <w:pPr>
-              <w:spacing w:after="0" w:line="240" w:lineRule="auto"/>
-              <w:jc w:val="left"/>
-              <w:rPr>
-                <w:rFonts w:eastAsia="Times New Roman" w:cs="Times New Roman"/>
-                <w:color w:val="000000"/>
-                <w:sz w:val="20"/>
-                <w:szCs w:val="20"/>
-                <w:lang w:val="en-GB" w:eastAsia="sl-SI"/>
-              </w:rPr>
-            </w:pPr>
-            <w:r>
-              <w:rPr>
-                <w:rFonts w:eastAsia="Times New Roman" w:cs="Times New Roman"/>
-                <w:color w:val="000000"/>
-                <w:sz w:val="20"/>
-                <w:szCs w:val="20"/>
-                <w:lang w:val="en-GB" w:eastAsia="sl-SI"/>
-              </w:rPr>
-              <w:t>5 700 000 000</w:t>
-            </w:r>
-          </w:p>
-        </w:tc>
-        <w:tc>
-          <w:tcPr>
-            <w:tcW w:w="2040" w:type="dxa"/>
-            <w:tcBorders>
-              <w:top w:val="nil"/>
-              <w:left w:val="nil"/>
-              <w:bottom w:val="single" w:sz="4" w:space="0" w:color="auto"/>
-              <w:right w:val="single" w:sz="4" w:space="0" w:color="auto"/>
-            </w:tcBorders>
-            <w:noWrap/>
-            <w:vAlign w:val="bottom"/>
-            <w:hideMark/>
-          </w:tcPr>
-          <w:p>
-            <w:pPr>
-              <w:spacing w:after="0" w:line="240" w:lineRule="auto"/>
-              <w:jc w:val="left"/>
-              <w:rPr>
-                <w:rFonts w:eastAsia="Times New Roman" w:cs="Times New Roman"/>
-                <w:color w:val="000000"/>
-                <w:sz w:val="20"/>
-                <w:szCs w:val="20"/>
-                <w:lang w:val="en-GB" w:eastAsia="sl-SI"/>
-              </w:rPr>
-            </w:pPr>
-            <w:r>
-              <w:rPr>
-                <w:rFonts w:eastAsia="Times New Roman" w:cs="Times New Roman"/>
-                <w:color w:val="000000"/>
-                <w:sz w:val="20"/>
-                <w:szCs w:val="20"/>
-                <w:lang w:val="en-GB" w:eastAsia="sl-SI"/>
-              </w:rPr>
-              <w:t>4 600 000 000</w:t>
-            </w:r>
-          </w:p>
-        </w:tc>
-      </w:tr>
-      <w:tr>
-        <w:trPr>
-          <w:trHeight w:val="525"/>
-        </w:trPr>
-        <w:tc>
-          <w:tcPr>
-            <w:tcW w:w="2040" w:type="dxa"/>
-            <w:tcBorders>
-              <w:top w:val="nil"/>
-              <w:left w:val="single" w:sz="4" w:space="0" w:color="auto"/>
-              <w:bottom w:val="single" w:sz="4" w:space="0" w:color="auto"/>
-              <w:right w:val="single" w:sz="4" w:space="0" w:color="auto"/>
-            </w:tcBorders>
-            <w:vAlign w:val="bottom"/>
-            <w:hideMark/>
-          </w:tcPr>
-          <w:p>
-            <w:pPr>
-              <w:spacing w:after="0" w:line="240" w:lineRule="auto"/>
-              <w:jc w:val="left"/>
-              <w:rPr>
-                <w:rFonts w:eastAsia="Times New Roman" w:cs="Times New Roman"/>
-                <w:color w:val="000000"/>
-                <w:sz w:val="20"/>
-                <w:szCs w:val="20"/>
-                <w:lang w:val="en-GB" w:eastAsia="sl-SI"/>
-              </w:rPr>
-            </w:pPr>
-            <w:r>
-              <w:rPr>
-                <w:rFonts w:eastAsia="Times New Roman" w:cs="Times New Roman"/>
-                <w:color w:val="000000"/>
-                <w:sz w:val="20"/>
-                <w:szCs w:val="20"/>
-                <w:lang w:val="en-GB" w:eastAsia="sl-SI"/>
-              </w:rPr>
-              <w:t>Average number of reads per sample</w:t>
-            </w:r>
-          </w:p>
-        </w:tc>
-        <w:tc>
-          <w:tcPr>
-            <w:tcW w:w="2040" w:type="dxa"/>
-            <w:tcBorders>
-              <w:top w:val="nil"/>
-              <w:left w:val="nil"/>
-              <w:bottom w:val="single" w:sz="4" w:space="0" w:color="auto"/>
-              <w:right w:val="single" w:sz="4" w:space="0" w:color="auto"/>
-            </w:tcBorders>
-            <w:vAlign w:val="bottom"/>
-            <w:hideMark/>
-          </w:tcPr>
-          <w:p>
-            <w:pPr>
-              <w:spacing w:after="0" w:line="240" w:lineRule="auto"/>
-              <w:jc w:val="left"/>
-              <w:rPr>
-                <w:rFonts w:eastAsia="Times New Roman" w:cs="Times New Roman"/>
-                <w:color w:val="000000"/>
-                <w:sz w:val="20"/>
-                <w:szCs w:val="20"/>
-                <w:lang w:val="en-GB" w:eastAsia="sl-SI"/>
-              </w:rPr>
-            </w:pPr>
-            <w:r>
-              <w:rPr>
-                <w:rFonts w:eastAsia="Times New Roman" w:cs="Times New Roman"/>
-                <w:color w:val="000000"/>
-                <w:sz w:val="20"/>
-                <w:szCs w:val="20"/>
-                <w:lang w:val="en-GB" w:eastAsia="sl-SI"/>
-              </w:rPr>
-              <w:t> 90515.8</w:t>
-            </w:r>
-          </w:p>
-        </w:tc>
-        <w:tc>
-          <w:tcPr>
-            <w:tcW w:w="2040" w:type="dxa"/>
-            <w:tcBorders>
-              <w:top w:val="nil"/>
-              <w:left w:val="nil"/>
-              <w:bottom w:val="single" w:sz="4" w:space="0" w:color="auto"/>
-              <w:right w:val="single" w:sz="4" w:space="0" w:color="auto"/>
-            </w:tcBorders>
-            <w:vAlign w:val="bottom"/>
-            <w:hideMark/>
-          </w:tcPr>
-          <w:p>
-            <w:pPr>
-              <w:spacing w:after="0" w:line="240" w:lineRule="auto"/>
-              <w:jc w:val="left"/>
-              <w:rPr>
-                <w:rFonts w:eastAsia="Times New Roman" w:cs="Times New Roman"/>
-                <w:color w:val="000000"/>
-                <w:sz w:val="20"/>
-                <w:szCs w:val="20"/>
-                <w:lang w:val="en-GB" w:eastAsia="sl-SI"/>
-              </w:rPr>
-            </w:pPr>
-            <w:r>
-              <w:rPr>
-                <w:rFonts w:eastAsia="Times New Roman" w:cs="Times New Roman"/>
-                <w:color w:val="000000"/>
-                <w:sz w:val="20"/>
-                <w:szCs w:val="20"/>
-                <w:lang w:val="en-GB" w:eastAsia="sl-SI"/>
-              </w:rPr>
-              <w:t> 25006.03</w:t>
-            </w:r>
-          </w:p>
-        </w:tc>
-        <w:tc>
-          <w:tcPr>
-            <w:tcW w:w="2040" w:type="dxa"/>
-            <w:tcBorders>
-              <w:top w:val="nil"/>
-              <w:left w:val="nil"/>
-              <w:bottom w:val="single" w:sz="4" w:space="0" w:color="auto"/>
-              <w:right w:val="single" w:sz="4" w:space="0" w:color="auto"/>
-            </w:tcBorders>
-            <w:vAlign w:val="bottom"/>
-            <w:hideMark/>
-          </w:tcPr>
-          <w:p>
-            <w:pPr>
-              <w:spacing w:after="0" w:line="240" w:lineRule="auto"/>
-              <w:jc w:val="left"/>
-              <w:rPr>
-                <w:rFonts w:eastAsia="Times New Roman" w:cs="Times New Roman"/>
-                <w:color w:val="000000"/>
-                <w:sz w:val="20"/>
-                <w:szCs w:val="20"/>
-                <w:lang w:val="en-GB" w:eastAsia="sl-SI"/>
-              </w:rPr>
-            </w:pPr>
-            <w:r>
-              <w:rPr>
-                <w:rFonts w:eastAsia="Times New Roman" w:cs="Times New Roman"/>
-                <w:color w:val="000000"/>
-                <w:sz w:val="20"/>
-                <w:szCs w:val="20"/>
-                <w:lang w:val="en-GB" w:eastAsia="sl-SI"/>
-              </w:rPr>
-              <w:t>270662.7</w:t>
-            </w:r>
-          </w:p>
-        </w:tc>
-        <w:tc>
-          <w:tcPr>
-            <w:tcW w:w="1900" w:type="dxa"/>
-            <w:tcBorders>
-              <w:top w:val="nil"/>
-              <w:left w:val="nil"/>
-              <w:bottom w:val="single" w:sz="4" w:space="0" w:color="auto"/>
-              <w:right w:val="single" w:sz="4" w:space="0" w:color="auto"/>
-            </w:tcBorders>
-            <w:vAlign w:val="bottom"/>
-            <w:hideMark/>
-          </w:tcPr>
-          <w:p>
-            <w:pPr>
-              <w:spacing w:after="0" w:line="240" w:lineRule="auto"/>
-              <w:jc w:val="left"/>
-              <w:rPr>
-                <w:rFonts w:eastAsia="Times New Roman" w:cs="Times New Roman"/>
-                <w:color w:val="000000"/>
-                <w:sz w:val="20"/>
-                <w:szCs w:val="20"/>
-                <w:lang w:val="en-GB" w:eastAsia="sl-SI"/>
-              </w:rPr>
-            </w:pPr>
-            <w:r>
-              <w:rPr>
-                <w:rFonts w:eastAsia="Times New Roman" w:cs="Times New Roman"/>
-                <w:color w:val="000000"/>
-                <w:sz w:val="20"/>
-                <w:szCs w:val="20"/>
-                <w:lang w:val="en-GB" w:eastAsia="sl-SI"/>
-              </w:rPr>
-              <w:t> </w:t>
-            </w:r>
-          </w:p>
-        </w:tc>
-        <w:tc>
-          <w:tcPr>
-            <w:tcW w:w="2040" w:type="dxa"/>
-            <w:tcBorders>
-              <w:top w:val="nil"/>
-              <w:left w:val="nil"/>
-              <w:bottom w:val="single" w:sz="4" w:space="0" w:color="auto"/>
-              <w:right w:val="single" w:sz="4" w:space="0" w:color="auto"/>
-            </w:tcBorders>
-            <w:noWrap/>
-            <w:vAlign w:val="bottom"/>
-            <w:hideMark/>
-          </w:tcPr>
-          <w:p>
-            <w:pPr>
-              <w:spacing w:after="0" w:line="240" w:lineRule="auto"/>
-              <w:jc w:val="left"/>
-              <w:rPr>
-                <w:rFonts w:eastAsia="Times New Roman" w:cs="Times New Roman"/>
-                <w:color w:val="000000"/>
-                <w:sz w:val="20"/>
-                <w:szCs w:val="20"/>
-                <w:lang w:val="en-GB" w:eastAsia="sl-SI"/>
-              </w:rPr>
-            </w:pPr>
-            <w:r>
-              <w:rPr>
-                <w:rFonts w:eastAsia="Times New Roman" w:cs="Times New Roman"/>
-                <w:color w:val="000000"/>
-                <w:sz w:val="20"/>
-                <w:szCs w:val="20"/>
-                <w:lang w:val="en-GB" w:eastAsia="sl-SI"/>
-              </w:rPr>
-              <w:t>49 000 000</w:t>
-            </w:r>
-          </w:p>
-        </w:tc>
-        <w:tc>
-          <w:tcPr>
-            <w:tcW w:w="2040" w:type="dxa"/>
-            <w:tcBorders>
-              <w:top w:val="nil"/>
-              <w:left w:val="nil"/>
-              <w:bottom w:val="single" w:sz="4" w:space="0" w:color="auto"/>
-              <w:right w:val="single" w:sz="4" w:space="0" w:color="auto"/>
-            </w:tcBorders>
-            <w:noWrap/>
-            <w:vAlign w:val="bottom"/>
-            <w:hideMark/>
-          </w:tcPr>
-          <w:p>
-            <w:pPr>
-              <w:spacing w:after="0" w:line="240" w:lineRule="auto"/>
-              <w:jc w:val="left"/>
-              <w:rPr>
-                <w:rFonts w:eastAsia="Times New Roman" w:cs="Times New Roman"/>
-                <w:color w:val="000000"/>
-                <w:sz w:val="20"/>
-                <w:szCs w:val="20"/>
-                <w:lang w:val="en-GB" w:eastAsia="sl-SI"/>
-              </w:rPr>
-            </w:pPr>
-            <w:r>
-              <w:rPr>
-                <w:rFonts w:eastAsia="Times New Roman" w:cs="Times New Roman"/>
-                <w:color w:val="000000"/>
-                <w:sz w:val="20"/>
-                <w:szCs w:val="20"/>
-                <w:lang w:val="en-GB" w:eastAsia="sl-SI"/>
-              </w:rPr>
-              <w:t>55 000 000</w:t>
-            </w:r>
-          </w:p>
-        </w:tc>
-      </w:tr>
-      <w:tr>
-        <w:trPr>
-          <w:trHeight w:val="525"/>
-        </w:trPr>
-        <w:tc>
-          <w:tcPr>
-            <w:tcW w:w="2040" w:type="dxa"/>
-            <w:tcBorders>
-              <w:top w:val="nil"/>
-              <w:left w:val="single" w:sz="4" w:space="0" w:color="auto"/>
-              <w:bottom w:val="single" w:sz="4" w:space="0" w:color="auto"/>
-              <w:right w:val="single" w:sz="4" w:space="0" w:color="auto"/>
-            </w:tcBorders>
-            <w:vAlign w:val="bottom"/>
-            <w:hideMark/>
-          </w:tcPr>
-          <w:p>
-            <w:pPr>
-              <w:spacing w:after="0" w:line="240" w:lineRule="auto"/>
-              <w:jc w:val="left"/>
-              <w:rPr>
-                <w:rFonts w:eastAsia="Times New Roman" w:cs="Times New Roman"/>
-                <w:color w:val="000000"/>
-                <w:sz w:val="20"/>
-                <w:szCs w:val="20"/>
-                <w:lang w:val="en-GB" w:eastAsia="sl-SI"/>
-              </w:rPr>
-            </w:pPr>
-            <w:r>
-              <w:rPr>
-                <w:rFonts w:eastAsia="Times New Roman" w:cs="Times New Roman"/>
-                <w:color w:val="000000"/>
-                <w:sz w:val="20"/>
-                <w:szCs w:val="20"/>
-                <w:lang w:val="en-GB" w:eastAsia="sl-SI"/>
-              </w:rPr>
-              <w:t xml:space="preserve">Min / Max number of reads in a sample </w:t>
-            </w:r>
-          </w:p>
-        </w:tc>
-        <w:tc>
-          <w:tcPr>
-            <w:tcW w:w="2040" w:type="dxa"/>
-            <w:tcBorders>
-              <w:top w:val="nil"/>
-              <w:left w:val="nil"/>
-              <w:bottom w:val="single" w:sz="4" w:space="0" w:color="auto"/>
-              <w:right w:val="single" w:sz="4" w:space="0" w:color="auto"/>
-            </w:tcBorders>
-            <w:vAlign w:val="bottom"/>
-            <w:hideMark/>
-          </w:tcPr>
-          <w:p>
-            <w:pPr>
-              <w:spacing w:after="0" w:line="240" w:lineRule="auto"/>
-              <w:jc w:val="left"/>
-              <w:rPr>
-                <w:rFonts w:eastAsia="Times New Roman" w:cs="Times New Roman"/>
-                <w:color w:val="000000"/>
-                <w:sz w:val="20"/>
-                <w:szCs w:val="20"/>
-                <w:lang w:val="en-GB" w:eastAsia="sl-SI"/>
-              </w:rPr>
-            </w:pPr>
-            <w:r>
-              <w:rPr>
-                <w:rFonts w:eastAsia="Times New Roman" w:cs="Times New Roman"/>
-                <w:color w:val="000000"/>
-                <w:sz w:val="20"/>
-                <w:szCs w:val="20"/>
-                <w:lang w:val="en-GB" w:eastAsia="sl-SI"/>
-              </w:rPr>
-              <w:t> 12542 / 153 530</w:t>
-            </w:r>
-          </w:p>
-        </w:tc>
-        <w:tc>
-          <w:tcPr>
-            <w:tcW w:w="2040" w:type="dxa"/>
-            <w:tcBorders>
-              <w:top w:val="nil"/>
-              <w:left w:val="nil"/>
-              <w:bottom w:val="single" w:sz="4" w:space="0" w:color="auto"/>
-              <w:right w:val="single" w:sz="4" w:space="0" w:color="auto"/>
-            </w:tcBorders>
-            <w:vAlign w:val="bottom"/>
-            <w:hideMark/>
-          </w:tcPr>
-          <w:p>
-            <w:pPr>
-              <w:spacing w:after="0" w:line="240" w:lineRule="auto"/>
-              <w:jc w:val="left"/>
-              <w:rPr>
-                <w:rFonts w:eastAsia="Times New Roman" w:cs="Times New Roman"/>
-                <w:color w:val="000000"/>
-                <w:sz w:val="20"/>
-                <w:szCs w:val="20"/>
-                <w:lang w:val="en-GB" w:eastAsia="sl-SI"/>
-              </w:rPr>
-            </w:pPr>
-            <w:r>
-              <w:rPr>
-                <w:rFonts w:eastAsia="Times New Roman" w:cs="Times New Roman"/>
-                <w:color w:val="000000"/>
-                <w:sz w:val="20"/>
-                <w:szCs w:val="20"/>
-                <w:lang w:val="en-GB" w:eastAsia="sl-SI"/>
-              </w:rPr>
-              <w:t> 3 / 85784</w:t>
-            </w:r>
-          </w:p>
-        </w:tc>
-        <w:tc>
-          <w:tcPr>
-            <w:tcW w:w="2040" w:type="dxa"/>
-            <w:tcBorders>
-              <w:top w:val="nil"/>
-              <w:left w:val="nil"/>
-              <w:bottom w:val="single" w:sz="4" w:space="0" w:color="auto"/>
-              <w:right w:val="single" w:sz="4" w:space="0" w:color="auto"/>
-            </w:tcBorders>
-            <w:vAlign w:val="bottom"/>
-            <w:hideMark/>
-          </w:tcPr>
-          <w:p>
-            <w:pPr>
-              <w:spacing w:after="0" w:line="240" w:lineRule="auto"/>
-              <w:jc w:val="left"/>
-              <w:rPr>
-                <w:rFonts w:eastAsia="Times New Roman" w:cs="Times New Roman"/>
-                <w:color w:val="000000"/>
-                <w:sz w:val="20"/>
-                <w:szCs w:val="20"/>
-                <w:lang w:val="en-GB" w:eastAsia="sl-SI"/>
-              </w:rPr>
-            </w:pPr>
-            <w:r>
-              <w:rPr>
-                <w:rFonts w:eastAsia="Times New Roman" w:cs="Times New Roman"/>
-                <w:color w:val="000000"/>
-                <w:sz w:val="20"/>
-                <w:szCs w:val="20"/>
-                <w:lang w:val="en-GB" w:eastAsia="sl-SI"/>
-              </w:rPr>
-              <w:t>61388 / 884743</w:t>
-            </w:r>
-          </w:p>
-        </w:tc>
-        <w:tc>
-          <w:tcPr>
-            <w:tcW w:w="1900" w:type="dxa"/>
-            <w:tcBorders>
-              <w:top w:val="nil"/>
-              <w:left w:val="nil"/>
-              <w:bottom w:val="single" w:sz="4" w:space="0" w:color="auto"/>
-              <w:right w:val="single" w:sz="4" w:space="0" w:color="auto"/>
-            </w:tcBorders>
-            <w:vAlign w:val="bottom"/>
-            <w:hideMark/>
-          </w:tcPr>
-          <w:p>
-            <w:pPr>
-              <w:spacing w:after="0" w:line="240" w:lineRule="auto"/>
-              <w:jc w:val="left"/>
-              <w:rPr>
-                <w:rFonts w:eastAsia="Times New Roman" w:cs="Times New Roman"/>
-                <w:color w:val="000000"/>
-                <w:sz w:val="20"/>
-                <w:szCs w:val="20"/>
-                <w:lang w:val="en-GB" w:eastAsia="sl-SI"/>
-              </w:rPr>
-            </w:pPr>
-            <w:r>
-              <w:rPr>
-                <w:rFonts w:eastAsia="Times New Roman" w:cs="Times New Roman"/>
-                <w:color w:val="000000"/>
-                <w:sz w:val="20"/>
-                <w:szCs w:val="20"/>
-                <w:lang w:val="en-GB" w:eastAsia="sl-SI"/>
-              </w:rPr>
-              <w:t> </w:t>
-            </w:r>
-          </w:p>
-        </w:tc>
-        <w:tc>
-          <w:tcPr>
-            <w:tcW w:w="2040" w:type="dxa"/>
-            <w:tcBorders>
-              <w:top w:val="nil"/>
-              <w:left w:val="nil"/>
-              <w:bottom w:val="single" w:sz="4" w:space="0" w:color="auto"/>
-              <w:right w:val="single" w:sz="4" w:space="0" w:color="auto"/>
-            </w:tcBorders>
-            <w:vAlign w:val="bottom"/>
-            <w:hideMark/>
-          </w:tcPr>
-          <w:p>
-            <w:pPr>
-              <w:spacing w:after="0" w:line="240" w:lineRule="auto"/>
-              <w:jc w:val="left"/>
-              <w:rPr>
-                <w:rFonts w:eastAsia="Times New Roman" w:cs="Times New Roman"/>
-                <w:color w:val="000000"/>
-                <w:sz w:val="20"/>
-                <w:szCs w:val="20"/>
-                <w:lang w:val="en-GB" w:eastAsia="sl-SI"/>
-              </w:rPr>
-            </w:pPr>
-            <w:proofErr w:type="spellStart"/>
-            <w:r>
-              <w:rPr>
-                <w:rFonts w:eastAsia="Times New Roman" w:cs="Times New Roman"/>
-                <w:color w:val="000000"/>
-                <w:sz w:val="20"/>
-                <w:szCs w:val="20"/>
-                <w:lang w:val="en-GB" w:eastAsia="sl-SI"/>
-              </w:rPr>
-              <w:t>4e7</w:t>
-            </w:r>
-            <w:proofErr w:type="spellEnd"/>
-            <w:r>
-              <w:rPr>
-                <w:rFonts w:eastAsia="Times New Roman" w:cs="Times New Roman"/>
-                <w:color w:val="000000"/>
-                <w:sz w:val="20"/>
-                <w:szCs w:val="20"/>
-                <w:lang w:val="en-GB" w:eastAsia="sl-SI"/>
-              </w:rPr>
-              <w:t xml:space="preserve"> / </w:t>
-            </w:r>
-            <w:proofErr w:type="spellStart"/>
-            <w:r>
-              <w:rPr>
-                <w:rFonts w:eastAsia="Times New Roman" w:cs="Times New Roman"/>
-                <w:color w:val="000000"/>
-                <w:sz w:val="20"/>
-                <w:szCs w:val="20"/>
-                <w:lang w:val="en-GB" w:eastAsia="sl-SI"/>
-              </w:rPr>
-              <w:t>5e7</w:t>
-            </w:r>
-            <w:proofErr w:type="spellEnd"/>
-          </w:p>
-        </w:tc>
-        <w:tc>
-          <w:tcPr>
-            <w:tcW w:w="2040" w:type="dxa"/>
-            <w:tcBorders>
-              <w:top w:val="nil"/>
-              <w:left w:val="nil"/>
-              <w:bottom w:val="single" w:sz="4" w:space="0" w:color="auto"/>
-              <w:right w:val="single" w:sz="4" w:space="0" w:color="auto"/>
-            </w:tcBorders>
-            <w:noWrap/>
-            <w:vAlign w:val="bottom"/>
-            <w:hideMark/>
-          </w:tcPr>
-          <w:p>
-            <w:pPr>
-              <w:spacing w:after="0" w:line="240" w:lineRule="auto"/>
-              <w:jc w:val="left"/>
-              <w:rPr>
-                <w:rFonts w:eastAsia="Times New Roman" w:cs="Times New Roman"/>
-                <w:color w:val="000000"/>
-                <w:sz w:val="20"/>
-                <w:szCs w:val="20"/>
-                <w:lang w:val="en-GB" w:eastAsia="sl-SI"/>
-              </w:rPr>
-            </w:pPr>
-            <w:proofErr w:type="spellStart"/>
-            <w:r>
-              <w:rPr>
-                <w:rFonts w:eastAsia="Times New Roman" w:cs="Times New Roman"/>
-                <w:color w:val="000000"/>
-                <w:sz w:val="20"/>
-                <w:szCs w:val="20"/>
-                <w:lang w:val="en-GB" w:eastAsia="sl-SI"/>
-              </w:rPr>
-              <w:t>5e6</w:t>
-            </w:r>
-            <w:proofErr w:type="spellEnd"/>
-            <w:r>
-              <w:rPr>
-                <w:rFonts w:eastAsia="Times New Roman" w:cs="Times New Roman"/>
-                <w:color w:val="000000"/>
-                <w:sz w:val="20"/>
-                <w:szCs w:val="20"/>
-                <w:lang w:val="en-GB" w:eastAsia="sl-SI"/>
-              </w:rPr>
-              <w:t xml:space="preserve"> / </w:t>
-            </w:r>
-            <w:proofErr w:type="spellStart"/>
-            <w:r>
-              <w:rPr>
-                <w:rFonts w:eastAsia="Times New Roman" w:cs="Times New Roman"/>
-                <w:color w:val="000000"/>
-                <w:sz w:val="20"/>
-                <w:szCs w:val="20"/>
-                <w:lang w:val="en-GB" w:eastAsia="sl-SI"/>
-              </w:rPr>
-              <w:t>1e8</w:t>
-            </w:r>
-            <w:proofErr w:type="spellEnd"/>
-          </w:p>
-        </w:tc>
-      </w:tr>
-      <w:tr>
-        <w:trPr>
-          <w:trHeight w:val="780"/>
-        </w:trPr>
-        <w:tc>
-          <w:tcPr>
-            <w:tcW w:w="2040" w:type="dxa"/>
-            <w:tcBorders>
-              <w:top w:val="nil"/>
-              <w:left w:val="single" w:sz="4" w:space="0" w:color="auto"/>
-              <w:bottom w:val="single" w:sz="4" w:space="0" w:color="auto"/>
-              <w:right w:val="single" w:sz="4" w:space="0" w:color="auto"/>
-            </w:tcBorders>
-            <w:vAlign w:val="bottom"/>
-            <w:hideMark/>
-          </w:tcPr>
-          <w:p>
-            <w:pPr>
-              <w:spacing w:after="0" w:line="240" w:lineRule="auto"/>
-              <w:jc w:val="left"/>
-              <w:rPr>
-                <w:rFonts w:eastAsia="Times New Roman" w:cs="Times New Roman"/>
-                <w:color w:val="000000"/>
-                <w:sz w:val="20"/>
-                <w:szCs w:val="20"/>
-                <w:lang w:val="en-GB" w:eastAsia="sl-SI"/>
-              </w:rPr>
-            </w:pPr>
-            <w:r>
-              <w:rPr>
-                <w:rFonts w:eastAsia="Times New Roman" w:cs="Times New Roman"/>
-                <w:color w:val="000000"/>
-                <w:sz w:val="20"/>
-                <w:szCs w:val="20"/>
-                <w:lang w:val="en-GB" w:eastAsia="sl-SI"/>
-              </w:rPr>
-              <w:t>Number of reads per sample (rarefaction depth)</w:t>
-            </w:r>
-          </w:p>
-        </w:tc>
-        <w:tc>
-          <w:tcPr>
-            <w:tcW w:w="2040" w:type="dxa"/>
-            <w:tcBorders>
-              <w:top w:val="nil"/>
-              <w:left w:val="nil"/>
-              <w:bottom w:val="single" w:sz="4" w:space="0" w:color="auto"/>
-              <w:right w:val="single" w:sz="4" w:space="0" w:color="auto"/>
-            </w:tcBorders>
-            <w:vAlign w:val="bottom"/>
-            <w:hideMark/>
-          </w:tcPr>
-          <w:p>
-            <w:pPr>
-              <w:spacing w:after="0" w:line="240" w:lineRule="auto"/>
-              <w:jc w:val="left"/>
-              <w:rPr>
-                <w:rFonts w:eastAsia="Times New Roman" w:cs="Times New Roman"/>
-                <w:color w:val="000000"/>
-                <w:sz w:val="20"/>
-                <w:szCs w:val="20"/>
-                <w:lang w:val="en-GB" w:eastAsia="sl-SI"/>
-              </w:rPr>
-            </w:pPr>
-            <w:r>
-              <w:rPr>
-                <w:rFonts w:eastAsia="Times New Roman" w:cs="Times New Roman"/>
-                <w:color w:val="000000"/>
-                <w:sz w:val="20"/>
-                <w:szCs w:val="20"/>
-                <w:lang w:val="en-GB" w:eastAsia="sl-SI"/>
-              </w:rPr>
-              <w:t> 50 000</w:t>
-            </w:r>
-          </w:p>
-        </w:tc>
-        <w:tc>
-          <w:tcPr>
-            <w:tcW w:w="2040" w:type="dxa"/>
-            <w:tcBorders>
-              <w:top w:val="nil"/>
-              <w:left w:val="nil"/>
-              <w:bottom w:val="single" w:sz="4" w:space="0" w:color="auto"/>
-              <w:right w:val="single" w:sz="4" w:space="0" w:color="auto"/>
-            </w:tcBorders>
-            <w:vAlign w:val="bottom"/>
-            <w:hideMark/>
-          </w:tcPr>
-          <w:p>
-            <w:pPr>
-              <w:spacing w:after="0" w:line="240" w:lineRule="auto"/>
-              <w:jc w:val="left"/>
-              <w:rPr>
-                <w:rFonts w:eastAsia="Times New Roman" w:cs="Times New Roman"/>
-                <w:color w:val="000000"/>
-                <w:sz w:val="20"/>
-                <w:szCs w:val="20"/>
-                <w:lang w:val="en-GB" w:eastAsia="sl-SI"/>
-              </w:rPr>
-            </w:pPr>
-            <w:r>
-              <w:rPr>
-                <w:rFonts w:eastAsia="Times New Roman" w:cs="Times New Roman"/>
-                <w:color w:val="000000"/>
-                <w:sz w:val="20"/>
-                <w:szCs w:val="20"/>
-                <w:lang w:val="en-GB" w:eastAsia="sl-SI"/>
-              </w:rPr>
-              <w:t> 10 000</w:t>
-            </w:r>
-          </w:p>
-        </w:tc>
-        <w:tc>
-          <w:tcPr>
-            <w:tcW w:w="2040" w:type="dxa"/>
-            <w:tcBorders>
-              <w:top w:val="nil"/>
-              <w:left w:val="nil"/>
-              <w:bottom w:val="single" w:sz="4" w:space="0" w:color="auto"/>
-              <w:right w:val="single" w:sz="4" w:space="0" w:color="auto"/>
-            </w:tcBorders>
-            <w:vAlign w:val="bottom"/>
-            <w:hideMark/>
-          </w:tcPr>
-          <w:p>
-            <w:pPr>
-              <w:spacing w:after="0" w:line="240" w:lineRule="auto"/>
-              <w:jc w:val="left"/>
-              <w:rPr>
-                <w:rFonts w:eastAsia="Times New Roman" w:cs="Times New Roman"/>
-                <w:color w:val="000000"/>
-                <w:sz w:val="20"/>
-                <w:szCs w:val="20"/>
-                <w:lang w:val="en-GB" w:eastAsia="sl-SI"/>
-              </w:rPr>
-            </w:pPr>
-            <w:r>
-              <w:rPr>
-                <w:rFonts w:eastAsia="Times New Roman" w:cs="Times New Roman"/>
-                <w:color w:val="000000"/>
-                <w:sz w:val="20"/>
-                <w:szCs w:val="20"/>
-                <w:lang w:val="en-GB" w:eastAsia="sl-SI"/>
-              </w:rPr>
-              <w:t>150 000</w:t>
-            </w:r>
-          </w:p>
-        </w:tc>
-        <w:tc>
-          <w:tcPr>
-            <w:tcW w:w="1900" w:type="dxa"/>
-            <w:tcBorders>
-              <w:top w:val="nil"/>
-              <w:left w:val="nil"/>
-              <w:bottom w:val="single" w:sz="4" w:space="0" w:color="auto"/>
-              <w:right w:val="single" w:sz="4" w:space="0" w:color="auto"/>
-            </w:tcBorders>
-            <w:vAlign w:val="bottom"/>
-            <w:hideMark/>
-          </w:tcPr>
-          <w:p>
-            <w:pPr>
-              <w:spacing w:after="0" w:line="240" w:lineRule="auto"/>
-              <w:jc w:val="left"/>
-              <w:rPr>
-                <w:rFonts w:eastAsia="Times New Roman" w:cs="Times New Roman"/>
-                <w:color w:val="000000"/>
-                <w:sz w:val="20"/>
-                <w:szCs w:val="20"/>
-                <w:lang w:val="en-GB" w:eastAsia="sl-SI"/>
-              </w:rPr>
-            </w:pPr>
-            <w:r>
-              <w:rPr>
-                <w:rFonts w:eastAsia="Times New Roman" w:cs="Times New Roman"/>
-                <w:color w:val="000000"/>
-                <w:sz w:val="20"/>
-                <w:szCs w:val="20"/>
-                <w:lang w:val="en-GB" w:eastAsia="sl-SI"/>
-              </w:rPr>
-              <w:t> </w:t>
-            </w:r>
-          </w:p>
-        </w:tc>
-        <w:tc>
-          <w:tcPr>
-            <w:tcW w:w="2040" w:type="dxa"/>
-            <w:tcBorders>
-              <w:top w:val="nil"/>
-              <w:left w:val="nil"/>
-              <w:bottom w:val="single" w:sz="4" w:space="0" w:color="auto"/>
-              <w:right w:val="single" w:sz="4" w:space="0" w:color="auto"/>
-            </w:tcBorders>
-            <w:noWrap/>
-            <w:vAlign w:val="bottom"/>
-            <w:hideMark/>
-          </w:tcPr>
-          <w:p>
-            <w:pPr>
-              <w:spacing w:after="0" w:line="240" w:lineRule="auto"/>
-              <w:jc w:val="left"/>
-              <w:rPr>
-                <w:rFonts w:eastAsia="Times New Roman" w:cs="Times New Roman"/>
-                <w:color w:val="000000"/>
-                <w:sz w:val="20"/>
-                <w:szCs w:val="20"/>
-                <w:lang w:val="en-GB" w:eastAsia="sl-SI"/>
-              </w:rPr>
-            </w:pPr>
-            <w:r>
-              <w:rPr>
-                <w:rFonts w:eastAsia="Times New Roman" w:cs="Times New Roman"/>
-                <w:color w:val="000000"/>
-                <w:sz w:val="20"/>
-                <w:szCs w:val="20"/>
-                <w:lang w:val="en-GB" w:eastAsia="sl-SI"/>
-              </w:rPr>
-              <w:t> </w:t>
-            </w:r>
-          </w:p>
-        </w:tc>
-        <w:tc>
-          <w:tcPr>
-            <w:tcW w:w="2040" w:type="dxa"/>
-            <w:tcBorders>
-              <w:top w:val="nil"/>
-              <w:left w:val="nil"/>
-              <w:bottom w:val="single" w:sz="4" w:space="0" w:color="auto"/>
-              <w:right w:val="single" w:sz="4" w:space="0" w:color="auto"/>
-            </w:tcBorders>
-            <w:noWrap/>
-            <w:vAlign w:val="bottom"/>
-            <w:hideMark/>
-          </w:tcPr>
-          <w:p>
-            <w:pPr>
-              <w:spacing w:after="0" w:line="240" w:lineRule="auto"/>
-              <w:jc w:val="left"/>
-              <w:rPr>
-                <w:rFonts w:eastAsia="Times New Roman" w:cs="Times New Roman"/>
-                <w:color w:val="000000"/>
-                <w:sz w:val="20"/>
-                <w:szCs w:val="20"/>
-                <w:lang w:val="en-GB" w:eastAsia="sl-SI"/>
-              </w:rPr>
-            </w:pPr>
-            <w:r>
-              <w:rPr>
-                <w:rFonts w:eastAsia="Times New Roman" w:cs="Times New Roman"/>
-                <w:color w:val="000000"/>
-                <w:sz w:val="20"/>
-                <w:szCs w:val="20"/>
-                <w:lang w:val="en-GB" w:eastAsia="sl-SI"/>
-              </w:rPr>
-              <w:t> </w:t>
-            </w:r>
-          </w:p>
-        </w:tc>
-      </w:tr>
-      <w:tr>
-        <w:trPr>
-          <w:trHeight w:val="1050"/>
-        </w:trPr>
-        <w:tc>
-          <w:tcPr>
-            <w:tcW w:w="2040" w:type="dxa"/>
-            <w:tcBorders>
-              <w:top w:val="nil"/>
-              <w:left w:val="single" w:sz="4" w:space="0" w:color="auto"/>
-              <w:bottom w:val="single" w:sz="4" w:space="0" w:color="auto"/>
-              <w:right w:val="single" w:sz="4" w:space="0" w:color="auto"/>
-            </w:tcBorders>
-            <w:vAlign w:val="bottom"/>
-            <w:hideMark/>
-          </w:tcPr>
-          <w:p>
-            <w:pPr>
-              <w:spacing w:after="0" w:line="240" w:lineRule="auto"/>
-              <w:jc w:val="left"/>
-              <w:rPr>
-                <w:rFonts w:eastAsia="Times New Roman" w:cs="Times New Roman"/>
-                <w:color w:val="000000"/>
-                <w:sz w:val="20"/>
-                <w:szCs w:val="20"/>
-                <w:lang w:val="en-GB" w:eastAsia="sl-SI"/>
-              </w:rPr>
-            </w:pPr>
-            <w:r>
-              <w:rPr>
-                <w:rFonts w:eastAsia="Times New Roman" w:cs="Times New Roman"/>
-                <w:color w:val="000000"/>
-                <w:sz w:val="20"/>
-                <w:szCs w:val="20"/>
-                <w:lang w:val="en-GB" w:eastAsia="sl-SI"/>
-              </w:rPr>
-              <w:t>OTUs with less than reads removed</w:t>
-            </w:r>
-          </w:p>
-        </w:tc>
-        <w:tc>
-          <w:tcPr>
-            <w:tcW w:w="2040" w:type="dxa"/>
-            <w:tcBorders>
-              <w:top w:val="nil"/>
-              <w:left w:val="nil"/>
-              <w:bottom w:val="single" w:sz="4" w:space="0" w:color="auto"/>
-              <w:right w:val="single" w:sz="4" w:space="0" w:color="auto"/>
-            </w:tcBorders>
-            <w:vAlign w:val="bottom"/>
-            <w:hideMark/>
-          </w:tcPr>
-          <w:p>
-            <w:pPr>
-              <w:spacing w:after="0" w:line="240" w:lineRule="auto"/>
-              <w:jc w:val="left"/>
-              <w:rPr>
-                <w:rFonts w:eastAsia="Times New Roman" w:cs="Times New Roman"/>
-                <w:color w:val="000000"/>
-                <w:sz w:val="20"/>
-                <w:szCs w:val="20"/>
-                <w:lang w:val="en-GB" w:eastAsia="sl-SI"/>
-              </w:rPr>
-            </w:pPr>
-            <w:r>
-              <w:rPr>
-                <w:rFonts w:eastAsia="Times New Roman" w:cs="Times New Roman"/>
-                <w:color w:val="000000"/>
-                <w:sz w:val="20"/>
-                <w:szCs w:val="20"/>
-                <w:lang w:val="en-GB" w:eastAsia="sl-SI"/>
-              </w:rPr>
-              <w:t xml:space="preserve">10 or less reads </w:t>
-            </w:r>
-          </w:p>
-        </w:tc>
-        <w:tc>
-          <w:tcPr>
-            <w:tcW w:w="2040" w:type="dxa"/>
-            <w:tcBorders>
-              <w:top w:val="nil"/>
-              <w:left w:val="nil"/>
-              <w:bottom w:val="single" w:sz="4" w:space="0" w:color="auto"/>
-              <w:right w:val="single" w:sz="4" w:space="0" w:color="auto"/>
-            </w:tcBorders>
-            <w:vAlign w:val="bottom"/>
-            <w:hideMark/>
-          </w:tcPr>
-          <w:p>
-            <w:pPr>
-              <w:spacing w:after="0" w:line="240" w:lineRule="auto"/>
-              <w:jc w:val="left"/>
-              <w:rPr>
-                <w:rFonts w:eastAsia="Times New Roman" w:cs="Times New Roman"/>
-                <w:color w:val="000000"/>
-                <w:sz w:val="20"/>
-                <w:szCs w:val="20"/>
-                <w:lang w:val="en-GB" w:eastAsia="sl-SI"/>
-              </w:rPr>
-            </w:pPr>
-            <w:r>
-              <w:rPr>
-                <w:rFonts w:eastAsia="Times New Roman" w:cs="Times New Roman"/>
-                <w:color w:val="000000"/>
-                <w:sz w:val="20"/>
-                <w:szCs w:val="20"/>
-                <w:lang w:val="en-GB" w:eastAsia="sl-SI"/>
-              </w:rPr>
-              <w:t>10 or less reads removed</w:t>
-            </w:r>
-          </w:p>
-        </w:tc>
-        <w:tc>
-          <w:tcPr>
-            <w:tcW w:w="2040" w:type="dxa"/>
-            <w:tcBorders>
-              <w:top w:val="nil"/>
-              <w:left w:val="nil"/>
-              <w:bottom w:val="single" w:sz="4" w:space="0" w:color="auto"/>
-              <w:right w:val="single" w:sz="4" w:space="0" w:color="auto"/>
-            </w:tcBorders>
-            <w:vAlign w:val="bottom"/>
-            <w:hideMark/>
-          </w:tcPr>
-          <w:p>
-            <w:pPr>
-              <w:spacing w:after="0" w:line="240" w:lineRule="auto"/>
-              <w:jc w:val="left"/>
-              <w:rPr>
-                <w:rFonts w:eastAsia="Times New Roman" w:cs="Times New Roman"/>
-                <w:color w:val="000000"/>
-                <w:sz w:val="20"/>
-                <w:szCs w:val="20"/>
-                <w:lang w:val="en-GB" w:eastAsia="sl-SI"/>
-              </w:rPr>
-            </w:pPr>
-            <w:r>
-              <w:rPr>
-                <w:rFonts w:eastAsia="Times New Roman" w:cs="Times New Roman"/>
-                <w:color w:val="000000"/>
-                <w:sz w:val="20"/>
-                <w:szCs w:val="20"/>
-                <w:lang w:val="en-GB" w:eastAsia="sl-SI"/>
-              </w:rPr>
-              <w:t>62 or less reads removed</w:t>
-            </w:r>
-          </w:p>
-        </w:tc>
-        <w:tc>
-          <w:tcPr>
-            <w:tcW w:w="1900" w:type="dxa"/>
-            <w:tcBorders>
-              <w:top w:val="nil"/>
-              <w:left w:val="nil"/>
-              <w:bottom w:val="single" w:sz="4" w:space="0" w:color="auto"/>
-              <w:right w:val="single" w:sz="4" w:space="0" w:color="auto"/>
-            </w:tcBorders>
-            <w:vAlign w:val="bottom"/>
-            <w:hideMark/>
-          </w:tcPr>
-          <w:p>
-            <w:pPr>
-              <w:spacing w:after="0" w:line="240" w:lineRule="auto"/>
-              <w:jc w:val="left"/>
-              <w:rPr>
-                <w:rFonts w:eastAsia="Times New Roman" w:cs="Times New Roman"/>
-                <w:color w:val="000000"/>
-                <w:sz w:val="20"/>
-                <w:szCs w:val="20"/>
-                <w:lang w:val="en-GB" w:eastAsia="sl-SI"/>
-              </w:rPr>
-            </w:pPr>
-            <w:r>
-              <w:rPr>
-                <w:rFonts w:eastAsia="Times New Roman" w:cs="Times New Roman"/>
-                <w:color w:val="000000"/>
-                <w:sz w:val="20"/>
-                <w:szCs w:val="20"/>
-                <w:lang w:val="en-GB" w:eastAsia="sl-SI"/>
-              </w:rPr>
-              <w:t xml:space="preserve">Percentage of reads remaining after quality filtering (mean/min/max) </w:t>
-            </w:r>
-          </w:p>
-        </w:tc>
-        <w:tc>
-          <w:tcPr>
-            <w:tcW w:w="2040" w:type="dxa"/>
-            <w:tcBorders>
-              <w:top w:val="nil"/>
-              <w:left w:val="nil"/>
-              <w:bottom w:val="single" w:sz="4" w:space="0" w:color="auto"/>
-              <w:right w:val="single" w:sz="4" w:space="0" w:color="auto"/>
-            </w:tcBorders>
-            <w:vAlign w:val="bottom"/>
-            <w:hideMark/>
-          </w:tcPr>
-          <w:p>
-            <w:pPr>
-              <w:spacing w:after="0" w:line="240" w:lineRule="auto"/>
-              <w:jc w:val="left"/>
-              <w:rPr>
-                <w:rFonts w:eastAsia="Times New Roman" w:cs="Times New Roman"/>
-                <w:color w:val="000000"/>
-                <w:sz w:val="20"/>
-                <w:szCs w:val="20"/>
-                <w:lang w:val="en-GB" w:eastAsia="sl-SI"/>
-              </w:rPr>
-            </w:pPr>
-            <w:r>
-              <w:rPr>
-                <w:rFonts w:eastAsia="Times New Roman" w:cs="Times New Roman"/>
-                <w:color w:val="000000"/>
-                <w:sz w:val="20"/>
-                <w:szCs w:val="20"/>
-                <w:lang w:val="en-GB" w:eastAsia="sl-SI"/>
-              </w:rPr>
-              <w:t>98,5 / 88,8 / 99,3</w:t>
-            </w:r>
-          </w:p>
-        </w:tc>
-        <w:tc>
-          <w:tcPr>
-            <w:tcW w:w="2040" w:type="dxa"/>
-            <w:tcBorders>
-              <w:top w:val="nil"/>
-              <w:left w:val="nil"/>
-              <w:bottom w:val="single" w:sz="4" w:space="0" w:color="auto"/>
-              <w:right w:val="single" w:sz="4" w:space="0" w:color="auto"/>
-            </w:tcBorders>
-            <w:noWrap/>
-            <w:vAlign w:val="bottom"/>
-            <w:hideMark/>
-          </w:tcPr>
-          <w:p>
-            <w:pPr>
-              <w:spacing w:after="0" w:line="240" w:lineRule="auto"/>
-              <w:jc w:val="left"/>
-              <w:rPr>
-                <w:rFonts w:eastAsia="Times New Roman" w:cs="Times New Roman"/>
-                <w:color w:val="000000"/>
-                <w:sz w:val="20"/>
-                <w:szCs w:val="20"/>
-                <w:lang w:val="en-GB" w:eastAsia="sl-SI"/>
-              </w:rPr>
-            </w:pPr>
-            <w:r>
-              <w:rPr>
-                <w:rFonts w:eastAsia="Times New Roman" w:cs="Times New Roman"/>
-                <w:color w:val="000000"/>
-                <w:sz w:val="20"/>
-                <w:szCs w:val="20"/>
-                <w:lang w:val="en-GB" w:eastAsia="sl-SI"/>
-              </w:rPr>
-              <w:t>51,2 / 22,9 / 98,3</w:t>
-            </w:r>
-          </w:p>
-        </w:tc>
-      </w:tr>
-      <w:tr>
-        <w:trPr>
-          <w:trHeight w:val="1425"/>
-        </w:trPr>
-        <w:tc>
-          <w:tcPr>
-            <w:tcW w:w="2040" w:type="dxa"/>
-            <w:tcBorders>
-              <w:top w:val="nil"/>
-              <w:left w:val="single" w:sz="4" w:space="0" w:color="auto"/>
-              <w:bottom w:val="single" w:sz="4" w:space="0" w:color="auto"/>
-              <w:right w:val="single" w:sz="4" w:space="0" w:color="auto"/>
-            </w:tcBorders>
-            <w:noWrap/>
-            <w:vAlign w:val="bottom"/>
-            <w:hideMark/>
-          </w:tcPr>
-          <w:p>
-            <w:pPr>
-              <w:spacing w:after="0" w:line="240" w:lineRule="auto"/>
-              <w:jc w:val="left"/>
-              <w:rPr>
-                <w:rFonts w:eastAsia="Times New Roman" w:cs="Times New Roman"/>
-                <w:color w:val="000000"/>
-                <w:sz w:val="20"/>
-                <w:szCs w:val="20"/>
-                <w:lang w:val="en-GB" w:eastAsia="sl-SI"/>
-              </w:rPr>
-            </w:pPr>
-            <w:r>
-              <w:rPr>
-                <w:rFonts w:eastAsia="Times New Roman" w:cs="Times New Roman"/>
-                <w:color w:val="000000"/>
-                <w:sz w:val="20"/>
-                <w:szCs w:val="20"/>
-                <w:lang w:val="en-GB" w:eastAsia="sl-SI"/>
-              </w:rPr>
-              <w:t> </w:t>
-            </w:r>
-          </w:p>
-        </w:tc>
-        <w:tc>
-          <w:tcPr>
-            <w:tcW w:w="2040" w:type="dxa"/>
-            <w:tcBorders>
-              <w:top w:val="nil"/>
-              <w:left w:val="nil"/>
-              <w:bottom w:val="single" w:sz="4" w:space="0" w:color="auto"/>
-              <w:right w:val="single" w:sz="4" w:space="0" w:color="auto"/>
-            </w:tcBorders>
-            <w:noWrap/>
-            <w:vAlign w:val="bottom"/>
-            <w:hideMark/>
-          </w:tcPr>
-          <w:p>
-            <w:pPr>
-              <w:spacing w:after="0" w:line="240" w:lineRule="auto"/>
-              <w:jc w:val="left"/>
-              <w:rPr>
-                <w:rFonts w:eastAsia="Times New Roman" w:cs="Times New Roman"/>
-                <w:color w:val="000000"/>
-                <w:sz w:val="20"/>
-                <w:szCs w:val="20"/>
-                <w:lang w:val="en-GB" w:eastAsia="sl-SI"/>
-              </w:rPr>
-            </w:pPr>
-            <w:r>
-              <w:rPr>
-                <w:rFonts w:eastAsia="Times New Roman" w:cs="Times New Roman"/>
-                <w:color w:val="000000"/>
-                <w:sz w:val="20"/>
-                <w:szCs w:val="20"/>
-                <w:lang w:val="en-GB" w:eastAsia="sl-SI"/>
-              </w:rPr>
-              <w:t> </w:t>
-            </w:r>
-          </w:p>
-        </w:tc>
-        <w:tc>
-          <w:tcPr>
-            <w:tcW w:w="2040" w:type="dxa"/>
-            <w:tcBorders>
-              <w:top w:val="nil"/>
-              <w:left w:val="nil"/>
-              <w:bottom w:val="single" w:sz="4" w:space="0" w:color="auto"/>
-              <w:right w:val="single" w:sz="4" w:space="0" w:color="auto"/>
-            </w:tcBorders>
-            <w:noWrap/>
-            <w:vAlign w:val="bottom"/>
-            <w:hideMark/>
-          </w:tcPr>
-          <w:p>
-            <w:pPr>
-              <w:spacing w:after="0" w:line="240" w:lineRule="auto"/>
-              <w:jc w:val="left"/>
-              <w:rPr>
-                <w:rFonts w:eastAsia="Times New Roman" w:cs="Times New Roman"/>
-                <w:color w:val="000000"/>
-                <w:sz w:val="20"/>
-                <w:szCs w:val="20"/>
-                <w:lang w:val="en-GB" w:eastAsia="sl-SI"/>
-              </w:rPr>
-            </w:pPr>
-            <w:r>
-              <w:rPr>
-                <w:rFonts w:eastAsia="Times New Roman" w:cs="Times New Roman"/>
-                <w:color w:val="000000"/>
-                <w:sz w:val="20"/>
-                <w:szCs w:val="20"/>
-                <w:lang w:val="en-GB" w:eastAsia="sl-SI"/>
-              </w:rPr>
-              <w:t> </w:t>
-            </w:r>
-          </w:p>
-        </w:tc>
-        <w:tc>
-          <w:tcPr>
-            <w:tcW w:w="2040" w:type="dxa"/>
-            <w:tcBorders>
-              <w:top w:val="nil"/>
-              <w:left w:val="nil"/>
-              <w:bottom w:val="single" w:sz="4" w:space="0" w:color="auto"/>
-              <w:right w:val="single" w:sz="4" w:space="0" w:color="auto"/>
-            </w:tcBorders>
-            <w:noWrap/>
-            <w:vAlign w:val="bottom"/>
-            <w:hideMark/>
-          </w:tcPr>
-          <w:p>
-            <w:pPr>
-              <w:spacing w:after="0" w:line="240" w:lineRule="auto"/>
-              <w:jc w:val="left"/>
-              <w:rPr>
-                <w:rFonts w:eastAsia="Times New Roman" w:cs="Times New Roman"/>
-                <w:color w:val="000000"/>
-                <w:sz w:val="20"/>
-                <w:szCs w:val="20"/>
-                <w:lang w:val="en-GB" w:eastAsia="sl-SI"/>
-              </w:rPr>
-            </w:pPr>
-            <w:r>
-              <w:rPr>
-                <w:rFonts w:eastAsia="Times New Roman" w:cs="Times New Roman"/>
-                <w:color w:val="000000"/>
-                <w:sz w:val="20"/>
-                <w:szCs w:val="20"/>
-                <w:lang w:val="en-GB" w:eastAsia="sl-SI"/>
-              </w:rPr>
-              <w:t> </w:t>
-            </w:r>
-          </w:p>
-        </w:tc>
-        <w:tc>
-          <w:tcPr>
-            <w:tcW w:w="1900" w:type="dxa"/>
-            <w:tcBorders>
-              <w:top w:val="nil"/>
-              <w:left w:val="nil"/>
-              <w:bottom w:val="single" w:sz="4" w:space="0" w:color="auto"/>
-              <w:right w:val="single" w:sz="4" w:space="0" w:color="auto"/>
-            </w:tcBorders>
-            <w:vAlign w:val="bottom"/>
-            <w:hideMark/>
-          </w:tcPr>
-          <w:p>
-            <w:pPr>
-              <w:spacing w:after="0" w:line="240" w:lineRule="auto"/>
-              <w:jc w:val="left"/>
-              <w:rPr>
-                <w:rFonts w:eastAsia="Times New Roman" w:cs="Times New Roman"/>
-                <w:color w:val="000000"/>
-                <w:sz w:val="20"/>
-                <w:szCs w:val="20"/>
-                <w:lang w:val="en-GB" w:eastAsia="sl-SI"/>
-              </w:rPr>
-            </w:pPr>
-            <w:r>
-              <w:rPr>
-                <w:rFonts w:eastAsia="Times New Roman" w:cs="Times New Roman"/>
-                <w:color w:val="000000"/>
-                <w:sz w:val="20"/>
-                <w:szCs w:val="20"/>
-                <w:lang w:val="en-GB" w:eastAsia="sl-SI"/>
-              </w:rPr>
-              <w:t>Percentage of reads remaining after removal of human sequences (mean/min/max)</w:t>
-            </w:r>
-          </w:p>
-        </w:tc>
-        <w:tc>
-          <w:tcPr>
-            <w:tcW w:w="2040" w:type="dxa"/>
-            <w:tcBorders>
-              <w:top w:val="nil"/>
-              <w:left w:val="nil"/>
-              <w:bottom w:val="single" w:sz="4" w:space="0" w:color="auto"/>
-              <w:right w:val="single" w:sz="4" w:space="0" w:color="auto"/>
-            </w:tcBorders>
-            <w:vAlign w:val="bottom"/>
-            <w:hideMark/>
-          </w:tcPr>
-          <w:p>
-            <w:pPr>
-              <w:spacing w:after="0" w:line="240" w:lineRule="auto"/>
-              <w:jc w:val="left"/>
-              <w:rPr>
-                <w:rFonts w:eastAsia="Times New Roman" w:cs="Times New Roman"/>
-                <w:color w:val="000000"/>
-                <w:sz w:val="20"/>
-                <w:szCs w:val="20"/>
-                <w:lang w:val="en-GB" w:eastAsia="sl-SI"/>
-              </w:rPr>
-            </w:pPr>
-            <w:r>
-              <w:rPr>
-                <w:rFonts w:eastAsia="Times New Roman" w:cs="Times New Roman"/>
-                <w:color w:val="000000"/>
-                <w:sz w:val="20"/>
-                <w:szCs w:val="20"/>
-                <w:lang w:val="en-GB" w:eastAsia="sl-SI"/>
-              </w:rPr>
-              <w:t>98,5 / 88,8 / 99,3</w:t>
-            </w:r>
-          </w:p>
-        </w:tc>
-        <w:tc>
-          <w:tcPr>
-            <w:tcW w:w="2040" w:type="dxa"/>
-            <w:tcBorders>
-              <w:top w:val="nil"/>
-              <w:left w:val="nil"/>
-              <w:bottom w:val="single" w:sz="4" w:space="0" w:color="auto"/>
-              <w:right w:val="single" w:sz="4" w:space="0" w:color="auto"/>
-            </w:tcBorders>
-            <w:noWrap/>
-            <w:vAlign w:val="bottom"/>
-            <w:hideMark/>
-          </w:tcPr>
-          <w:p>
-            <w:pPr>
-              <w:spacing w:after="0" w:line="240" w:lineRule="auto"/>
-              <w:jc w:val="left"/>
-              <w:rPr>
-                <w:rFonts w:eastAsia="Times New Roman" w:cs="Times New Roman"/>
-                <w:color w:val="000000"/>
-                <w:sz w:val="20"/>
-                <w:szCs w:val="20"/>
-                <w:lang w:val="en-GB" w:eastAsia="sl-SI"/>
-              </w:rPr>
-            </w:pPr>
-            <w:r>
-              <w:rPr>
-                <w:rFonts w:eastAsia="Times New Roman" w:cs="Times New Roman"/>
-                <w:color w:val="000000"/>
-                <w:sz w:val="20"/>
-                <w:szCs w:val="20"/>
-                <w:lang w:val="en-GB" w:eastAsia="sl-SI"/>
-              </w:rPr>
-              <w:t>50,5 / 22,3 / 98,3</w:t>
-            </w:r>
-          </w:p>
-        </w:tc>
-      </w:tr>
-      <w:tr>
-        <w:trPr>
-          <w:trHeight w:val="525"/>
-        </w:trPr>
-        <w:tc>
-          <w:tcPr>
-            <w:tcW w:w="2040" w:type="dxa"/>
-            <w:tcBorders>
-              <w:top w:val="nil"/>
-              <w:left w:val="single" w:sz="4" w:space="0" w:color="auto"/>
-              <w:bottom w:val="single" w:sz="4" w:space="0" w:color="auto"/>
-              <w:right w:val="single" w:sz="4" w:space="0" w:color="auto"/>
-            </w:tcBorders>
-            <w:vAlign w:val="bottom"/>
-            <w:hideMark/>
-          </w:tcPr>
-          <w:p>
-            <w:pPr>
-              <w:spacing w:after="0" w:line="240" w:lineRule="auto"/>
-              <w:jc w:val="left"/>
-              <w:rPr>
-                <w:rFonts w:eastAsia="Times New Roman" w:cs="Times New Roman"/>
-                <w:color w:val="000000"/>
-                <w:sz w:val="20"/>
-                <w:szCs w:val="20"/>
-                <w:lang w:val="en-GB" w:eastAsia="sl-SI"/>
-              </w:rPr>
-            </w:pPr>
-            <w:r>
-              <w:rPr>
-                <w:rFonts w:eastAsia="Times New Roman" w:cs="Times New Roman"/>
-                <w:color w:val="000000"/>
-                <w:sz w:val="20"/>
-                <w:szCs w:val="20"/>
-                <w:lang w:val="en-GB" w:eastAsia="sl-SI"/>
-              </w:rPr>
-              <w:t xml:space="preserve">SRA project number </w:t>
-            </w:r>
-          </w:p>
-        </w:tc>
-        <w:tc>
-          <w:tcPr>
-            <w:tcW w:w="2040" w:type="dxa"/>
-            <w:tcBorders>
-              <w:top w:val="nil"/>
-              <w:left w:val="nil"/>
-              <w:bottom w:val="single" w:sz="4" w:space="0" w:color="auto"/>
-              <w:right w:val="single" w:sz="4" w:space="0" w:color="auto"/>
-            </w:tcBorders>
-            <w:vAlign w:val="bottom"/>
-            <w:hideMark/>
-          </w:tcPr>
-          <w:p>
-            <w:pPr>
-              <w:spacing w:after="0" w:line="240" w:lineRule="auto"/>
-              <w:jc w:val="left"/>
-              <w:rPr>
-                <w:rFonts w:eastAsia="Times New Roman" w:cs="Times New Roman"/>
-                <w:color w:val="000000"/>
-                <w:sz w:val="20"/>
-                <w:szCs w:val="20"/>
-                <w:lang w:val="en-GB" w:eastAsia="sl-SI"/>
-              </w:rPr>
-            </w:pPr>
-            <w:proofErr w:type="spellStart"/>
-            <w:r>
-              <w:rPr>
-                <w:rFonts w:eastAsia="Times New Roman" w:cs="Times New Roman"/>
-                <w:color w:val="000000"/>
-                <w:sz w:val="20"/>
-                <w:szCs w:val="20"/>
-                <w:lang w:val="en-GB" w:eastAsia="sl-SI"/>
-              </w:rPr>
-              <w:t>PRJNA887005</w:t>
-            </w:r>
-            <w:proofErr w:type="spellEnd"/>
-          </w:p>
-        </w:tc>
-        <w:tc>
-          <w:tcPr>
-            <w:tcW w:w="2040" w:type="dxa"/>
-            <w:tcBorders>
-              <w:top w:val="nil"/>
-              <w:left w:val="nil"/>
-              <w:bottom w:val="single" w:sz="4" w:space="0" w:color="auto"/>
-              <w:right w:val="single" w:sz="4" w:space="0" w:color="auto"/>
-            </w:tcBorders>
-            <w:vAlign w:val="bottom"/>
-            <w:hideMark/>
-          </w:tcPr>
-          <w:p>
-            <w:pPr>
-              <w:spacing w:after="0" w:line="240" w:lineRule="auto"/>
-              <w:jc w:val="left"/>
-              <w:rPr>
-                <w:rFonts w:eastAsia="Times New Roman" w:cs="Times New Roman"/>
-                <w:color w:val="000000"/>
-                <w:sz w:val="20"/>
-                <w:szCs w:val="20"/>
-                <w:lang w:val="en-GB" w:eastAsia="sl-SI"/>
-              </w:rPr>
-            </w:pPr>
-            <w:r>
-              <w:rPr>
-                <w:rFonts w:eastAsia="Times New Roman" w:cs="Times New Roman"/>
-                <w:color w:val="000000"/>
-                <w:sz w:val="20"/>
-                <w:szCs w:val="20"/>
-                <w:lang w:val="en-GB" w:eastAsia="sl-SI"/>
-              </w:rPr>
-              <w:t>Data available upon request</w:t>
-            </w:r>
-          </w:p>
-        </w:tc>
-        <w:tc>
-          <w:tcPr>
-            <w:tcW w:w="2040" w:type="dxa"/>
-            <w:tcBorders>
-              <w:top w:val="nil"/>
-              <w:left w:val="nil"/>
-              <w:bottom w:val="single" w:sz="4" w:space="0" w:color="auto"/>
-              <w:right w:val="single" w:sz="4" w:space="0" w:color="auto"/>
-            </w:tcBorders>
-            <w:vAlign w:val="bottom"/>
-            <w:hideMark/>
-          </w:tcPr>
-          <w:p>
-            <w:pPr>
-              <w:spacing w:after="0" w:line="240" w:lineRule="auto"/>
-              <w:jc w:val="left"/>
-              <w:rPr>
-                <w:rFonts w:eastAsia="Times New Roman" w:cs="Times New Roman"/>
-                <w:color w:val="000000"/>
-                <w:sz w:val="20"/>
-                <w:szCs w:val="20"/>
-                <w:lang w:val="en-GB" w:eastAsia="sl-SI"/>
-              </w:rPr>
-            </w:pPr>
-            <w:proofErr w:type="spellStart"/>
-            <w:r>
-              <w:rPr>
-                <w:rFonts w:eastAsia="Times New Roman" w:cs="Times New Roman"/>
-                <w:color w:val="000000"/>
-                <w:sz w:val="20"/>
-                <w:szCs w:val="20"/>
-                <w:lang w:val="en-GB" w:eastAsia="sl-SI"/>
-              </w:rPr>
-              <w:t>PRJNA1124620</w:t>
-            </w:r>
-            <w:proofErr w:type="spellEnd"/>
-            <w:r>
-              <w:rPr>
-                <w:rFonts w:eastAsia="Times New Roman" w:cs="Times New Roman"/>
-                <w:color w:val="000000"/>
-                <w:sz w:val="20"/>
-                <w:szCs w:val="20"/>
-                <w:lang w:val="en-GB" w:eastAsia="sl-SI"/>
-              </w:rPr>
-              <w:t> </w:t>
-            </w:r>
-          </w:p>
-        </w:tc>
-        <w:tc>
-          <w:tcPr>
-            <w:tcW w:w="1900" w:type="dxa"/>
-            <w:tcBorders>
-              <w:top w:val="nil"/>
-              <w:left w:val="nil"/>
-              <w:bottom w:val="single" w:sz="4" w:space="0" w:color="auto"/>
-              <w:right w:val="single" w:sz="4" w:space="0" w:color="auto"/>
-            </w:tcBorders>
-            <w:vAlign w:val="bottom"/>
-            <w:hideMark/>
-          </w:tcPr>
-          <w:p>
-            <w:pPr>
-              <w:spacing w:after="0" w:line="240" w:lineRule="auto"/>
-              <w:jc w:val="left"/>
-              <w:rPr>
-                <w:rFonts w:eastAsia="Times New Roman" w:cs="Times New Roman"/>
-                <w:color w:val="000000"/>
-                <w:sz w:val="20"/>
-                <w:szCs w:val="20"/>
-                <w:lang w:val="en-GB" w:eastAsia="sl-SI"/>
-              </w:rPr>
-            </w:pPr>
-            <w:r>
-              <w:rPr>
-                <w:rFonts w:eastAsia="Times New Roman" w:cs="Times New Roman"/>
-                <w:color w:val="000000"/>
-                <w:sz w:val="20"/>
-                <w:szCs w:val="20"/>
-                <w:lang w:val="en-GB" w:eastAsia="sl-SI"/>
-              </w:rPr>
-              <w:t> </w:t>
-            </w:r>
-          </w:p>
-        </w:tc>
-        <w:tc>
-          <w:tcPr>
-            <w:tcW w:w="4080" w:type="dxa"/>
-            <w:gridSpan w:val="2"/>
-            <w:tcBorders>
-              <w:top w:val="nil"/>
-              <w:left w:val="nil"/>
-              <w:bottom w:val="single" w:sz="4" w:space="0" w:color="auto"/>
-              <w:right w:val="single" w:sz="4" w:space="0" w:color="auto"/>
-            </w:tcBorders>
-            <w:noWrap/>
-            <w:vAlign w:val="bottom"/>
-            <w:hideMark/>
-          </w:tcPr>
-          <w:p>
-            <w:pPr>
-              <w:spacing w:after="0" w:line="240" w:lineRule="auto"/>
-              <w:jc w:val="left"/>
-              <w:rPr>
-                <w:rFonts w:eastAsia="Times New Roman" w:cs="Times New Roman"/>
-                <w:color w:val="000000"/>
-                <w:sz w:val="20"/>
-                <w:szCs w:val="20"/>
-                <w:lang w:val="en-GB" w:eastAsia="sl-SI"/>
-              </w:rPr>
-            </w:pPr>
-            <w:r>
-              <w:rPr>
-                <w:rFonts w:eastAsia="Times New Roman" w:cs="Times New Roman"/>
-                <w:color w:val="000000"/>
-                <w:sz w:val="20"/>
-                <w:szCs w:val="20"/>
-                <w:lang w:val="en-GB" w:eastAsia="sl-SI"/>
-              </w:rPr>
-              <w:t> </w:t>
-            </w:r>
-          </w:p>
-          <w:p>
-            <w:pPr>
-              <w:spacing w:after="0" w:line="240" w:lineRule="auto"/>
-              <w:jc w:val="left"/>
-              <w:rPr>
-                <w:rFonts w:eastAsia="Times New Roman" w:cs="Times New Roman"/>
-                <w:color w:val="000000"/>
-                <w:sz w:val="20"/>
-                <w:szCs w:val="20"/>
-                <w:lang w:val="en-GB" w:eastAsia="sl-SI"/>
-              </w:rPr>
-            </w:pPr>
-            <w:r>
-              <w:rPr>
-                <w:rFonts w:eastAsia="Times New Roman" w:cs="Times New Roman"/>
-                <w:color w:val="000000"/>
-                <w:sz w:val="20"/>
-                <w:szCs w:val="20"/>
-                <w:lang w:val="en-GB" w:eastAsia="sl-SI"/>
-              </w:rPr>
-              <w:t> </w:t>
-            </w:r>
-          </w:p>
-        </w:tc>
-      </w:tr>
-      <w:bookmarkEnd w:id="0"/>
-    </w:tbl>
+    <w:bookmarkEnd w:id="0"/>
     <w:p>
       <w:pPr>
         <w:rPr>
@@ -4961,12 +1790,16 @@
               <w:jc w:val="left"/>
               <w:rPr>
                 <w:rFonts w:eastAsia="Times New Roman" w:cs="Times New Roman"/>
+                <w:i/>
+                <w:iCs/>
                 <w:lang w:val="sl-SI" w:eastAsia="sl-SI"/>
               </w:rPr>
             </w:pPr>
             <w:r>
               <w:rPr>
                 <w:rFonts w:eastAsia="Times New Roman" w:cs="Times New Roman"/>
+                <w:i/>
+                <w:iCs/>
                 <w:lang w:val="sl-SI" w:eastAsia="sl-SI"/>
               </w:rPr>
               <w:t>Bacillota</w:t>
@@ -5158,6 +1991,7 @@
               <w:jc w:val="left"/>
               <w:rPr>
                 <w:rFonts w:eastAsia="Times New Roman" w:cs="Times New Roman"/>
+                <w:i/>
                 <w:lang w:val="sl-SI" w:eastAsia="sl-SI"/>
               </w:rPr>
             </w:pPr>
@@ -5165,6 +1999,7 @@
             <w:r>
               <w:rPr>
                 <w:rFonts w:eastAsia="Times New Roman" w:cs="Times New Roman"/>
+                <w:i/>
                 <w:lang w:val="sl-SI" w:eastAsia="sl-SI"/>
               </w:rPr>
               <w:t>Bacteroidota</w:t>
@@ -5357,6 +2192,8 @@
               <w:jc w:val="left"/>
               <w:rPr>
                 <w:rFonts w:eastAsia="Times New Roman" w:cs="Times New Roman"/>
+                <w:i/>
+                <w:iCs/>
                 <w:lang w:val="sl-SI" w:eastAsia="sl-SI"/>
               </w:rPr>
             </w:pPr>
@@ -5364,6 +2201,8 @@
             <w:r>
               <w:rPr>
                 <w:rFonts w:eastAsia="Times New Roman" w:cs="Times New Roman"/>
+                <w:i/>
+                <w:iCs/>
                 <w:lang w:val="sl-SI" w:eastAsia="sl-SI"/>
               </w:rPr>
               <w:t>Actinomycetota</w:t>
@@ -5556,6 +2395,8 @@
               <w:jc w:val="left"/>
               <w:rPr>
                 <w:rFonts w:eastAsia="Times New Roman" w:cs="Times New Roman"/>
+                <w:i/>
+                <w:iCs/>
                 <w:lang w:val="sl-SI" w:eastAsia="sl-SI"/>
               </w:rPr>
             </w:pPr>
@@ -5563,6 +2404,8 @@
             <w:r>
               <w:rPr>
                 <w:rFonts w:eastAsia="Times New Roman" w:cs="Times New Roman"/>
+                <w:i/>
+                <w:iCs/>
                 <w:lang w:val="sl-SI" w:eastAsia="sl-SI"/>
               </w:rPr>
               <w:t>Pseudomonadota</w:t>
@@ -5755,6 +2598,8 @@
               <w:jc w:val="left"/>
               <w:rPr>
                 <w:rFonts w:eastAsia="Times New Roman" w:cs="Times New Roman"/>
+                <w:i/>
+                <w:iCs/>
                 <w:lang w:val="sl-SI" w:eastAsia="sl-SI"/>
               </w:rPr>
             </w:pPr>
@@ -5762,6 +2607,8 @@
             <w:r>
               <w:rPr>
                 <w:rFonts w:eastAsia="Times New Roman" w:cs="Times New Roman"/>
+                <w:i/>
+                <w:iCs/>
                 <w:lang w:val="sl-SI" w:eastAsia="sl-SI"/>
               </w:rPr>
               <w:t>Verrucomicrobiota</w:t>
@@ -5977,6 +2824,8 @@
             <w:r>
               <w:rPr>
                 <w:rFonts w:eastAsia="Times New Roman" w:cs="Times New Roman"/>
+                <w:i/>
+                <w:iCs/>
                 <w:lang w:val="sl-SI" w:eastAsia="sl-SI"/>
               </w:rPr>
               <w:t>Bacteria</w:t>
@@ -18534,6 +15383,31 @@
     </w:p>
     <w:p>
       <w:pPr>
+        <w:spacing w:line="276" w:lineRule="auto"/>
+        <w:rPr>
+          <w:lang w:val="en-GB"/>
+        </w:rPr>
+      </w:pPr>
+    </w:p>
+    <w:p>
+      <w:pPr>
+        <w:spacing w:line="276" w:lineRule="auto"/>
+        <w:rPr>
+          <w:lang w:val="en-GB"/>
+        </w:rPr>
+      </w:pPr>
+    </w:p>
+    <w:p>
+      <w:pPr>
+        <w:spacing w:line="276" w:lineRule="auto"/>
+        <w:rPr>
+          <w:lang w:val="en-GB"/>
+        </w:rPr>
+      </w:pPr>
+    </w:p>
+    <w:p>
+      <w:pPr>
+        <w:spacing w:line="276" w:lineRule="auto"/>
         <w:rPr>
           <w:lang w:val="en-GB"/>
         </w:rPr>
@@ -18542,14 +15416,1389 @@
         <w:rPr>
           <w:lang w:val="en-GB"/>
         </w:rPr>
-        <w:t xml:space="preserve">Supplement Table 5. Isolated species after ethanol shock from samples from individual H. </w:t>
+        <w:lastRenderedPageBreak/>
+        <w:t xml:space="preserve">Supplement Table </w:t>
       </w:r>
+      <w:r>
+        <w:rPr>
+          <w:lang w:val="en-GB"/>
+        </w:rPr>
+        <w:t>5</w:t>
+      </w:r>
+      <w:r>
+        <w:rPr>
+          <w:lang w:val="en-GB"/>
+        </w:rPr>
+        <w:t>. MALDI-</w:t>
+      </w:r>
+      <w:proofErr w:type="spellStart"/>
+      <w:r>
+        <w:rPr>
+          <w:lang w:val="en-GB"/>
+        </w:rPr>
+        <w:t>TOF</w:t>
+      </w:r>
+      <w:proofErr w:type="spellEnd"/>
+      <w:r>
+        <w:rPr>
+          <w:lang w:val="en-GB"/>
+        </w:rPr>
+        <w:t xml:space="preserve"> results for all isolates from samples </w:t>
+      </w:r>
+      <w:proofErr w:type="spellStart"/>
+      <w:r>
+        <w:rPr>
+          <w:lang w:val="en-GB"/>
+        </w:rPr>
+        <w:t>H005</w:t>
+      </w:r>
+      <w:proofErr w:type="spellEnd"/>
+      <w:r>
+        <w:rPr>
+          <w:lang w:val="en-GB"/>
+        </w:rPr>
+        <w:t xml:space="preserve">, </w:t>
+      </w:r>
+      <w:proofErr w:type="spellStart"/>
+      <w:r>
+        <w:rPr>
+          <w:lang w:val="en-GB"/>
+        </w:rPr>
+        <w:t>H007</w:t>
+      </w:r>
+      <w:proofErr w:type="spellEnd"/>
+      <w:r>
+        <w:rPr>
+          <w:lang w:val="en-GB"/>
+        </w:rPr>
+        <w:t xml:space="preserve"> and </w:t>
+      </w:r>
+      <w:proofErr w:type="spellStart"/>
+      <w:r>
+        <w:rPr>
+          <w:lang w:val="en-GB"/>
+        </w:rPr>
+        <w:t>H009</w:t>
+      </w:r>
+      <w:proofErr w:type="spellEnd"/>
+      <w:r>
+        <w:rPr>
+          <w:lang w:val="en-GB"/>
+        </w:rPr>
+        <w:t xml:space="preserve">. The smaller number of isolates that were sequenced was due to second re-streaking not being as successful. </w:t>
+      </w:r>
+    </w:p>
+    <w:tbl>
+      <w:tblPr>
+        <w:tblW w:w="8060" w:type="dxa"/>
+        <w:tblCellMar>
+          <w:left w:w="70" w:type="dxa"/>
+          <w:right w:w="70" w:type="dxa"/>
+        </w:tblCellMar>
+        <w:tblLook w:val="04A0" w:firstRow="1" w:lastRow="0" w:firstColumn="1" w:lastColumn="0" w:noHBand="0" w:noVBand="1"/>
+      </w:tblPr>
+      <w:tblGrid>
+        <w:gridCol w:w="3940"/>
+        <w:gridCol w:w="1240"/>
+        <w:gridCol w:w="960"/>
+        <w:gridCol w:w="960"/>
+        <w:gridCol w:w="960"/>
+      </w:tblGrid>
+      <w:tr>
+        <w:trPr>
+          <w:trHeight w:val="300"/>
+        </w:trPr>
+        <w:tc>
+          <w:tcPr>
+            <w:tcW w:w="3940" w:type="dxa"/>
+            <w:tcBorders>
+              <w:top w:val="single" w:sz="4" w:space="0" w:color="auto"/>
+              <w:left w:val="nil"/>
+              <w:bottom w:val="single" w:sz="4" w:space="0" w:color="auto"/>
+              <w:right w:val="nil"/>
+            </w:tcBorders>
+            <w:shd w:val="clear" w:color="auto" w:fill="auto"/>
+            <w:noWrap/>
+            <w:vAlign w:val="bottom"/>
+            <w:hideMark/>
+          </w:tcPr>
+          <w:p>
+            <w:pPr>
+              <w:spacing w:after="0" w:line="240" w:lineRule="auto"/>
+              <w:jc w:val="left"/>
+              <w:rPr>
+                <w:rFonts w:ascii="Aptos Narrow" w:eastAsia="Times New Roman" w:hAnsi="Aptos Narrow" w:cs="Times New Roman"/>
+                <w:color w:val="000000"/>
+                <w:lang w:val="sl-SI" w:eastAsia="sl-SI"/>
+              </w:rPr>
+            </w:pPr>
+            <w:proofErr w:type="spellStart"/>
+            <w:r>
+              <w:rPr>
+                <w:rFonts w:ascii="Aptos Narrow" w:eastAsia="Times New Roman" w:hAnsi="Aptos Narrow" w:cs="Times New Roman"/>
+                <w:color w:val="000000"/>
+                <w:lang w:val="sl-SI" w:eastAsia="sl-SI"/>
+              </w:rPr>
+              <w:t>Detected</w:t>
+            </w:r>
+            <w:proofErr w:type="spellEnd"/>
+            <w:r>
+              <w:rPr>
+                <w:rFonts w:ascii="Aptos Narrow" w:eastAsia="Times New Roman" w:hAnsi="Aptos Narrow" w:cs="Times New Roman"/>
+                <w:color w:val="000000"/>
+                <w:lang w:val="sl-SI" w:eastAsia="sl-SI"/>
+              </w:rPr>
+              <w:t xml:space="preserve"> </w:t>
+            </w:r>
+            <w:proofErr w:type="spellStart"/>
+            <w:r>
+              <w:rPr>
+                <w:rFonts w:ascii="Aptos Narrow" w:eastAsia="Times New Roman" w:hAnsi="Aptos Narrow" w:cs="Times New Roman"/>
+                <w:color w:val="000000"/>
+                <w:lang w:val="sl-SI" w:eastAsia="sl-SI"/>
+              </w:rPr>
+              <w:t>species</w:t>
+            </w:r>
+            <w:proofErr w:type="spellEnd"/>
+            <w:r>
+              <w:rPr>
+                <w:rFonts w:ascii="Aptos Narrow" w:eastAsia="Times New Roman" w:hAnsi="Aptos Narrow" w:cs="Times New Roman"/>
+                <w:color w:val="000000"/>
+                <w:lang w:val="sl-SI" w:eastAsia="sl-SI"/>
+              </w:rPr>
+              <w:t xml:space="preserve"> </w:t>
+            </w:r>
+          </w:p>
+        </w:tc>
+        <w:tc>
+          <w:tcPr>
+            <w:tcW w:w="1240" w:type="dxa"/>
+            <w:tcBorders>
+              <w:top w:val="single" w:sz="4" w:space="0" w:color="auto"/>
+              <w:left w:val="nil"/>
+              <w:bottom w:val="single" w:sz="4" w:space="0" w:color="auto"/>
+              <w:right w:val="nil"/>
+            </w:tcBorders>
+            <w:shd w:val="clear" w:color="auto" w:fill="auto"/>
+            <w:noWrap/>
+            <w:vAlign w:val="bottom"/>
+            <w:hideMark/>
+          </w:tcPr>
+          <w:p>
+            <w:pPr>
+              <w:spacing w:after="0" w:line="240" w:lineRule="auto"/>
+              <w:jc w:val="left"/>
+              <w:rPr>
+                <w:rFonts w:ascii="Aptos Narrow" w:eastAsia="Times New Roman" w:hAnsi="Aptos Narrow" w:cs="Times New Roman"/>
+                <w:color w:val="000000"/>
+                <w:lang w:val="sl-SI" w:eastAsia="sl-SI"/>
+              </w:rPr>
+            </w:pPr>
+            <w:proofErr w:type="spellStart"/>
+            <w:r>
+              <w:rPr>
+                <w:rFonts w:ascii="Aptos Narrow" w:eastAsia="Times New Roman" w:hAnsi="Aptos Narrow" w:cs="Times New Roman"/>
+                <w:color w:val="000000"/>
+                <w:lang w:val="sl-SI" w:eastAsia="sl-SI"/>
+              </w:rPr>
+              <w:t>All</w:t>
+            </w:r>
+            <w:proofErr w:type="spellEnd"/>
+            <w:r>
+              <w:rPr>
+                <w:rFonts w:ascii="Aptos Narrow" w:eastAsia="Times New Roman" w:hAnsi="Aptos Narrow" w:cs="Times New Roman"/>
+                <w:color w:val="000000"/>
+                <w:lang w:val="sl-SI" w:eastAsia="sl-SI"/>
+              </w:rPr>
+              <w:t xml:space="preserve"> </w:t>
+            </w:r>
+            <w:proofErr w:type="spellStart"/>
+            <w:r>
+              <w:rPr>
+                <w:rFonts w:ascii="Aptos Narrow" w:eastAsia="Times New Roman" w:hAnsi="Aptos Narrow" w:cs="Times New Roman"/>
+                <w:color w:val="000000"/>
+                <w:lang w:val="sl-SI" w:eastAsia="sl-SI"/>
+              </w:rPr>
+              <w:t>samples</w:t>
+            </w:r>
+            <w:proofErr w:type="spellEnd"/>
+            <w:r>
+              <w:rPr>
+                <w:rFonts w:ascii="Aptos Narrow" w:eastAsia="Times New Roman" w:hAnsi="Aptos Narrow" w:cs="Times New Roman"/>
+                <w:color w:val="000000"/>
+                <w:lang w:val="sl-SI" w:eastAsia="sl-SI"/>
+              </w:rPr>
+              <w:t xml:space="preserve"> </w:t>
+            </w:r>
+          </w:p>
+        </w:tc>
+        <w:tc>
+          <w:tcPr>
+            <w:tcW w:w="960" w:type="dxa"/>
+            <w:tcBorders>
+              <w:top w:val="single" w:sz="4" w:space="0" w:color="auto"/>
+              <w:left w:val="nil"/>
+              <w:bottom w:val="single" w:sz="4" w:space="0" w:color="auto"/>
+              <w:right w:val="nil"/>
+            </w:tcBorders>
+            <w:shd w:val="clear" w:color="auto" w:fill="auto"/>
+            <w:noWrap/>
+            <w:vAlign w:val="bottom"/>
+            <w:hideMark/>
+          </w:tcPr>
+          <w:p>
+            <w:pPr>
+              <w:spacing w:after="0" w:line="240" w:lineRule="auto"/>
+              <w:jc w:val="left"/>
+              <w:rPr>
+                <w:rFonts w:ascii="Aptos Narrow" w:eastAsia="Times New Roman" w:hAnsi="Aptos Narrow" w:cs="Times New Roman"/>
+                <w:color w:val="000000"/>
+                <w:lang w:val="sl-SI" w:eastAsia="sl-SI"/>
+              </w:rPr>
+            </w:pPr>
+            <w:proofErr w:type="spellStart"/>
+            <w:r>
+              <w:rPr>
+                <w:rFonts w:ascii="Aptos Narrow" w:eastAsia="Times New Roman" w:hAnsi="Aptos Narrow" w:cs="Times New Roman"/>
+                <w:color w:val="000000"/>
+                <w:lang w:val="sl-SI" w:eastAsia="sl-SI"/>
+              </w:rPr>
+              <w:t>H005</w:t>
+            </w:r>
+            <w:proofErr w:type="spellEnd"/>
+          </w:p>
+        </w:tc>
+        <w:tc>
+          <w:tcPr>
+            <w:tcW w:w="960" w:type="dxa"/>
+            <w:tcBorders>
+              <w:top w:val="single" w:sz="4" w:space="0" w:color="auto"/>
+              <w:left w:val="nil"/>
+              <w:bottom w:val="single" w:sz="4" w:space="0" w:color="auto"/>
+              <w:right w:val="nil"/>
+            </w:tcBorders>
+            <w:shd w:val="clear" w:color="auto" w:fill="auto"/>
+            <w:noWrap/>
+            <w:vAlign w:val="bottom"/>
+            <w:hideMark/>
+          </w:tcPr>
+          <w:p>
+            <w:pPr>
+              <w:spacing w:after="0" w:line="240" w:lineRule="auto"/>
+              <w:jc w:val="left"/>
+              <w:rPr>
+                <w:rFonts w:ascii="Aptos Narrow" w:eastAsia="Times New Roman" w:hAnsi="Aptos Narrow" w:cs="Times New Roman"/>
+                <w:color w:val="000000"/>
+                <w:lang w:val="sl-SI" w:eastAsia="sl-SI"/>
+              </w:rPr>
+            </w:pPr>
+            <w:proofErr w:type="spellStart"/>
+            <w:r>
+              <w:rPr>
+                <w:rFonts w:ascii="Aptos Narrow" w:eastAsia="Times New Roman" w:hAnsi="Aptos Narrow" w:cs="Times New Roman"/>
+                <w:color w:val="000000"/>
+                <w:lang w:val="sl-SI" w:eastAsia="sl-SI"/>
+              </w:rPr>
+              <w:t>H007</w:t>
+            </w:r>
+            <w:proofErr w:type="spellEnd"/>
+          </w:p>
+        </w:tc>
+        <w:tc>
+          <w:tcPr>
+            <w:tcW w:w="960" w:type="dxa"/>
+            <w:tcBorders>
+              <w:top w:val="single" w:sz="4" w:space="0" w:color="auto"/>
+              <w:left w:val="nil"/>
+              <w:bottom w:val="single" w:sz="4" w:space="0" w:color="auto"/>
+              <w:right w:val="nil"/>
+            </w:tcBorders>
+            <w:shd w:val="clear" w:color="auto" w:fill="auto"/>
+            <w:noWrap/>
+            <w:vAlign w:val="bottom"/>
+            <w:hideMark/>
+          </w:tcPr>
+          <w:p>
+            <w:pPr>
+              <w:spacing w:after="0" w:line="240" w:lineRule="auto"/>
+              <w:jc w:val="left"/>
+              <w:rPr>
+                <w:rFonts w:ascii="Aptos Narrow" w:eastAsia="Times New Roman" w:hAnsi="Aptos Narrow" w:cs="Times New Roman"/>
+                <w:color w:val="000000"/>
+                <w:lang w:val="sl-SI" w:eastAsia="sl-SI"/>
+              </w:rPr>
+            </w:pPr>
+            <w:proofErr w:type="spellStart"/>
+            <w:r>
+              <w:rPr>
+                <w:rFonts w:ascii="Aptos Narrow" w:eastAsia="Times New Roman" w:hAnsi="Aptos Narrow" w:cs="Times New Roman"/>
+                <w:color w:val="000000"/>
+                <w:lang w:val="sl-SI" w:eastAsia="sl-SI"/>
+              </w:rPr>
+              <w:t>H009</w:t>
+            </w:r>
+            <w:proofErr w:type="spellEnd"/>
+            <w:r>
+              <w:rPr>
+                <w:rFonts w:ascii="Aptos Narrow" w:eastAsia="Times New Roman" w:hAnsi="Aptos Narrow" w:cs="Times New Roman"/>
+                <w:color w:val="000000"/>
+                <w:lang w:val="sl-SI" w:eastAsia="sl-SI"/>
+              </w:rPr>
+              <w:t xml:space="preserve"> </w:t>
+            </w:r>
+          </w:p>
+        </w:tc>
+      </w:tr>
+      <w:tr>
+        <w:trPr>
+          <w:trHeight w:val="300"/>
+        </w:trPr>
+        <w:tc>
+          <w:tcPr>
+            <w:tcW w:w="3940" w:type="dxa"/>
+            <w:tcBorders>
+              <w:top w:val="nil"/>
+              <w:left w:val="nil"/>
+              <w:bottom w:val="nil"/>
+              <w:right w:val="nil"/>
+            </w:tcBorders>
+            <w:shd w:val="clear" w:color="auto" w:fill="auto"/>
+            <w:noWrap/>
+            <w:vAlign w:val="bottom"/>
+            <w:hideMark/>
+          </w:tcPr>
+          <w:p>
+            <w:pPr>
+              <w:spacing w:after="0" w:line="240" w:lineRule="auto"/>
+              <w:jc w:val="left"/>
+              <w:rPr>
+                <w:rFonts w:ascii="Aptos Narrow" w:eastAsia="Times New Roman" w:hAnsi="Aptos Narrow" w:cs="Times New Roman"/>
+                <w:i/>
+                <w:iCs/>
+                <w:color w:val="000000"/>
+                <w:lang w:val="sl-SI" w:eastAsia="sl-SI"/>
+              </w:rPr>
+            </w:pPr>
+            <w:proofErr w:type="spellStart"/>
+            <w:r>
+              <w:rPr>
+                <w:rFonts w:ascii="Aptos Narrow" w:eastAsia="Times New Roman" w:hAnsi="Aptos Narrow" w:cs="Times New Roman"/>
+                <w:i/>
+                <w:iCs/>
+                <w:color w:val="000000"/>
+                <w:lang w:val="sl-SI" w:eastAsia="sl-SI"/>
+              </w:rPr>
+              <w:t>Clostridium</w:t>
+            </w:r>
+            <w:proofErr w:type="spellEnd"/>
+            <w:r>
+              <w:rPr>
+                <w:rFonts w:ascii="Aptos Narrow" w:eastAsia="Times New Roman" w:hAnsi="Aptos Narrow" w:cs="Times New Roman"/>
+                <w:i/>
+                <w:iCs/>
+                <w:color w:val="000000"/>
+                <w:lang w:val="sl-SI" w:eastAsia="sl-SI"/>
+              </w:rPr>
+              <w:t xml:space="preserve"> </w:t>
+            </w:r>
+            <w:proofErr w:type="spellStart"/>
+            <w:r>
+              <w:rPr>
+                <w:rFonts w:ascii="Aptos Narrow" w:eastAsia="Times New Roman" w:hAnsi="Aptos Narrow" w:cs="Times New Roman"/>
+                <w:i/>
+                <w:iCs/>
+                <w:color w:val="000000"/>
+                <w:lang w:val="sl-SI" w:eastAsia="sl-SI"/>
+              </w:rPr>
+              <w:t>paraputrificum</w:t>
+            </w:r>
+            <w:proofErr w:type="spellEnd"/>
+          </w:p>
+        </w:tc>
+        <w:tc>
+          <w:tcPr>
+            <w:tcW w:w="1240" w:type="dxa"/>
+            <w:tcBorders>
+              <w:top w:val="nil"/>
+              <w:left w:val="nil"/>
+              <w:bottom w:val="nil"/>
+              <w:right w:val="nil"/>
+            </w:tcBorders>
+            <w:shd w:val="clear" w:color="auto" w:fill="auto"/>
+            <w:noWrap/>
+            <w:vAlign w:val="bottom"/>
+            <w:hideMark/>
+          </w:tcPr>
+          <w:p>
+            <w:pPr>
+              <w:spacing w:after="0" w:line="240" w:lineRule="auto"/>
+              <w:jc w:val="left"/>
+              <w:rPr>
+                <w:rFonts w:ascii="Aptos Narrow" w:eastAsia="Times New Roman" w:hAnsi="Aptos Narrow" w:cs="Times New Roman"/>
+                <w:color w:val="000000"/>
+                <w:lang w:val="sl-SI" w:eastAsia="sl-SI"/>
+              </w:rPr>
+            </w:pPr>
+            <w:r>
+              <w:rPr>
+                <w:rFonts w:ascii="Aptos Narrow" w:eastAsia="Times New Roman" w:hAnsi="Aptos Narrow" w:cs="Times New Roman"/>
+                <w:color w:val="000000"/>
+                <w:lang w:val="sl-SI" w:eastAsia="sl-SI"/>
+              </w:rPr>
+              <w:t>24</w:t>
+            </w:r>
+          </w:p>
+        </w:tc>
+        <w:tc>
+          <w:tcPr>
+            <w:tcW w:w="960" w:type="dxa"/>
+            <w:tcBorders>
+              <w:top w:val="nil"/>
+              <w:left w:val="nil"/>
+              <w:bottom w:val="nil"/>
+              <w:right w:val="nil"/>
+            </w:tcBorders>
+            <w:shd w:val="clear" w:color="auto" w:fill="auto"/>
+            <w:noWrap/>
+            <w:vAlign w:val="bottom"/>
+            <w:hideMark/>
+          </w:tcPr>
+          <w:p>
+            <w:pPr>
+              <w:spacing w:after="0" w:line="240" w:lineRule="auto"/>
+              <w:jc w:val="left"/>
+              <w:rPr>
+                <w:rFonts w:ascii="Aptos Narrow" w:eastAsia="Times New Roman" w:hAnsi="Aptos Narrow" w:cs="Times New Roman"/>
+                <w:color w:val="000000"/>
+                <w:lang w:val="sl-SI" w:eastAsia="sl-SI"/>
+              </w:rPr>
+            </w:pPr>
+            <w:r>
+              <w:rPr>
+                <w:rFonts w:ascii="Aptos Narrow" w:eastAsia="Times New Roman" w:hAnsi="Aptos Narrow" w:cs="Times New Roman"/>
+                <w:color w:val="000000"/>
+                <w:lang w:val="sl-SI" w:eastAsia="sl-SI"/>
+              </w:rPr>
+              <w:t>23</w:t>
+            </w:r>
+          </w:p>
+        </w:tc>
+        <w:tc>
+          <w:tcPr>
+            <w:tcW w:w="960" w:type="dxa"/>
+            <w:tcBorders>
+              <w:top w:val="nil"/>
+              <w:left w:val="nil"/>
+              <w:bottom w:val="nil"/>
+              <w:right w:val="nil"/>
+            </w:tcBorders>
+            <w:shd w:val="clear" w:color="auto" w:fill="auto"/>
+            <w:noWrap/>
+            <w:vAlign w:val="bottom"/>
+            <w:hideMark/>
+          </w:tcPr>
+          <w:p>
+            <w:pPr>
+              <w:spacing w:after="0" w:line="240" w:lineRule="auto"/>
+              <w:jc w:val="left"/>
+              <w:rPr>
+                <w:rFonts w:ascii="Aptos Narrow" w:eastAsia="Times New Roman" w:hAnsi="Aptos Narrow" w:cs="Times New Roman"/>
+                <w:color w:val="000000"/>
+                <w:lang w:val="sl-SI" w:eastAsia="sl-SI"/>
+              </w:rPr>
+            </w:pPr>
+            <w:r>
+              <w:rPr>
+                <w:rFonts w:ascii="Aptos Narrow" w:eastAsia="Times New Roman" w:hAnsi="Aptos Narrow" w:cs="Times New Roman"/>
+                <w:color w:val="000000"/>
+                <w:lang w:val="sl-SI" w:eastAsia="sl-SI"/>
+              </w:rPr>
+              <w:t>0</w:t>
+            </w:r>
+          </w:p>
+        </w:tc>
+        <w:tc>
+          <w:tcPr>
+            <w:tcW w:w="960" w:type="dxa"/>
+            <w:tcBorders>
+              <w:top w:val="nil"/>
+              <w:left w:val="nil"/>
+              <w:bottom w:val="nil"/>
+              <w:right w:val="nil"/>
+            </w:tcBorders>
+            <w:shd w:val="clear" w:color="auto" w:fill="auto"/>
+            <w:noWrap/>
+            <w:vAlign w:val="bottom"/>
+            <w:hideMark/>
+          </w:tcPr>
+          <w:p>
+            <w:pPr>
+              <w:spacing w:after="0" w:line="240" w:lineRule="auto"/>
+              <w:jc w:val="left"/>
+              <w:rPr>
+                <w:rFonts w:ascii="Aptos Narrow" w:eastAsia="Times New Roman" w:hAnsi="Aptos Narrow" w:cs="Times New Roman"/>
+                <w:color w:val="000000"/>
+                <w:lang w:val="sl-SI" w:eastAsia="sl-SI"/>
+              </w:rPr>
+            </w:pPr>
+            <w:r>
+              <w:rPr>
+                <w:rFonts w:ascii="Aptos Narrow" w:eastAsia="Times New Roman" w:hAnsi="Aptos Narrow" w:cs="Times New Roman"/>
+                <w:color w:val="000000"/>
+                <w:lang w:val="sl-SI" w:eastAsia="sl-SI"/>
+              </w:rPr>
+              <w:t>1</w:t>
+            </w:r>
+          </w:p>
+        </w:tc>
+      </w:tr>
+      <w:tr>
+        <w:trPr>
+          <w:trHeight w:val="300"/>
+        </w:trPr>
+        <w:tc>
+          <w:tcPr>
+            <w:tcW w:w="3940" w:type="dxa"/>
+            <w:tcBorders>
+              <w:top w:val="nil"/>
+              <w:left w:val="nil"/>
+              <w:bottom w:val="nil"/>
+              <w:right w:val="nil"/>
+            </w:tcBorders>
+            <w:shd w:val="clear" w:color="auto" w:fill="auto"/>
+            <w:noWrap/>
+            <w:vAlign w:val="bottom"/>
+            <w:hideMark/>
+          </w:tcPr>
+          <w:p>
+            <w:pPr>
+              <w:spacing w:after="0" w:line="240" w:lineRule="auto"/>
+              <w:jc w:val="left"/>
+              <w:rPr>
+                <w:rFonts w:ascii="Aptos Narrow" w:eastAsia="Times New Roman" w:hAnsi="Aptos Narrow" w:cs="Times New Roman"/>
+                <w:i/>
+                <w:iCs/>
+                <w:color w:val="000000"/>
+                <w:lang w:val="sl-SI" w:eastAsia="sl-SI"/>
+              </w:rPr>
+            </w:pPr>
+            <w:proofErr w:type="spellStart"/>
+            <w:r>
+              <w:rPr>
+                <w:rFonts w:ascii="Aptos Narrow" w:eastAsia="Times New Roman" w:hAnsi="Aptos Narrow" w:cs="Times New Roman"/>
+                <w:i/>
+                <w:iCs/>
+                <w:color w:val="000000"/>
+                <w:lang w:val="sl-SI" w:eastAsia="sl-SI"/>
+              </w:rPr>
+              <w:t>Intestinibacter</w:t>
+            </w:r>
+            <w:proofErr w:type="spellEnd"/>
+            <w:r>
+              <w:rPr>
+                <w:rFonts w:ascii="Aptos Narrow" w:eastAsia="Times New Roman" w:hAnsi="Aptos Narrow" w:cs="Times New Roman"/>
+                <w:i/>
+                <w:iCs/>
+                <w:color w:val="000000"/>
+                <w:lang w:val="sl-SI" w:eastAsia="sl-SI"/>
+              </w:rPr>
+              <w:t xml:space="preserve"> </w:t>
+            </w:r>
+            <w:proofErr w:type="spellStart"/>
+            <w:r>
+              <w:rPr>
+                <w:rFonts w:ascii="Aptos Narrow" w:eastAsia="Times New Roman" w:hAnsi="Aptos Narrow" w:cs="Times New Roman"/>
+                <w:i/>
+                <w:iCs/>
+                <w:color w:val="000000"/>
+                <w:lang w:val="sl-SI" w:eastAsia="sl-SI"/>
+              </w:rPr>
+              <w:t>bartletti</w:t>
+            </w:r>
+            <w:proofErr w:type="spellEnd"/>
+          </w:p>
+        </w:tc>
+        <w:tc>
+          <w:tcPr>
+            <w:tcW w:w="1240" w:type="dxa"/>
+            <w:tcBorders>
+              <w:top w:val="nil"/>
+              <w:left w:val="nil"/>
+              <w:bottom w:val="nil"/>
+              <w:right w:val="nil"/>
+            </w:tcBorders>
+            <w:shd w:val="clear" w:color="auto" w:fill="auto"/>
+            <w:noWrap/>
+            <w:vAlign w:val="bottom"/>
+            <w:hideMark/>
+          </w:tcPr>
+          <w:p>
+            <w:pPr>
+              <w:spacing w:after="0" w:line="240" w:lineRule="auto"/>
+              <w:jc w:val="left"/>
+              <w:rPr>
+                <w:rFonts w:ascii="Aptos Narrow" w:eastAsia="Times New Roman" w:hAnsi="Aptos Narrow" w:cs="Times New Roman"/>
+                <w:color w:val="000000"/>
+                <w:lang w:val="sl-SI" w:eastAsia="sl-SI"/>
+              </w:rPr>
+            </w:pPr>
+            <w:r>
+              <w:rPr>
+                <w:rFonts w:ascii="Aptos Narrow" w:eastAsia="Times New Roman" w:hAnsi="Aptos Narrow" w:cs="Times New Roman"/>
+                <w:color w:val="000000"/>
+                <w:lang w:val="sl-SI" w:eastAsia="sl-SI"/>
+              </w:rPr>
+              <w:t>11</w:t>
+            </w:r>
+          </w:p>
+        </w:tc>
+        <w:tc>
+          <w:tcPr>
+            <w:tcW w:w="960" w:type="dxa"/>
+            <w:tcBorders>
+              <w:top w:val="nil"/>
+              <w:left w:val="nil"/>
+              <w:bottom w:val="nil"/>
+              <w:right w:val="nil"/>
+            </w:tcBorders>
+            <w:shd w:val="clear" w:color="auto" w:fill="auto"/>
+            <w:noWrap/>
+            <w:vAlign w:val="bottom"/>
+            <w:hideMark/>
+          </w:tcPr>
+          <w:p>
+            <w:pPr>
+              <w:spacing w:after="0" w:line="240" w:lineRule="auto"/>
+              <w:jc w:val="left"/>
+              <w:rPr>
+                <w:rFonts w:ascii="Aptos Narrow" w:eastAsia="Times New Roman" w:hAnsi="Aptos Narrow" w:cs="Times New Roman"/>
+                <w:color w:val="000000"/>
+                <w:lang w:val="sl-SI" w:eastAsia="sl-SI"/>
+              </w:rPr>
+            </w:pPr>
+            <w:r>
+              <w:rPr>
+                <w:rFonts w:ascii="Aptos Narrow" w:eastAsia="Times New Roman" w:hAnsi="Aptos Narrow" w:cs="Times New Roman"/>
+                <w:color w:val="000000"/>
+                <w:lang w:val="sl-SI" w:eastAsia="sl-SI"/>
+              </w:rPr>
+              <w:t>4</w:t>
+            </w:r>
+          </w:p>
+        </w:tc>
+        <w:tc>
+          <w:tcPr>
+            <w:tcW w:w="960" w:type="dxa"/>
+            <w:tcBorders>
+              <w:top w:val="nil"/>
+              <w:left w:val="nil"/>
+              <w:bottom w:val="nil"/>
+              <w:right w:val="nil"/>
+            </w:tcBorders>
+            <w:shd w:val="clear" w:color="auto" w:fill="auto"/>
+            <w:noWrap/>
+            <w:vAlign w:val="bottom"/>
+            <w:hideMark/>
+          </w:tcPr>
+          <w:p>
+            <w:pPr>
+              <w:spacing w:after="0" w:line="240" w:lineRule="auto"/>
+              <w:jc w:val="left"/>
+              <w:rPr>
+                <w:rFonts w:ascii="Aptos Narrow" w:eastAsia="Times New Roman" w:hAnsi="Aptos Narrow" w:cs="Times New Roman"/>
+                <w:color w:val="000000"/>
+                <w:lang w:val="sl-SI" w:eastAsia="sl-SI"/>
+              </w:rPr>
+            </w:pPr>
+            <w:r>
+              <w:rPr>
+                <w:rFonts w:ascii="Aptos Narrow" w:eastAsia="Times New Roman" w:hAnsi="Aptos Narrow" w:cs="Times New Roman"/>
+                <w:color w:val="000000"/>
+                <w:lang w:val="sl-SI" w:eastAsia="sl-SI"/>
+              </w:rPr>
+              <w:t>2</w:t>
+            </w:r>
+          </w:p>
+        </w:tc>
+        <w:tc>
+          <w:tcPr>
+            <w:tcW w:w="960" w:type="dxa"/>
+            <w:tcBorders>
+              <w:top w:val="nil"/>
+              <w:left w:val="nil"/>
+              <w:bottom w:val="nil"/>
+              <w:right w:val="nil"/>
+            </w:tcBorders>
+            <w:shd w:val="clear" w:color="auto" w:fill="auto"/>
+            <w:noWrap/>
+            <w:vAlign w:val="bottom"/>
+            <w:hideMark/>
+          </w:tcPr>
+          <w:p>
+            <w:pPr>
+              <w:spacing w:after="0" w:line="240" w:lineRule="auto"/>
+              <w:jc w:val="left"/>
+              <w:rPr>
+                <w:rFonts w:ascii="Aptos Narrow" w:eastAsia="Times New Roman" w:hAnsi="Aptos Narrow" w:cs="Times New Roman"/>
+                <w:color w:val="000000"/>
+                <w:lang w:val="sl-SI" w:eastAsia="sl-SI"/>
+              </w:rPr>
+            </w:pPr>
+            <w:r>
+              <w:rPr>
+                <w:rFonts w:ascii="Aptos Narrow" w:eastAsia="Times New Roman" w:hAnsi="Aptos Narrow" w:cs="Times New Roman"/>
+                <w:color w:val="000000"/>
+                <w:lang w:val="sl-SI" w:eastAsia="sl-SI"/>
+              </w:rPr>
+              <w:t>5</w:t>
+            </w:r>
+          </w:p>
+        </w:tc>
+      </w:tr>
+      <w:tr>
+        <w:trPr>
+          <w:trHeight w:val="300"/>
+        </w:trPr>
+        <w:tc>
+          <w:tcPr>
+            <w:tcW w:w="3940" w:type="dxa"/>
+            <w:tcBorders>
+              <w:top w:val="nil"/>
+              <w:left w:val="nil"/>
+              <w:bottom w:val="nil"/>
+              <w:right w:val="nil"/>
+            </w:tcBorders>
+            <w:shd w:val="clear" w:color="auto" w:fill="auto"/>
+            <w:noWrap/>
+            <w:vAlign w:val="bottom"/>
+            <w:hideMark/>
+          </w:tcPr>
+          <w:p>
+            <w:pPr>
+              <w:spacing w:after="0" w:line="240" w:lineRule="auto"/>
+              <w:jc w:val="left"/>
+              <w:rPr>
+                <w:rFonts w:ascii="Aptos Narrow" w:eastAsia="Times New Roman" w:hAnsi="Aptos Narrow" w:cs="Times New Roman"/>
+                <w:i/>
+                <w:iCs/>
+                <w:color w:val="000000"/>
+                <w:lang w:val="sl-SI" w:eastAsia="sl-SI"/>
+              </w:rPr>
+            </w:pPr>
+            <w:proofErr w:type="spellStart"/>
+            <w:r>
+              <w:rPr>
+                <w:rFonts w:ascii="Aptos Narrow" w:eastAsia="Times New Roman" w:hAnsi="Aptos Narrow" w:cs="Times New Roman"/>
+                <w:i/>
+                <w:iCs/>
+                <w:color w:val="000000"/>
+                <w:lang w:val="sl-SI" w:eastAsia="sl-SI"/>
+              </w:rPr>
+              <w:t>Clostridium</w:t>
+            </w:r>
+            <w:proofErr w:type="spellEnd"/>
+            <w:r>
+              <w:rPr>
+                <w:rFonts w:ascii="Aptos Narrow" w:eastAsia="Times New Roman" w:hAnsi="Aptos Narrow" w:cs="Times New Roman"/>
+                <w:i/>
+                <w:iCs/>
+                <w:color w:val="000000"/>
+                <w:lang w:val="sl-SI" w:eastAsia="sl-SI"/>
+              </w:rPr>
+              <w:t xml:space="preserve"> saudiense</w:t>
+            </w:r>
+          </w:p>
+        </w:tc>
+        <w:tc>
+          <w:tcPr>
+            <w:tcW w:w="1240" w:type="dxa"/>
+            <w:tcBorders>
+              <w:top w:val="nil"/>
+              <w:left w:val="nil"/>
+              <w:bottom w:val="nil"/>
+              <w:right w:val="nil"/>
+            </w:tcBorders>
+            <w:shd w:val="clear" w:color="auto" w:fill="auto"/>
+            <w:noWrap/>
+            <w:vAlign w:val="bottom"/>
+            <w:hideMark/>
+          </w:tcPr>
+          <w:p>
+            <w:pPr>
+              <w:spacing w:after="0" w:line="240" w:lineRule="auto"/>
+              <w:jc w:val="left"/>
+              <w:rPr>
+                <w:rFonts w:ascii="Aptos Narrow" w:eastAsia="Times New Roman" w:hAnsi="Aptos Narrow" w:cs="Times New Roman"/>
+                <w:color w:val="000000"/>
+                <w:lang w:val="sl-SI" w:eastAsia="sl-SI"/>
+              </w:rPr>
+            </w:pPr>
+            <w:r>
+              <w:rPr>
+                <w:rFonts w:ascii="Aptos Narrow" w:eastAsia="Times New Roman" w:hAnsi="Aptos Narrow" w:cs="Times New Roman"/>
+                <w:color w:val="000000"/>
+                <w:lang w:val="sl-SI" w:eastAsia="sl-SI"/>
+              </w:rPr>
+              <w:t>87</w:t>
+            </w:r>
+          </w:p>
+        </w:tc>
+        <w:tc>
+          <w:tcPr>
+            <w:tcW w:w="960" w:type="dxa"/>
+            <w:tcBorders>
+              <w:top w:val="nil"/>
+              <w:left w:val="nil"/>
+              <w:bottom w:val="nil"/>
+              <w:right w:val="nil"/>
+            </w:tcBorders>
+            <w:shd w:val="clear" w:color="auto" w:fill="auto"/>
+            <w:noWrap/>
+            <w:vAlign w:val="bottom"/>
+            <w:hideMark/>
+          </w:tcPr>
+          <w:p>
+            <w:pPr>
+              <w:spacing w:after="0" w:line="240" w:lineRule="auto"/>
+              <w:jc w:val="left"/>
+              <w:rPr>
+                <w:rFonts w:ascii="Aptos Narrow" w:eastAsia="Times New Roman" w:hAnsi="Aptos Narrow" w:cs="Times New Roman"/>
+                <w:color w:val="000000"/>
+                <w:lang w:val="sl-SI" w:eastAsia="sl-SI"/>
+              </w:rPr>
+            </w:pPr>
+            <w:r>
+              <w:rPr>
+                <w:rFonts w:ascii="Aptos Narrow" w:eastAsia="Times New Roman" w:hAnsi="Aptos Narrow" w:cs="Times New Roman"/>
+                <w:color w:val="000000"/>
+                <w:lang w:val="sl-SI" w:eastAsia="sl-SI"/>
+              </w:rPr>
+              <w:t>19</w:t>
+            </w:r>
+          </w:p>
+        </w:tc>
+        <w:tc>
+          <w:tcPr>
+            <w:tcW w:w="960" w:type="dxa"/>
+            <w:tcBorders>
+              <w:top w:val="nil"/>
+              <w:left w:val="nil"/>
+              <w:bottom w:val="nil"/>
+              <w:right w:val="nil"/>
+            </w:tcBorders>
+            <w:shd w:val="clear" w:color="auto" w:fill="auto"/>
+            <w:noWrap/>
+            <w:vAlign w:val="bottom"/>
+            <w:hideMark/>
+          </w:tcPr>
+          <w:p>
+            <w:pPr>
+              <w:spacing w:after="0" w:line="240" w:lineRule="auto"/>
+              <w:jc w:val="left"/>
+              <w:rPr>
+                <w:rFonts w:ascii="Aptos Narrow" w:eastAsia="Times New Roman" w:hAnsi="Aptos Narrow" w:cs="Times New Roman"/>
+                <w:color w:val="000000"/>
+                <w:lang w:val="sl-SI" w:eastAsia="sl-SI"/>
+              </w:rPr>
+            </w:pPr>
+            <w:r>
+              <w:rPr>
+                <w:rFonts w:ascii="Aptos Narrow" w:eastAsia="Times New Roman" w:hAnsi="Aptos Narrow" w:cs="Times New Roman"/>
+                <w:color w:val="000000"/>
+                <w:lang w:val="sl-SI" w:eastAsia="sl-SI"/>
+              </w:rPr>
+              <w:t>42</w:t>
+            </w:r>
+          </w:p>
+        </w:tc>
+        <w:tc>
+          <w:tcPr>
+            <w:tcW w:w="960" w:type="dxa"/>
+            <w:tcBorders>
+              <w:top w:val="nil"/>
+              <w:left w:val="nil"/>
+              <w:bottom w:val="nil"/>
+              <w:right w:val="nil"/>
+            </w:tcBorders>
+            <w:shd w:val="clear" w:color="auto" w:fill="auto"/>
+            <w:noWrap/>
+            <w:vAlign w:val="bottom"/>
+            <w:hideMark/>
+          </w:tcPr>
+          <w:p>
+            <w:pPr>
+              <w:spacing w:after="0" w:line="240" w:lineRule="auto"/>
+              <w:jc w:val="left"/>
+              <w:rPr>
+                <w:rFonts w:ascii="Aptos Narrow" w:eastAsia="Times New Roman" w:hAnsi="Aptos Narrow" w:cs="Times New Roman"/>
+                <w:color w:val="000000"/>
+                <w:lang w:val="sl-SI" w:eastAsia="sl-SI"/>
+              </w:rPr>
+            </w:pPr>
+            <w:r>
+              <w:rPr>
+                <w:rFonts w:ascii="Aptos Narrow" w:eastAsia="Times New Roman" w:hAnsi="Aptos Narrow" w:cs="Times New Roman"/>
+                <w:color w:val="000000"/>
+                <w:lang w:val="sl-SI" w:eastAsia="sl-SI"/>
+              </w:rPr>
+              <w:t>26</w:t>
+            </w:r>
+          </w:p>
+        </w:tc>
+      </w:tr>
+      <w:tr>
+        <w:trPr>
+          <w:trHeight w:val="300"/>
+        </w:trPr>
+        <w:tc>
+          <w:tcPr>
+            <w:tcW w:w="3940" w:type="dxa"/>
+            <w:tcBorders>
+              <w:top w:val="nil"/>
+              <w:left w:val="nil"/>
+              <w:bottom w:val="nil"/>
+              <w:right w:val="nil"/>
+            </w:tcBorders>
+            <w:shd w:val="clear" w:color="auto" w:fill="auto"/>
+            <w:noWrap/>
+            <w:vAlign w:val="bottom"/>
+            <w:hideMark/>
+          </w:tcPr>
+          <w:p>
+            <w:pPr>
+              <w:spacing w:after="0" w:line="240" w:lineRule="auto"/>
+              <w:jc w:val="left"/>
+              <w:rPr>
+                <w:rFonts w:ascii="Aptos Narrow" w:eastAsia="Times New Roman" w:hAnsi="Aptos Narrow" w:cs="Times New Roman"/>
+                <w:color w:val="000000"/>
+                <w:lang w:val="sl-SI" w:eastAsia="sl-SI"/>
+              </w:rPr>
+            </w:pPr>
+            <w:r>
+              <w:rPr>
+                <w:rFonts w:ascii="Aptos Narrow" w:eastAsia="Times New Roman" w:hAnsi="Aptos Narrow" w:cs="Times New Roman"/>
+                <w:color w:val="000000"/>
+                <w:lang w:val="sl-SI" w:eastAsia="sl-SI"/>
+              </w:rPr>
+              <w:t xml:space="preserve">No </w:t>
+            </w:r>
+            <w:proofErr w:type="spellStart"/>
+            <w:r>
+              <w:rPr>
+                <w:rFonts w:ascii="Aptos Narrow" w:eastAsia="Times New Roman" w:hAnsi="Aptos Narrow" w:cs="Times New Roman"/>
+                <w:color w:val="000000"/>
+                <w:lang w:val="sl-SI" w:eastAsia="sl-SI"/>
+              </w:rPr>
+              <w:t>organism</w:t>
+            </w:r>
+            <w:proofErr w:type="spellEnd"/>
+            <w:r>
+              <w:rPr>
+                <w:rFonts w:ascii="Aptos Narrow" w:eastAsia="Times New Roman" w:hAnsi="Aptos Narrow" w:cs="Times New Roman"/>
+                <w:color w:val="000000"/>
+                <w:lang w:val="sl-SI" w:eastAsia="sl-SI"/>
+              </w:rPr>
+              <w:t xml:space="preserve"> </w:t>
+            </w:r>
+            <w:proofErr w:type="spellStart"/>
+            <w:r>
+              <w:rPr>
+                <w:rFonts w:ascii="Aptos Narrow" w:eastAsia="Times New Roman" w:hAnsi="Aptos Narrow" w:cs="Times New Roman"/>
+                <w:color w:val="000000"/>
+                <w:lang w:val="sl-SI" w:eastAsia="sl-SI"/>
+              </w:rPr>
+              <w:t>identification</w:t>
+            </w:r>
+            <w:proofErr w:type="spellEnd"/>
+            <w:r>
+              <w:rPr>
+                <w:rFonts w:ascii="Aptos Narrow" w:eastAsia="Times New Roman" w:hAnsi="Aptos Narrow" w:cs="Times New Roman"/>
+                <w:color w:val="000000"/>
+                <w:lang w:val="sl-SI" w:eastAsia="sl-SI"/>
+              </w:rPr>
+              <w:t xml:space="preserve"> </w:t>
+            </w:r>
+            <w:proofErr w:type="spellStart"/>
+            <w:r>
+              <w:rPr>
+                <w:rFonts w:ascii="Aptos Narrow" w:eastAsia="Times New Roman" w:hAnsi="Aptos Narrow" w:cs="Times New Roman"/>
+                <w:color w:val="000000"/>
+                <w:lang w:val="sl-SI" w:eastAsia="sl-SI"/>
+              </w:rPr>
+              <w:t>possible</w:t>
+            </w:r>
+            <w:proofErr w:type="spellEnd"/>
+          </w:p>
+        </w:tc>
+        <w:tc>
+          <w:tcPr>
+            <w:tcW w:w="1240" w:type="dxa"/>
+            <w:tcBorders>
+              <w:top w:val="nil"/>
+              <w:left w:val="nil"/>
+              <w:bottom w:val="nil"/>
+              <w:right w:val="nil"/>
+            </w:tcBorders>
+            <w:shd w:val="clear" w:color="auto" w:fill="auto"/>
+            <w:noWrap/>
+            <w:vAlign w:val="bottom"/>
+            <w:hideMark/>
+          </w:tcPr>
+          <w:p>
+            <w:pPr>
+              <w:spacing w:after="0" w:line="240" w:lineRule="auto"/>
+              <w:jc w:val="left"/>
+              <w:rPr>
+                <w:rFonts w:ascii="Aptos Narrow" w:eastAsia="Times New Roman" w:hAnsi="Aptos Narrow" w:cs="Times New Roman"/>
+                <w:color w:val="000000"/>
+                <w:lang w:val="sl-SI" w:eastAsia="sl-SI"/>
+              </w:rPr>
+            </w:pPr>
+            <w:r>
+              <w:rPr>
+                <w:rFonts w:ascii="Aptos Narrow" w:eastAsia="Times New Roman" w:hAnsi="Aptos Narrow" w:cs="Times New Roman"/>
+                <w:color w:val="000000"/>
+                <w:lang w:val="sl-SI" w:eastAsia="sl-SI"/>
+              </w:rPr>
+              <w:t>20</w:t>
+            </w:r>
+          </w:p>
+        </w:tc>
+        <w:tc>
+          <w:tcPr>
+            <w:tcW w:w="960" w:type="dxa"/>
+            <w:tcBorders>
+              <w:top w:val="nil"/>
+              <w:left w:val="nil"/>
+              <w:bottom w:val="nil"/>
+              <w:right w:val="nil"/>
+            </w:tcBorders>
+            <w:shd w:val="clear" w:color="auto" w:fill="auto"/>
+            <w:noWrap/>
+            <w:vAlign w:val="bottom"/>
+            <w:hideMark/>
+          </w:tcPr>
+          <w:p>
+            <w:pPr>
+              <w:spacing w:after="0" w:line="240" w:lineRule="auto"/>
+              <w:jc w:val="left"/>
+              <w:rPr>
+                <w:rFonts w:ascii="Aptos Narrow" w:eastAsia="Times New Roman" w:hAnsi="Aptos Narrow" w:cs="Times New Roman"/>
+                <w:color w:val="000000"/>
+                <w:lang w:val="sl-SI" w:eastAsia="sl-SI"/>
+              </w:rPr>
+            </w:pPr>
+            <w:r>
+              <w:rPr>
+                <w:rFonts w:ascii="Aptos Narrow" w:eastAsia="Times New Roman" w:hAnsi="Aptos Narrow" w:cs="Times New Roman"/>
+                <w:color w:val="000000"/>
+                <w:lang w:val="sl-SI" w:eastAsia="sl-SI"/>
+              </w:rPr>
+              <w:t>7</w:t>
+            </w:r>
+          </w:p>
+        </w:tc>
+        <w:tc>
+          <w:tcPr>
+            <w:tcW w:w="960" w:type="dxa"/>
+            <w:tcBorders>
+              <w:top w:val="nil"/>
+              <w:left w:val="nil"/>
+              <w:bottom w:val="nil"/>
+              <w:right w:val="nil"/>
+            </w:tcBorders>
+            <w:shd w:val="clear" w:color="auto" w:fill="auto"/>
+            <w:noWrap/>
+            <w:vAlign w:val="bottom"/>
+            <w:hideMark/>
+          </w:tcPr>
+          <w:p>
+            <w:pPr>
+              <w:spacing w:after="0" w:line="240" w:lineRule="auto"/>
+              <w:jc w:val="left"/>
+              <w:rPr>
+                <w:rFonts w:ascii="Aptos Narrow" w:eastAsia="Times New Roman" w:hAnsi="Aptos Narrow" w:cs="Times New Roman"/>
+                <w:color w:val="000000"/>
+                <w:lang w:val="sl-SI" w:eastAsia="sl-SI"/>
+              </w:rPr>
+            </w:pPr>
+            <w:r>
+              <w:rPr>
+                <w:rFonts w:ascii="Aptos Narrow" w:eastAsia="Times New Roman" w:hAnsi="Aptos Narrow" w:cs="Times New Roman"/>
+                <w:color w:val="000000"/>
+                <w:lang w:val="sl-SI" w:eastAsia="sl-SI"/>
+              </w:rPr>
+              <w:t>7</w:t>
+            </w:r>
+          </w:p>
+        </w:tc>
+        <w:tc>
+          <w:tcPr>
+            <w:tcW w:w="960" w:type="dxa"/>
+            <w:tcBorders>
+              <w:top w:val="nil"/>
+              <w:left w:val="nil"/>
+              <w:bottom w:val="nil"/>
+              <w:right w:val="nil"/>
+            </w:tcBorders>
+            <w:shd w:val="clear" w:color="auto" w:fill="auto"/>
+            <w:noWrap/>
+            <w:vAlign w:val="bottom"/>
+            <w:hideMark/>
+          </w:tcPr>
+          <w:p>
+            <w:pPr>
+              <w:spacing w:after="0" w:line="240" w:lineRule="auto"/>
+              <w:jc w:val="left"/>
+              <w:rPr>
+                <w:rFonts w:ascii="Aptos Narrow" w:eastAsia="Times New Roman" w:hAnsi="Aptos Narrow" w:cs="Times New Roman"/>
+                <w:color w:val="000000"/>
+                <w:lang w:val="sl-SI" w:eastAsia="sl-SI"/>
+              </w:rPr>
+            </w:pPr>
+            <w:r>
+              <w:rPr>
+                <w:rFonts w:ascii="Aptos Narrow" w:eastAsia="Times New Roman" w:hAnsi="Aptos Narrow" w:cs="Times New Roman"/>
+                <w:color w:val="000000"/>
+                <w:lang w:val="sl-SI" w:eastAsia="sl-SI"/>
+              </w:rPr>
+              <w:t>6</w:t>
+            </w:r>
+          </w:p>
+        </w:tc>
+      </w:tr>
+      <w:tr>
+        <w:trPr>
+          <w:trHeight w:val="300"/>
+        </w:trPr>
+        <w:tc>
+          <w:tcPr>
+            <w:tcW w:w="3940" w:type="dxa"/>
+            <w:tcBorders>
+              <w:top w:val="nil"/>
+              <w:left w:val="nil"/>
+              <w:bottom w:val="single" w:sz="4" w:space="0" w:color="auto"/>
+              <w:right w:val="nil"/>
+            </w:tcBorders>
+            <w:shd w:val="clear" w:color="auto" w:fill="auto"/>
+            <w:noWrap/>
+            <w:vAlign w:val="bottom"/>
+            <w:hideMark/>
+          </w:tcPr>
+          <w:p>
+            <w:pPr>
+              <w:spacing w:after="0" w:line="240" w:lineRule="auto"/>
+              <w:jc w:val="left"/>
+              <w:rPr>
+                <w:rFonts w:ascii="Aptos Narrow" w:eastAsia="Times New Roman" w:hAnsi="Aptos Narrow" w:cs="Times New Roman"/>
+                <w:color w:val="000000"/>
+                <w:lang w:val="sl-SI" w:eastAsia="sl-SI"/>
+              </w:rPr>
+            </w:pPr>
+            <w:r>
+              <w:rPr>
+                <w:rFonts w:ascii="Aptos Narrow" w:eastAsia="Times New Roman" w:hAnsi="Aptos Narrow" w:cs="Times New Roman"/>
+                <w:color w:val="000000"/>
+                <w:lang w:val="sl-SI" w:eastAsia="sl-SI"/>
+              </w:rPr>
+              <w:t xml:space="preserve">No </w:t>
+            </w:r>
+            <w:proofErr w:type="spellStart"/>
+            <w:r>
+              <w:rPr>
+                <w:rFonts w:ascii="Aptos Narrow" w:eastAsia="Times New Roman" w:hAnsi="Aptos Narrow" w:cs="Times New Roman"/>
+                <w:color w:val="000000"/>
+                <w:lang w:val="sl-SI" w:eastAsia="sl-SI"/>
+              </w:rPr>
+              <w:t>growth</w:t>
+            </w:r>
+            <w:proofErr w:type="spellEnd"/>
+            <w:r>
+              <w:rPr>
+                <w:rFonts w:ascii="Aptos Narrow" w:eastAsia="Times New Roman" w:hAnsi="Aptos Narrow" w:cs="Times New Roman"/>
+                <w:color w:val="000000"/>
+                <w:lang w:val="sl-SI" w:eastAsia="sl-SI"/>
+              </w:rPr>
+              <w:t xml:space="preserve"> </w:t>
+            </w:r>
+            <w:proofErr w:type="spellStart"/>
+            <w:r>
+              <w:rPr>
+                <w:rFonts w:ascii="Aptos Narrow" w:eastAsia="Times New Roman" w:hAnsi="Aptos Narrow" w:cs="Times New Roman"/>
+                <w:color w:val="000000"/>
+                <w:lang w:val="sl-SI" w:eastAsia="sl-SI"/>
+              </w:rPr>
+              <w:t>after</w:t>
+            </w:r>
+            <w:proofErr w:type="spellEnd"/>
+            <w:r>
+              <w:rPr>
+                <w:rFonts w:ascii="Aptos Narrow" w:eastAsia="Times New Roman" w:hAnsi="Aptos Narrow" w:cs="Times New Roman"/>
+                <w:color w:val="000000"/>
+                <w:lang w:val="sl-SI" w:eastAsia="sl-SI"/>
+              </w:rPr>
+              <w:t xml:space="preserve"> </w:t>
+            </w:r>
+            <w:proofErr w:type="spellStart"/>
+            <w:r>
+              <w:rPr>
+                <w:rFonts w:ascii="Aptos Narrow" w:eastAsia="Times New Roman" w:hAnsi="Aptos Narrow" w:cs="Times New Roman"/>
+                <w:color w:val="000000"/>
+                <w:lang w:val="sl-SI" w:eastAsia="sl-SI"/>
+              </w:rPr>
+              <w:t>picking</w:t>
+            </w:r>
+            <w:proofErr w:type="spellEnd"/>
+          </w:p>
+        </w:tc>
+        <w:tc>
+          <w:tcPr>
+            <w:tcW w:w="1240" w:type="dxa"/>
+            <w:tcBorders>
+              <w:top w:val="nil"/>
+              <w:left w:val="nil"/>
+              <w:bottom w:val="single" w:sz="4" w:space="0" w:color="auto"/>
+              <w:right w:val="nil"/>
+            </w:tcBorders>
+            <w:shd w:val="clear" w:color="auto" w:fill="auto"/>
+            <w:noWrap/>
+            <w:vAlign w:val="bottom"/>
+            <w:hideMark/>
+          </w:tcPr>
+          <w:p>
+            <w:pPr>
+              <w:spacing w:after="0" w:line="240" w:lineRule="auto"/>
+              <w:jc w:val="left"/>
+              <w:rPr>
+                <w:rFonts w:ascii="Aptos Narrow" w:eastAsia="Times New Roman" w:hAnsi="Aptos Narrow" w:cs="Times New Roman"/>
+                <w:color w:val="000000"/>
+                <w:lang w:val="sl-SI" w:eastAsia="sl-SI"/>
+              </w:rPr>
+            </w:pPr>
+            <w:r>
+              <w:rPr>
+                <w:rFonts w:ascii="Aptos Narrow" w:eastAsia="Times New Roman" w:hAnsi="Aptos Narrow" w:cs="Times New Roman"/>
+                <w:color w:val="000000"/>
+                <w:lang w:val="sl-SI" w:eastAsia="sl-SI"/>
+              </w:rPr>
+              <w:t>0</w:t>
+            </w:r>
+          </w:p>
+        </w:tc>
+        <w:tc>
+          <w:tcPr>
+            <w:tcW w:w="960" w:type="dxa"/>
+            <w:tcBorders>
+              <w:top w:val="nil"/>
+              <w:left w:val="nil"/>
+              <w:bottom w:val="single" w:sz="4" w:space="0" w:color="auto"/>
+              <w:right w:val="nil"/>
+            </w:tcBorders>
+            <w:shd w:val="clear" w:color="auto" w:fill="auto"/>
+            <w:noWrap/>
+            <w:vAlign w:val="bottom"/>
+            <w:hideMark/>
+          </w:tcPr>
+          <w:p>
+            <w:pPr>
+              <w:spacing w:after="0" w:line="240" w:lineRule="auto"/>
+              <w:jc w:val="left"/>
+              <w:rPr>
+                <w:rFonts w:ascii="Aptos Narrow" w:eastAsia="Times New Roman" w:hAnsi="Aptos Narrow" w:cs="Times New Roman"/>
+                <w:color w:val="000000"/>
+                <w:lang w:val="sl-SI" w:eastAsia="sl-SI"/>
+              </w:rPr>
+            </w:pPr>
+            <w:r>
+              <w:rPr>
+                <w:rFonts w:ascii="Aptos Narrow" w:eastAsia="Times New Roman" w:hAnsi="Aptos Narrow" w:cs="Times New Roman"/>
+                <w:color w:val="000000"/>
+                <w:lang w:val="sl-SI" w:eastAsia="sl-SI"/>
+              </w:rPr>
+              <w:t>4</w:t>
+            </w:r>
+          </w:p>
+        </w:tc>
+        <w:tc>
+          <w:tcPr>
+            <w:tcW w:w="960" w:type="dxa"/>
+            <w:tcBorders>
+              <w:top w:val="nil"/>
+              <w:left w:val="nil"/>
+              <w:bottom w:val="single" w:sz="4" w:space="0" w:color="auto"/>
+              <w:right w:val="nil"/>
+            </w:tcBorders>
+            <w:shd w:val="clear" w:color="auto" w:fill="auto"/>
+            <w:noWrap/>
+            <w:vAlign w:val="bottom"/>
+            <w:hideMark/>
+          </w:tcPr>
+          <w:p>
+            <w:pPr>
+              <w:spacing w:after="0" w:line="240" w:lineRule="auto"/>
+              <w:jc w:val="left"/>
+              <w:rPr>
+                <w:rFonts w:ascii="Aptos Narrow" w:eastAsia="Times New Roman" w:hAnsi="Aptos Narrow" w:cs="Times New Roman"/>
+                <w:color w:val="000000"/>
+                <w:lang w:val="sl-SI" w:eastAsia="sl-SI"/>
+              </w:rPr>
+            </w:pPr>
+            <w:r>
+              <w:rPr>
+                <w:rFonts w:ascii="Aptos Narrow" w:eastAsia="Times New Roman" w:hAnsi="Aptos Narrow" w:cs="Times New Roman"/>
+                <w:color w:val="000000"/>
+                <w:lang w:val="sl-SI" w:eastAsia="sl-SI"/>
+              </w:rPr>
+              <w:t>19</w:t>
+            </w:r>
+          </w:p>
+        </w:tc>
+        <w:tc>
+          <w:tcPr>
+            <w:tcW w:w="960" w:type="dxa"/>
+            <w:tcBorders>
+              <w:top w:val="nil"/>
+              <w:left w:val="nil"/>
+              <w:bottom w:val="single" w:sz="4" w:space="0" w:color="auto"/>
+              <w:right w:val="nil"/>
+            </w:tcBorders>
+            <w:shd w:val="clear" w:color="auto" w:fill="auto"/>
+            <w:noWrap/>
+            <w:vAlign w:val="bottom"/>
+            <w:hideMark/>
+          </w:tcPr>
+          <w:p>
+            <w:pPr>
+              <w:spacing w:after="0" w:line="240" w:lineRule="auto"/>
+              <w:jc w:val="left"/>
+              <w:rPr>
+                <w:rFonts w:ascii="Aptos Narrow" w:eastAsia="Times New Roman" w:hAnsi="Aptos Narrow" w:cs="Times New Roman"/>
+                <w:color w:val="000000"/>
+                <w:lang w:val="sl-SI" w:eastAsia="sl-SI"/>
+              </w:rPr>
+            </w:pPr>
+            <w:r>
+              <w:rPr>
+                <w:rFonts w:ascii="Aptos Narrow" w:eastAsia="Times New Roman" w:hAnsi="Aptos Narrow" w:cs="Times New Roman"/>
+                <w:color w:val="000000"/>
+                <w:lang w:val="sl-SI" w:eastAsia="sl-SI"/>
+              </w:rPr>
+              <w:t>25</w:t>
+            </w:r>
+          </w:p>
+        </w:tc>
+      </w:tr>
+    </w:tbl>
+    <w:p>
+      <w:pPr>
+        <w:rPr>
+          <w:lang w:val="en-GB"/>
+        </w:rPr>
+      </w:pPr>
     </w:p>
     <w:p>
       <w:pPr>
         <w:rPr>
-          <w:b/>
-          <w:bCs/>
           <w:lang w:val="en-GB"/>
         </w:rPr>
       </w:pPr>
@@ -18568,7 +16817,6 @@
           <w:noProof/>
           <w:lang w:val="en-GB"/>
         </w:rPr>
-        <w:lastRenderedPageBreak/>
         <w:drawing>
           <wp:inline distT="0" distB="0" distL="0" distR="0" wp14:anchorId="4FC975CE" wp14:editId="7EB93CF8">
             <wp:extent cx="5753735" cy="4330700"/>
@@ -18653,6 +16901,7 @@
           <w:noProof/>
           <w:lang w:val="en-GB"/>
         </w:rPr>
+        <w:lastRenderedPageBreak/>
         <w:drawing>
           <wp:inline distT="0" distB="0" distL="0" distR="0" wp14:anchorId="2364EDD5" wp14:editId="6F7DE97F">
             <wp:extent cx="5943600" cy="2657475"/>
@@ -18715,7 +16964,6 @@
         <w:rPr>
           <w:lang w:val="en-GB"/>
         </w:rPr>
-        <w:lastRenderedPageBreak/>
         <w:t xml:space="preserve">Supplement Figure 2: </w:t>
       </w:r>
       <w:r>
@@ -21960,6 +20208,7 @@
                 <w:szCs w:val="20"/>
                 <w:lang w:val="en-GB" w:eastAsia="sl-SI"/>
               </w:rPr>
+              <w:lastRenderedPageBreak/>
               <w:t> </w:t>
             </w:r>
           </w:p>
@@ -22157,15 +20406,7 @@
           <w:rFonts w:cs="Times New Roman"/>
           <w:lang w:val="en-GB"/>
         </w:rPr>
-        <w:t xml:space="preserve"> rRNA gene in each sample by performing digital droplet PCR with the same primers that were used for amplification of fragments later sequenced. Comparison of the relative abundance in the bulk microbiota sample and ethanol resistant sample of ethanol resistant OTUs revealed that these two quantities are, despite different isolation protocols positively correlated in ethanol resistant OTUs (Supplement Figure 3). The same holds true for normalized abundances (Supplement Figure 4). We could </w:t>
-      </w:r>
-      <w:r>
-        <w:rPr>
-          <w:rFonts w:cs="Times New Roman"/>
-          <w:lang w:val="en-GB"/>
-        </w:rPr>
-        <w:lastRenderedPageBreak/>
-        <w:t xml:space="preserve">thus compare the proportion of active cells that are also creating endospores. The ratio gives us the information on the sporulation frequency of each OTU determined as endospore forming. </w:t>
+        <w:t xml:space="preserve"> rRNA gene in each sample by performing digital droplet PCR with the same primers that were used for amplification of fragments later sequenced. Comparison of the relative abundance in the bulk microbiota sample and ethanol resistant sample of ethanol resistant OTUs revealed that these two quantities are, despite different isolation protocols positively correlated in ethanol resistant OTUs (Supplement Figure 3). The same holds true for normalized abundances (Supplement Figure 4). We could thus compare the proportion of active cells that are also creating endospores. The ratio gives us the information on the sporulation frequency of each OTU determined as endospore forming. </w:t>
       </w:r>
     </w:p>
     <w:p>

</xml_diff>